<commit_message>
Expand Results and Discussion with data-rich publication figures
</commit_message>
<xml_diff>
--- a/submission/candidate_20260911_review/MANUSCRIPT_Submission.docx
+++ b/submission/candidate_20260911_review/MANUSCRIPT_Submission.docx
@@ -21,7 +21,7 @@
         <w:t xml:space="preserve">TSHR and IGF1R genetics in Graves disease</w:t>
       </w:r>
     </w:p>
-    <w:bookmarkStart w:id="26" w:name="X170644179862b888655a49e077d6639ab7a50ca"/>
+    <w:bookmarkStart w:id="28" w:name="X170644179862b888655a49e077d6639ab7a50ca"/>
     <w:p>
       <w:pPr>
         <w:pStyle w:val="Title"/>
@@ -903,7 +903,7 @@
         <w:widowControl/>
       </w:pPr>
       <w:r>
-        <w:t xml:space="preserve">Of 2,544 genes with selected instruments, 2,234 had estimable MR results in BBJ; the corresponding numbers were 2,505 in UKB and 2,480 in FinnGen. Thirteen genes met the BBJ multiple-testing threshold (Table 3; Figure 1). These included</w:t>
+        <w:t xml:space="preserve">Of 2,544 genes with selected instruments, 2,234 had estimable MR results in BBJ; the corresponding numbers were 2,505 in UKB and 2,480 in FinnGen. Thirteen genes met the BBJ multiple-testing threshold: seven were associated with lower odds and six with higher odds of disease (Table 3; Figure 1). The 310 genes without estimable BBJ results were not classified as negative findings. The genomic distribution shows both the MHC cluster and signals outside that region; each plotted point represents a gene-level MR result, not a single-SNP GWAS association. The discovery genes included</w:t>
       </w:r>
       <w:r>
         <w:t xml:space="preserve"> </w:t>
@@ -929,7 +929,7 @@
         <w:t xml:space="preserve">CTLA4</w:t>
       </w:r>
       <w:r>
-        <w:t xml:space="preserve">, five genes in the major histocompatibility complex (MHC), and six additional candidates. The three biologically selected genes are compared in Table 2 and Figure 2.</w:t>
+        <w:t xml:space="preserve">, five genes in the major histocompatibility complex (MHC), and six additional candidates. The three biologically selected genes are compared in Table 2 and Figure 2, which aligns effect estimates with the corresponding shared-variant evidence.</w:t>
       </w:r>
     </w:p>
     <w:bookmarkEnd w:id="15"/>
@@ -1022,7 +1022,7 @@
         <w:widowControl/>
       </w:pPr>
       <w:r>
-        <w:t xml:space="preserve">Expression and disease showed strong shared-variant support in BBJ and FinnGen, with probabilities of 0.951 and 0.986, respectively. The leading variant was rs179252 in both. UKB did not show the same support (0.226), despite a strong MR association. There the posterior favoured distinct causal variants (PP.H3 = 0.774), so the expression and disease signals were more consistent with two linked variants than with one shared variant. Thus, a highly significant MR result alone did not establish a shared genetic signal in every outcome.</w:t>
+        <w:t xml:space="preserve">Expression and disease showed strong shared-variant support in BBJ and FinnGen, with probabilities of 0.951 and 0.986, respectively. The leading variant was rs179252 in both. UKB did not show the same support (0.226), despite a strong MR association. There the posterior favoured distinct causal variants (PP.H3 = 0.774), so the expression and disease signals were more consistent with two linked variants than with one shared variant. Thus, a highly significant MR result alone did not establish a shared genetic signal in every outcome. The contrast is visible in Figure 2: the MR estimates all favoured lower odds, whereas the UKB posterior favoured distinct expression and disease variants. This discordance was not resolved by substituting cohort allele frequencies.</w:t>
       </w:r>
     </w:p>
     <w:bookmarkEnd w:id="16"/>
@@ -1115,7 +1115,7 @@
         <w:widowControl/>
       </w:pPr>
       <w:r>
-        <w:t xml:space="preserve">Shared-variant support was below 0.80 in all three outcomes (BBJ 0.073, UKB 0.404 and FinnGen 0.032). The UKB posterior was divided between an expression-only signal (PP.H2 = 0.400) and a shared variant (PP.H4 = 0.404), with little support for distinct variants (PP.H3 = 0.196), and should be regarded as unresolved rather than negative. Alternative MR estimators agreed in direction but differed in statistical significance (Table S1). Taken together, these results provide weaker genetic support for</w:t>
+        <w:t xml:space="preserve">Shared-variant support was below 0.80 in all three outcomes (BBJ 0.073, UKB 0.404 and FinnGen 0.032). The UKB posterior was divided between an expression-only signal (PP.H2 = 0.400) and a shared variant (PP.H4 = 0.404), with little support for distinct variants (PP.H3 = 0.196), and should be regarded as unresolved rather than negative. Alternative MR estimators agreed in direction but differed in statistical significance (Table S1). Weighted-median estimates were nominally significant in BBJ and UKB, whereas weighted-mode estimates were not; neither provided nominal support in FinnGen. These methods used the same limited instrument sets and therefore do not constitute independent replication. Taken together, these results provide weaker genetic support for</w:t>
       </w:r>
       <w:r>
         <w:t xml:space="preserve"> </w:t>
@@ -1215,7 +1215,10 @@
         <w:t xml:space="preserve"> </w:t>
       </w:r>
       <w:r>
-        <w:t xml:space="preserve">= 5.45×10⁻¹⁵), UKB (</w:t>
+        <w:t xml:space="preserve">= 5.45×10⁻¹⁵), UKB (OR 0.21, 95% CI 0.08–0.57;</w:t>
+      </w:r>
+      <w:r>
+        <w:t xml:space="preserve"> </w:t>
       </w:r>
       <w:r>
         <w:rPr>
@@ -1228,7 +1231,10 @@
         <w:t xml:space="preserve"> </w:t>
       </w:r>
       <w:r>
-        <w:t xml:space="preserve">= 0.0022) and FinnGen (</w:t>
+        <w:t xml:space="preserve">= 0.0022) and FinnGen (OR 0.17, 95% CI 0.04–0.68;</w:t>
+      </w:r>
+      <w:r>
+        <w:t xml:space="preserve"> </w:t>
       </w:r>
       <w:r>
         <w:rPr>
@@ -1241,7 +1247,7 @@
         <w:t xml:space="preserve"> </w:t>
       </w:r>
       <w:r>
-        <w:t xml:space="preserve">= 0.0118). Shared-variant support was strong in UKB and FinnGen, but not BBJ (Table 2). The screen therefore recovered a known autoimmune association, while</w:t>
+        <w:t xml:space="preserve">= 0.0118). Shared-variant support was strong in UKB and FinnGen (0.953 and 0.978), but not BBJ (0.201), where the posterior favoured distinct variants (PP.H3 = 0.799; Figure 2). The screen therefore recovered a known autoimmune association, while</w:t>
       </w:r>
       <w:r>
         <w:t xml:space="preserve"> </w:t>
@@ -1298,7 +1304,7 @@
         <w:t xml:space="preserve"> </w:t>
       </w:r>
       <w:r>
-        <w:t xml:space="preserve">had strong support in BBJ only.</w:t>
+        <w:t xml:space="preserve">had strong support in BBJ only (0.994 and 0.989); the corresponding FinnGen probabilities were 0.017 and 0.020 (Figure 3A).</w:t>
       </w:r>
       <w:r>
         <w:t xml:space="preserve"> </w:t>
@@ -1327,7 +1333,23 @@
         <w:t xml:space="preserve"> </w:t>
       </w:r>
       <w:r>
-        <w:t xml:space="preserve">= 0.0056); the absence of colocalization in that outcome was not an absence of association. The three neighbouring chromosome 16p11.2 hits were consistent with one regional signal rather than three independent findings. All 13 discovery estimates and their classification are shown in Table 3; full comparisons are in Supplementary Data 2–3.</w:t>
+        <w:t xml:space="preserve">= 0.0056); the absence of colocalization in that outcome was not an absence of association. The three neighbouring chromosome 16p11.2 hits were consistent with one regional signal rather than three independent findings. Their BBJ shared-variant probabilities were below 0.80, and none gained strong support in UKB or FinnGen.</w:t>
+      </w:r>
+      <w:r>
+        <w:t xml:space="preserve"> </w:t>
+      </w:r>
+      <w:r>
+        <w:rPr>
+          <w:i/>
+          <w:iCs/>
+        </w:rPr>
+        <w:t xml:space="preserve">MAPKAPK5</w:t>
+      </w:r>
+      <w:r>
+        <w:t xml:space="preserve"> </w:t>
+      </w:r>
+      <w:r>
+        <w:t xml:space="preserve">also failed the shared-variant criterion despite passing the MR discovery threshold. Thus, the absence of an additional qualifying candidate resulted from examining the combined evidence, rather than from an absence of significant MR associations. All 13 discovery estimates and their classification are shown in Table 3; full comparisons are in Supplementary Data 2–3.</w:t>
       </w:r>
     </w:p>
     <w:bookmarkEnd w:id="18"/>
@@ -1405,7 +1427,23 @@
         <w:t xml:space="preserve"> </w:t>
       </w:r>
       <w:r>
-        <w:t xml:space="preserve">support in BBJ fell from 0.951 to 0.661, while FinnGen remained above threshold (Table S2).</w:t>
+        <w:t xml:space="preserve">support in BBJ fell from 0.951 to 0.661, while FinnGen remained above threshold (Figure 3B; Table S2). This distinguished stability to the frequency substitution from sensitivity to the assumed prior: the former preserved classifications, while the latter changed the interpretation of the BBJ</w:t>
+      </w:r>
+      <w:r>
+        <w:t xml:space="preserve"> </w:t>
+      </w:r>
+      <w:r>
+        <w:rPr>
+          <w:i/>
+          <w:iCs/>
+        </w:rPr>
+        <w:t xml:space="preserve">TSHR</w:t>
+      </w:r>
+      <w:r>
+        <w:t xml:space="preserve"> </w:t>
+      </w:r>
+      <w:r>
+        <w:t xml:space="preserve">signal.</w:t>
       </w:r>
     </w:p>
     <w:p>
@@ -1414,55 +1452,7 @@
         <w:widowControl/>
       </w:pPr>
       <w:r>
-        <w:t xml:space="preserve">The screen had limited ability to detect smaller associations. At 80% power, only 14.6% of estimable BBJ genes could detect an OR of 1.5 at the discovery threshold; this decreased to 12.5% with cohort frequencies. The corresponding proportions for an OR of 2.0 were 35.6% and 34.2% (Table S4). At 80% power, the approximate minimum detectable absolute log-ORs were 1.39 for</w:t>
-      </w:r>
-      <w:r>
-        <w:t xml:space="preserve"> </w:t>
-      </w:r>
-      <w:r>
-        <w:rPr>
-          <w:i/>
-          <w:iCs/>
-        </w:rPr>
-        <w:t xml:space="preserve">TSHR</w:t>
-      </w:r>
-      <w:r>
-        <w:t xml:space="preserve"> </w:t>
-      </w:r>
-      <w:r>
-        <w:t xml:space="preserve">and 0.99 for</w:t>
-      </w:r>
-      <w:r>
-        <w:t xml:space="preserve"> </w:t>
-      </w:r>
-      <w:r>
-        <w:rPr>
-          <w:i/>
-          <w:iCs/>
-        </w:rPr>
-        <w:t xml:space="preserve">IGF1R</w:t>
-      </w:r>
-      <w:r>
-        <w:t xml:space="preserve"> </w:t>
-      </w:r>
-      <w:r>
-        <w:t xml:space="preserve">in BBJ (α = 0.05/2,544), and 0.33 and 0.72 for</w:t>
-      </w:r>
-      <w:r>
-        <w:t xml:space="preserve"> </w:t>
-      </w:r>
-      <w:r>
-        <w:rPr>
-          <w:i/>
-          <w:iCs/>
-        </w:rPr>
-        <w:t xml:space="preserve">IGF1R</w:t>
-      </w:r>
-      <w:r>
-        <w:t xml:space="preserve"> </w:t>
-      </w:r>
-      <w:r>
-        <w:t xml:space="preserve">in UKB and FinnGen, respectively (α = 0.05). These standard-error-based benchmarks describe precision; comparing them with observed effects cannot distinguish an absent effect from limited power. The ORs, 95% CIs and</w:t>
+        <w:t xml:space="preserve">The screen had limited ability to detect smaller associations. At 80% power, only 14.6% of estimable BBJ genes could detect an OR of 1.5 at the discovery threshold; this decreased to 12.5% with cohort frequencies. The corresponding proportions for an OR of 2.0 were 35.6% and 34.2% (Table S4). Gene-specific detection benchmarks are provided in Supplementary Methods. They describe precision and cannot distinguish an absent effect from limited power; the ORs, 95% CIs and</w:t>
       </w:r>
       <w:r>
         <w:t xml:space="preserve"> </w:t>
@@ -1483,7 +1473,7 @@
     </w:p>
     <w:bookmarkEnd w:id="19"/>
     <w:bookmarkEnd w:id="20"/>
-    <w:bookmarkStart w:id="21" w:name="discussion"/>
+    <w:bookmarkStart w:id="23" w:name="discussion"/>
     <w:p>
       <w:pPr>
         <w:pStyle w:val="Heading2"/>
@@ -1547,7 +1537,7 @@
         <w:t xml:space="preserve"> </w:t>
       </w:r>
       <w:r>
-        <w:t xml:space="preserve">showed direction-consistent MR associations across all three datasets and shared expression–disease signals in BBJ GD and FinnGen Graves ophthalmopathy under the primary priors, although the BBJ result did not hold under the most conservative prior.</w:t>
+        <w:t xml:space="preserve">showed direction-consistent MR associations across all three datasets and shared expression–disease signals in BBJ GD and FinnGen Graves ophthalmopathy under the primary priors.</w:t>
       </w:r>
       <w:r>
         <w:t xml:space="preserve"> </w:t>
@@ -1563,7 +1553,7 @@
         <w:t xml:space="preserve"> </w:t>
       </w:r>
       <w:r>
-        <w:t xml:space="preserve">showed nominal associations in BBJ and UKB, but its shared-variant evidence remained unresolved. No additional candidate passed the combined BBJ and FinnGen criterion. Cohort-frequency sensitivity analyses preserved these findings while changing some effect sizes and detection thresholds.</w:t>
+        <w:t xml:space="preserve">showed nominal associations in BBJ and UKB, but the shared-variant evidence was unresolved. No additional candidate passed the combined BBJ and FinnGen criterion. The comparison is therefore informative about the pattern and strength of genetic evidence, rather than a ranking of expected drug efficacy. Figures 1–3 make the screening results, the association–colocalization differences and the prior dependence visible together.</w:t>
       </w:r>
     </w:p>
     <w:p>
@@ -1572,7 +1562,7 @@
         <w:widowControl/>
       </w:pPr>
       <w:r>
-        <w:t xml:space="preserve">For clinicians, the main implication concerns interpretation rather than treatment selection. The established efficacy of IGF-1R blockade in TED [3] does not require</w:t>
+        <w:t xml:space="preserve">For clinicians, the distinction between disease susceptibility and therapeutic response is central. Teprotumumab improved outcomes in a randomized trial of active TED [3], while experimental work supports functional interaction between TSHR and IGF-1R in orbital fibroblasts [5]. These observations concern receptor activity in established disease. Our analysis concerns inherited variation associated with blood gene expression and disease odds. Tissue-specific regulation documented by GTEx further cautions against treating blood expression as a complete representation of orbital biology [26]. A receptor can remain relevant to treatment even when this particular genetic analysis provides limited evidence for an expression-mediated susceptibility effect. The</w:t>
       </w:r>
       <w:r>
         <w:t xml:space="preserve"> </w:t>
@@ -1588,7 +1578,16 @@
         <w:t xml:space="preserve"> </w:t>
       </w:r>
       <w:r>
-        <w:t xml:space="preserve">to show the same inherited susceptibility pattern as</w:t>
+        <w:t xml:space="preserve">findings neither challenge the clinical evidence for IGF-1R blockade nor establish an exclusively downstream effector role.</w:t>
+      </w:r>
+    </w:p>
+    <w:p>
+      <w:pPr>
+        <w:pStyle w:val="BodyText"/>
+        <w:widowControl/>
+      </w:pPr>
+      <w:r>
+        <w:t xml:space="preserve">The</w:t>
       </w:r>
       <w:r>
         <w:t xml:space="preserve"> </w:t>
@@ -1601,7 +1600,64 @@
         <w:t xml:space="preserve">TSHR</w:t>
       </w:r>
       <w:r>
-        <w:t xml:space="preserve">. Blood gene-expression instruments may not capture receptor activity, protein abundance or regulation in orbital tissue [26]. The present findings neither challenge the treatment evidence for teprotumumab nor establish that</w:t>
+        <w:t xml:space="preserve"> </w:t>
+      </w:r>
+      <w:r>
+        <w:t xml:space="preserve">findings provide a useful susceptibility anchor, but they require equally careful translation. The established role of TSHR in GD makes an association at this locus biologically coherent [1, 2]. Nonetheless, an OR below one for genetically proxied expression does not imply that increasing TSHR expression or stimulating its receptor would prevent disease. Genetic evidence can inform target prioritization [27], but the measured exposure, relevant tissue, timing and direction of a pharmacologic intervention must still match the proposed mechanism. Here, reconstructed blood expression is neither receptor stimulation nor a drug dose. The strongest defensible interpretation is that</w:t>
+      </w:r>
+      <w:r>
+        <w:t xml:space="preserve"> </w:t>
+      </w:r>
+      <w:r>
+        <w:rPr>
+          <w:i/>
+          <w:iCs/>
+        </w:rPr>
+        <w:t xml:space="preserve">TSHR</w:t>
+      </w:r>
+      <w:r>
+        <w:t xml:space="preserve">-region expression and GD susceptibility share genetic support under the primary model in BBJ, with a corresponding signal recovered in the TED-enriched FinnGen outcome.</w:t>
+      </w:r>
+    </w:p>
+    <w:p>
+      <w:pPr>
+        <w:pStyle w:val="BodyText"/>
+        <w:widowControl/>
+      </w:pPr>
+      <w:r>
+        <w:t xml:space="preserve">The UKB result shows why MR and colocalization should be read together.</w:t>
+      </w:r>
+      <w:r>
+        <w:t xml:space="preserve"> </w:t>
+      </w:r>
+      <w:r>
+        <w:rPr>
+          <w:i/>
+          <w:iCs/>
+        </w:rPr>
+        <w:t xml:space="preserve">TSHR</w:t>
+      </w:r>
+      <w:r>
+        <w:t xml:space="preserve"> </w:t>
+      </w:r>
+      <w:r>
+        <w:t xml:space="preserve">had a highly significant MR association in UKB, yet the regional evidence favoured distinct expression and disease variants. Colocalization addresses a different question from the association test: whether the two traits plausibly share the same underlying variant [8]. A small</w:t>
+      </w:r>
+      <w:r>
+        <w:t xml:space="preserve"> </w:t>
+      </w:r>
+      <w:r>
+        <w:rPr>
+          <w:i/>
+          <w:iCs/>
+        </w:rPr>
+        <w:t xml:space="preserve">P</w:t>
+      </w:r>
+      <w:r>
+        <w:t xml:space="preserve"> </w:t>
+      </w:r>
+      <w:r>
+        <w:t xml:space="preserve">value cannot answer that question by itself. The broader hyperthyroidism phenotype and differences in ancestry or available variants are possible contributors to the outcome contrast, but this study cannot identify which explanation is responsible. Conversely, the divided H2/H4 posterior for</w:t>
       </w:r>
       <w:r>
         <w:t xml:space="preserve"> </w:t>
@@ -1617,7 +1673,7 @@
         <w:t xml:space="preserve"> </w:t>
       </w:r>
       <w:r>
-        <w:t xml:space="preserve">acts exclusively downstream of disease susceptibility. They leave open an inherited contribution and mechanisms not measured by this study.</w:t>
+        <w:t xml:space="preserve">in UKB should remain unresolved. Calling it negative would discard the shared-variant component, while calling it positive would overstate its support.</w:t>
       </w:r>
     </w:p>
     <w:p>
@@ -1626,7 +1682,80 @@
         <w:widowControl/>
       </w:pPr>
       <w:r>
-        <w:t xml:space="preserve">Similarly, the</w:t>
+        <w:t xml:space="preserve">The</w:t>
+      </w:r>
+      <w:r>
+        <w:t xml:space="preserve"> </w:t>
+      </w:r>
+      <w:r>
+        <w:rPr>
+          <w:i/>
+          <w:iCs/>
+        </w:rPr>
+        <w:t xml:space="preserve">CTLA4</w:t>
+      </w:r>
+      <w:r>
+        <w:t xml:space="preserve"> </w:t>
+      </w:r>
+      <w:r>
+        <w:t xml:space="preserve">comparison also helps define what the combined filter can and cannot establish. As a known autoimmune susceptibility locus [25],</w:t>
+      </w:r>
+      <w:r>
+        <w:t xml:space="preserve"> </w:t>
+      </w:r>
+      <w:r>
+        <w:rPr>
+          <w:i/>
+          <w:iCs/>
+        </w:rPr>
+        <w:t xml:space="preserve">CTLA4</w:t>
+      </w:r>
+      <w:r>
+        <w:t xml:space="preserve"> </w:t>
+      </w:r>
+      <w:r>
+        <w:t xml:space="preserve">showed the expected disease-association signal, but its BBJ posterior favoured distinct variants and it did not pass the combined BBJ-plus-FinnGen criterion. This makes it a biologically informative comparator rather than a validating positive control for the full analysis. Among the additional candidates,</w:t>
+      </w:r>
+      <w:r>
+        <w:t xml:space="preserve"> </w:t>
+      </w:r>
+      <w:r>
+        <w:rPr>
+          <w:i/>
+          <w:iCs/>
+        </w:rPr>
+        <w:t xml:space="preserve">TNFSF14</w:t>
+      </w:r>
+      <w:r>
+        <w:t xml:space="preserve"> </w:t>
+      </w:r>
+      <w:r>
+        <w:t xml:space="preserve">and</w:t>
+      </w:r>
+      <w:r>
+        <w:t xml:space="preserve"> </w:t>
+      </w:r>
+      <w:r>
+        <w:rPr>
+          <w:i/>
+          <w:iCs/>
+        </w:rPr>
+        <w:t xml:space="preserve">IFNGR1</w:t>
+      </w:r>
+      <w:r>
+        <w:t xml:space="preserve"> </w:t>
+      </w:r>
+      <w:r>
+        <w:t xml:space="preserve">had strong shared-variant support only in BBJ, whereas the chromosome 16p11.2 genes were consistent with a shared regional signal. These results support separating association discovery from gene-level prioritization. They complement previous MR studies of GD-related molecular traits [9, 10] by showing how an explicit comparison across outcomes can change the interpretation of statistically significant findings.</w:t>
+      </w:r>
+    </w:p>
+    <w:p>
+      <w:pPr>
+        <w:pStyle w:val="BodyText"/>
+        <w:widowControl/>
+      </w:pPr>
+      <w:r>
+        <w:t xml:space="preserve">The sensitivity analyses improve confidence in specific aspects of the results without removing all uncertainty. Substituting eQTLGen cohort frequencies preserved the discovery-hit set and every tested shared-variant classification. It therefore addresses concern about the reference-frequency approximation used to reconstruct exposure effects. Prior sensitivity answers a separate question:</w:t>
       </w:r>
       <w:r>
         <w:t xml:space="preserve"> </w:t>
@@ -1642,7 +1771,7 @@
         <w:t xml:space="preserve"> </w:t>
       </w:r>
       <w:r>
-        <w:t xml:space="preserve">ORs should not be read as evidence that increasing TSHR expression would prevent disease. They reflect lifelong genetic differences in reconstructed blood expression. A drug acts in a particular tissue, at a particular dose and stage of disease, and may affect signalling without reproducing a genetic expression difference [27]. The descriptive orbital dataset cannot resolve this distinction: four TED samples and a single control are insufficient for differential-expression inference or a causal comparison. The direction of blood-expression MR and disease-state orbital expression need not be the same.</w:t>
+        <w:t xml:space="preserve">support in BBJ fell below the chosen threshold under the most conservative shared-association prior, while FinnGen support remained above it. The BBJ finding should consequently be described as supported under the primary model and sensitive to the prior, rather than uniformly robust. Similarly, the screen’s limited ability to detect moderate effects prevents the lack of additional qualifying candidates from excluding smaller inherited effects. Detection benchmarks quantify the design’s precision; they do not determine whether a particular unresolved result reflects no effect or inadequate power.</w:t>
       </w:r>
     </w:p>
     <w:p>
@@ -1651,23 +1780,35 @@
         <w:widowControl/>
       </w:pPr>
       <w:r>
-        <w:t xml:space="preserve">The results also show why</w:t>
-      </w:r>
-      <w:r>
-        <w:t xml:space="preserve"> </w:t>
-      </w:r>
-      <w:r>
-        <w:rPr>
-          <w:i/>
-          <w:iCs/>
-        </w:rPr>
-        <w:t xml:space="preserve">P</w:t>
-      </w:r>
-      <w:r>
-        <w:t xml:space="preserve"> </w:t>
-      </w:r>
-      <w:r>
-        <w:t xml:space="preserve">values must be interpreted with the study design and supporting evidence.</w:t>
+        <w:t xml:space="preserve">A clinically useful next step is to test whether these susceptibility patterns relate to eye-disease development among patients who already have GD. A direct GD-with-TED versus GD-without-TED comparison would address that question more closely than population controls. Larger, ancestry-matched molecular datasets from relevant cell types could then assess whether blood-derived signals transfer to orbital tissue. The present orbital observations cannot provide that confirmation: four TED samples and one control support descriptive context only, and altered expression in established disease may reflect its consequences as well as its causes. Accordingly, the genetic and tissue components should guide focused follow-up questions rather than be combined into a claim of demonstrated therapeutic mechanism.</w:t>
+      </w:r>
+    </w:p>
+    <w:bookmarkStart w:id="21" w:name="limitations"/>
+    <w:p>
+      <w:pPr>
+        <w:pStyle w:val="Heading3"/>
+        <w:widowControl/>
+      </w:pPr>
+      <w:r>
+        <w:t xml:space="preserve">Limitations</w:t>
+      </w:r>
+    </w:p>
+    <w:p>
+      <w:pPr>
+        <w:pStyle w:val="FirstParagraph"/>
+        <w:widowControl/>
+      </w:pPr>
+      <w:r>
+        <w:t xml:space="preserve">The main limitations concern phenotype definition, exposure relevance and available information. FinnGen compared 858 Graves ophthalmopathy cases with population controls rather than GD patients without eye disease, so its associations may reflect GD susceptibility and cannot isolate a TED-specific effect. UKB hyperthyroidism was broader than GD, making phenotype and ancestry differences partly confounded. The predominantly European blood-expression data may not transfer fully to East Asian discovery participants or orbital cell types because regulation, linkage patterns and variant availability differ. Participant overlap between eQTLGen and the European outcomes could not be quantified. Cohort-frequency substitution addressed one part of exposure reconstruction, but the published frequencies excluded Framingham participants and did not resolve these broader issues. The tissue series had only one control, was not externally replicated and cannot support differential-expression or causal inference.</w:t>
+      </w:r>
+    </w:p>
+    <w:p>
+      <w:pPr>
+        <w:pStyle w:val="BodyText"/>
+        <w:widowControl/>
+      </w:pPr>
+      <w:r>
+        <w:t xml:space="preserve">Additional limitations concern the genetic models and detection range.</w:t>
       </w:r>
       <w:r>
         <w:t xml:space="preserve"> </w:t>
@@ -1683,23 +1824,75 @@
         <w:t xml:space="preserve"> </w:t>
       </w:r>
       <w:r>
-        <w:t xml:space="preserve">had a very small UKB MR</w:t>
-      </w:r>
-      <w:r>
-        <w:t xml:space="preserve"> </w:t>
-      </w:r>
-      <w:r>
-        <w:rPr>
-          <w:i/>
-          <w:iCs/>
-        </w:rPr>
-        <w:t xml:space="preserve">P</w:t>
-      </w:r>
-      <w:r>
-        <w:t xml:space="preserve"> </w:t>
-      </w:r>
-      <w:r>
-        <w:t xml:space="preserve">value, yet its expression and disease signals did not colocalize under the tested model.</w:t>
+        <w:t xml:space="preserve">was represented by one instrument under the European selection reference, precluding instrument-based pleiotropy tests; the other selected genes also had few instruments. Colocalization cannot exclude an effect through a neighbouring gene, and the single-causal-variant assumption may not capture more complex regional signals. The East Asian reference selected two</w:t>
+      </w:r>
+      <w:r>
+        <w:t xml:space="preserve"> </w:t>
+      </w:r>
+      <w:r>
+        <w:rPr>
+          <w:i/>
+          <w:iCs/>
+        </w:rPr>
+        <w:t xml:space="preserve">TSHR</w:t>
+      </w:r>
+      <w:r>
+        <w:t xml:space="preserve"> </w:t>
+      </w:r>
+      <w:r>
+        <w:t xml:space="preserve">variants at the primary threshold, so single-instrument status is not evidence for a single biological signal in every ancestry. Conclusions also depend on prior assumptions, particularly for</w:t>
+      </w:r>
+      <w:r>
+        <w:t xml:space="preserve"> </w:t>
+      </w:r>
+      <w:r>
+        <w:rPr>
+          <w:i/>
+          <w:iCs/>
+        </w:rPr>
+        <w:t xml:space="preserve">TSHR</w:t>
+      </w:r>
+      <w:r>
+        <w:t xml:space="preserve"> </w:t>
+      </w:r>
+      <w:r>
+        <w:t xml:space="preserve">in BBJ. Multi-variant colocalization, formal colocalization power and the probability of passing the combined filter were not evaluated. Together with the screen’s limited MR detection range, these constraints leave smaller or otherwise undetected genetic effects unresolved.</w:t>
+      </w:r>
+    </w:p>
+    <w:bookmarkEnd w:id="21"/>
+    <w:bookmarkStart w:id="22" w:name="conclusions"/>
+    <w:p>
+      <w:pPr>
+        <w:pStyle w:val="Heading3"/>
+        <w:widowControl/>
+      </w:pPr>
+      <w:r>
+        <w:t xml:space="preserve">Conclusions</w:t>
+      </w:r>
+    </w:p>
+    <w:p>
+      <w:pPr>
+        <w:pStyle w:val="FirstParagraph"/>
+        <w:widowControl/>
+      </w:pPr>
+      <w:r>
+        <w:t xml:space="preserve">Within these limits,</w:t>
+      </w:r>
+      <w:r>
+        <w:t xml:space="preserve"> </w:t>
+      </w:r>
+      <w:r>
+        <w:rPr>
+          <w:i/>
+          <w:iCs/>
+        </w:rPr>
+        <w:t xml:space="preserve">TSHR</w:t>
+      </w:r>
+      <w:r>
+        <w:t xml:space="preserve"> </w:t>
+      </w:r>
+      <w:r>
+        <w:t xml:space="preserve">showed stronger expression–disease evidence than</w:t>
       </w:r>
       <w:r>
         <w:t xml:space="preserve"> </w:t>
@@ -1715,66 +1908,23 @@
         <w:t xml:space="preserve"> </w:t>
       </w:r>
       <w:r>
-        <w:t xml:space="preserve">had</w:t>
-      </w:r>
-      <w:r>
-        <w:t xml:space="preserve"> </w:t>
-      </w:r>
-      <w:r>
-        <w:rPr>
-          <w:i/>
-          <w:iCs/>
-        </w:rPr>
-        <w:t xml:space="preserve">P</w:t>
-      </w:r>
-      <w:r>
-        <w:t xml:space="preserve"> </w:t>
-      </w:r>
-      <w:r>
-        <w:t xml:space="preserve">values below 0.05 in two outcomes, but these were exploratory associations after a genome-wide druggable-gene screen.</w:t>
-      </w:r>
-      <w:r>
-        <w:t xml:space="preserve"> </w:t>
-      </w:r>
-      <w:r>
-        <w:rPr>
-          <w:i/>
-          <w:iCs/>
-        </w:rPr>
-        <w:t xml:space="preserve">CTLA4</w:t>
-      </w:r>
-      <w:r>
-        <w:t xml:space="preserve"> </w:t>
-      </w:r>
-      <w:r>
-        <w:t xml:space="preserve">was detected as expected for a known autoimmune locus, although it did not satisfy the combined criterion. These findings support reporting estimates, confidence intervals and the full evidence pattern rather than treating nominal significance as sufficient for target selection.</w:t>
-      </w:r>
-    </w:p>
-    <w:p>
-      <w:pPr>
-        <w:pStyle w:val="BodyText"/>
-        <w:widowControl/>
-      </w:pPr>
-      <w:r>
-        <w:t xml:space="preserve">Several limitations constrain the clinical interpretation. First, the FinnGen outcome compares Graves ophthalmopathy cases with population controls, not GD patients without eye disease. Agreement with BBJ can therefore reflect GD susceptibility, and a TED-specific effect cannot be separated. The FinnGen analysis also included only 858 cases. UKB hyperthyroidism is broader than GD, so ancestry and phenotype differences are partly confounded across the comparisons.</w:t>
-      </w:r>
-    </w:p>
-    <w:p>
-      <w:pPr>
-        <w:pStyle w:val="BodyText"/>
-        <w:widowControl/>
-      </w:pPr>
-      <w:r>
-        <w:t xml:space="preserve">Second, the expression data came predominantly from European blood samples, whereas discovery used East Asian participants. Tissue regulation, linkage patterns and variant availability may differ. eQTLGen frequency substitution addressed one part of exposure-effect reconstruction, but did not resolve these differences; its published frequencies also exclude Framingham participants. Participant overlap between eQTLGen and the European outcomes could not be quantified. These uncertainties limit direct comparison of effect magnitudes across datasets.</w:t>
-      </w:r>
-    </w:p>
-    <w:p>
-      <w:pPr>
-        <w:pStyle w:val="BodyText"/>
-        <w:widowControl/>
-      </w:pPr>
-      <w:r>
-        <w:t xml:space="preserve">Third,</w:t>
+        <w:t xml:space="preserve">in BBJ Graves disease and FinnGen Graves ophthalmopathy. The findings distinguish genetic susceptibility evidence from evidence of therapeutic efficacy, while preserving the uncertainty around</w:t>
+      </w:r>
+      <w:r>
+        <w:t xml:space="preserve"> </w:t>
+      </w:r>
+      <w:r>
+        <w:rPr>
+          <w:i/>
+          <w:iCs/>
+        </w:rPr>
+        <w:t xml:space="preserve">IGF1R</w:t>
+      </w:r>
+      <w:r>
+        <w:t xml:space="preserve"> </w:t>
+      </w:r>
+      <w:r>
+        <w:t xml:space="preserve">and the prior dependence of the BBJ</w:t>
       </w:r>
       <w:r>
         <w:t xml:space="preserve"> </w:t>
@@ -1790,93 +1940,12 @@
         <w:t xml:space="preserve"> </w:t>
       </w:r>
       <w:r>
-        <w:t xml:space="preserve">was represented by one instrument under the European selection reference. Instrument-based pleiotropy tests were therefore unavailable, and colocalization cannot rule out an effect through a neighbouring gene. The other selected genes had few instruments, limiting the reliability of pleiotropy tests. The</w:t>
-      </w:r>
-      <w:r>
-        <w:t xml:space="preserve"> </w:t>
-      </w:r>
-      <w:r>
-        <w:rPr>
-          <w:i/>
-          <w:iCs/>
-        </w:rPr>
-        <w:t xml:space="preserve">TSHR</w:t>
-      </w:r>
-      <w:r>
-        <w:t xml:space="preserve"> </w:t>
-      </w:r>
-      <w:r>
-        <w:t xml:space="preserve">instrument remained selected across the tested clumping settings, but the East Asian reference yielded two independent variants at the primary threshold. Single-instrument status should not be interpreted as proof of a single biological signal in every ancestry.</w:t>
-      </w:r>
-    </w:p>
-    <w:p>
-      <w:pPr>
-        <w:pStyle w:val="BodyText"/>
-        <w:widowControl/>
-      </w:pPr>
-      <w:r>
-        <w:t xml:space="preserve">Fourth, colocalization assumes at most one causal variant per trait in a region, and its conclusions depend on prior assumptions. The</w:t>
-      </w:r>
-      <w:r>
-        <w:t xml:space="preserve"> </w:t>
-      </w:r>
-      <w:r>
-        <w:rPr>
-          <w:i/>
-          <w:iCs/>
-        </w:rPr>
-        <w:t xml:space="preserve">TSHR</w:t>
-      </w:r>
-      <w:r>
-        <w:t xml:space="preserve"> </w:t>
-      </w:r>
-      <w:r>
-        <w:t xml:space="preserve">BBJ result fell below the support threshold under the most conservative prior. Low shared-variant support can reflect limited information as well as distinct signals. Multi-variant colocalization, formal colocalization power and the detection probability of the combined filter were not evaluated. The screen’s limited MR detection range also prevents its negative candidate result from excluding smaller genetic effects.</w:t>
-      </w:r>
-    </w:p>
-    <w:p>
-      <w:pPr>
-        <w:pStyle w:val="BodyText"/>
-        <w:widowControl/>
-      </w:pPr>
-      <w:r>
-        <w:t xml:space="preserve">Within these limits,</w:t>
-      </w:r>
-      <w:r>
-        <w:t xml:space="preserve"> </w:t>
-      </w:r>
-      <w:r>
-        <w:rPr>
-          <w:i/>
-          <w:iCs/>
-        </w:rPr>
-        <w:t xml:space="preserve">TSHR</w:t>
-      </w:r>
-      <w:r>
-        <w:t xml:space="preserve"> </w:t>
-      </w:r>
-      <w:r>
-        <w:t xml:space="preserve">showed a supported expression–disease association in the two Graves disease outcomes, whereas the genetic evidence at</w:t>
-      </w:r>
-      <w:r>
-        <w:t xml:space="preserve"> </w:t>
-      </w:r>
-      <w:r>
-        <w:rPr>
-          <w:i/>
-          <w:iCs/>
-        </w:rPr>
-        <w:t xml:space="preserve">IGF1R</w:t>
-      </w:r>
-      <w:r>
-        <w:t xml:space="preserve"> </w:t>
-      </w:r>
-      <w:r>
-        <w:t xml:space="preserve">was weaker and inconclusive. The findings help distinguish genetic susceptibility evidence from evidence of therapeutic efficacy. Confirmation in ancestry-matched data, relevant cell types and a direct comparison of GD patients with and without TED would be needed to clarify mechanisms and eye-disease specificity.</w:t>
-      </w:r>
-    </w:p>
-    <w:bookmarkEnd w:id="21"/>
-    <w:bookmarkStart w:id="22" w:name="declarations"/>
+        <w:t xml:space="preserve">result. They support further investigation in relevant tissues and a direct comparison of GD patients with and without TED; they do not establish treatment direction or expected clinical benefit.</w:t>
+      </w:r>
+    </w:p>
+    <w:bookmarkEnd w:id="22"/>
+    <w:bookmarkEnd w:id="23"/>
+    <w:bookmarkStart w:id="24" w:name="declarations"/>
     <w:p>
       <w:pPr>
         <w:pStyle w:val="Heading2"/>
@@ -2032,8 +2101,8 @@
         <w:t xml:space="preserve">We thank the eQTLGen Consortium, Biobank Japan, the UK Biobank, and the FinnGen study and its participants for making their summary statistics publicly available. We acknowledge the GWAS Catalog for hosting and distributing the genome-wide association summary statistics used as outcome data.</w:t>
       </w:r>
     </w:p>
-    <w:bookmarkEnd w:id="22"/>
-    <w:bookmarkStart w:id="23" w:name="references"/>
+    <w:bookmarkEnd w:id="24"/>
+    <w:bookmarkStart w:id="25" w:name="references"/>
     <w:p>
       <w:pPr>
         <w:pStyle w:val="Heading2"/>
@@ -2368,8 +2437,8 @@
         <w:t xml:space="preserve">Nelson MR, Tipney H, Painter JL, Shen J, Nicoletti P, Shen Y, Floratos A, Sham PC, Li MJ, Wang J, et al. The support of human genetic evidence for approved drug indications. Nat Genet. 2015;47:856-860. doi:10.1038/ng.3314.</w:t>
       </w:r>
     </w:p>
-    <w:bookmarkEnd w:id="23"/>
-    <w:bookmarkStart w:id="24" w:name="figure-legends"/>
+    <w:bookmarkEnd w:id="25"/>
+    <w:bookmarkStart w:id="26" w:name="figure-legends"/>
     <w:p>
       <w:pPr>
         <w:pStyle w:val="Heading2"/>
@@ -2390,13 +2459,13 @@
           <w:b/>
           <w:bCs/>
         </w:rPr>
-        <w:t xml:space="preserve">Figure 1. Study design and discovery flow.</w:t>
-      </w:r>
-      <w:r>
-        <w:t xml:space="preserve"> </w:t>
-      </w:r>
-      <w:r>
-        <w:t xml:space="preserve">Genes with independent blood-expression instruments were evaluated across the outcome hierarchy. The discovery threshold was</w:t>
+        <w:t xml:space="preserve">Figure 1. Study design and the druggable-gene association screen.</w:t>
+      </w:r>
+      <w:r>
+        <w:t xml:space="preserve"> </w:t>
+      </w:r>
+      <w:r>
+        <w:t xml:space="preserve">(A) Gene selection and discovery flow. Genes with independent blood-expression instruments were evaluated across the outcome hierarchy; genes without estimable BBJ results were not treated as negative. (B) Gene-level MR associations in BBJ Graves disease, plotted by the GRCh37 position of each gene’s strongest selected expression instrument. Each point represents one gene, not a SNP association. The horizontal line marks the discovery threshold of</w:t>
       </w:r>
       <w:r>
         <w:t xml:space="preserve"> </w:t>
@@ -2412,7 +2481,52 @@
         <w:t xml:space="preserve"> </w:t>
       </w:r>
       <w:r>
-        <w:t xml:space="preserve">&lt; 0.05/2,544. Thirteen genes met this threshold; the six additional candidates were evaluated by colocalization, and none reached shared-variant support ≥0.80 in both BBJ and FinnGen. TSHR, IGF1R and CTLA4 were selected for detailed comparison on biological and therapeutic grounds, independently of screen significance.</w:t>
+        <w:t xml:space="preserve">&lt; 0.05/2,544; all 2,234 estimable genes are plotted and all 13 discovery genes are labelled.</w:t>
+      </w:r>
+      <w:r>
+        <w:t xml:space="preserve"> </w:t>
+      </w:r>
+      <w:r>
+        <w:rPr>
+          <w:i/>
+          <w:iCs/>
+        </w:rPr>
+        <w:t xml:space="preserve">TSHR</w:t>
+      </w:r>
+      <w:r>
+        <w:t xml:space="preserve">,</w:t>
+      </w:r>
+      <w:r>
+        <w:t xml:space="preserve"> </w:t>
+      </w:r>
+      <w:r>
+        <w:rPr>
+          <w:i/>
+          <w:iCs/>
+        </w:rPr>
+        <w:t xml:space="preserve">IGF1R</w:t>
+      </w:r>
+      <w:r>
+        <w:t xml:space="preserve"> </w:t>
+      </w:r>
+      <w:r>
+        <w:t xml:space="preserve">and</w:t>
+      </w:r>
+      <w:r>
+        <w:t xml:space="preserve"> </w:t>
+      </w:r>
+      <w:r>
+        <w:rPr>
+          <w:i/>
+          <w:iCs/>
+        </w:rPr>
+        <w:t xml:space="preserve">CTLA4</w:t>
+      </w:r>
+      <w:r>
+        <w:t xml:space="preserve"> </w:t>
+      </w:r>
+      <w:r>
+        <w:t xml:space="preserve">are highlighted as the three biologically selected genes. Their selection for comparison did not depend on discovery significance.</w:t>
       </w:r>
     </w:p>
     <w:p>
@@ -2425,13 +2539,13 @@
           <w:b/>
           <w:bCs/>
         </w:rPr>
-        <w:t xml:space="preserve">Figure 2. Associations of the three selected genes with disease.</w:t>
-      </w:r>
-      <w:r>
-        <w:t xml:space="preserve"> </w:t>
-      </w:r>
-      <w:r>
-        <w:t xml:space="preserve">Points show primary ORs and horizontal lines their 95% CIs, with the exact displayed</w:t>
+        <w:t xml:space="preserve">Figure 2. Association estimates and regional genetic evidence for the three selected genes.</w:t>
+      </w:r>
+      <w:r>
+        <w:t xml:space="preserve"> </w:t>
+      </w:r>
+      <w:r>
+        <w:t xml:space="preserve">(A) Primary ORs and 95% CIs, with corresponding two-sided</w:t>
       </w:r>
       <w:r>
         <w:t xml:space="preserve"> </w:t>
@@ -2447,11 +2561,91 @@
         <w:t xml:space="preserve"> </w:t>
       </w:r>
       <w:r>
-        <w:t xml:space="preserve">values beside each estimate. The logarithmic OR axis has a reference line at 1. ORs refer to reconstructed genetically proxied blood expression, not treatment effects. All nine comparisons are included, including the non-significant IGF1R FinnGen result. Shared-variant support is reported separately in Table 2 and prior sensitivity in Table S2.</w:t>
-      </w:r>
-    </w:p>
-    <w:bookmarkEnd w:id="24"/>
-    <w:bookmarkStart w:id="25" w:name="tables"/>
+        <w:t xml:space="preserve">values. The OR axis is logarithmic, with a reference line at one. ORs refer to reconstructed genetically proxied blood expression, not treatment effects. All nine comparisons are included. (B) Regional colocalization probabilities under the primary prior, aligned with the same gene–outcome rows. Stacked bars show expression-only support (H2), support for distinct variants (H3), shared-variant support (H4), and residual H0/H1 support. Exact displayed H4 probabilities are given at right. These probabilities are not</w:t>
+      </w:r>
+      <w:r>
+        <w:t xml:space="preserve"> </w:t>
+      </w:r>
+      <w:r>
+        <w:rPr>
+          <w:i/>
+          <w:iCs/>
+        </w:rPr>
+        <w:t xml:space="preserve">P</w:t>
+      </w:r>
+      <w:r>
+        <w:t xml:space="preserve"> </w:t>
+      </w:r>
+      <w:r>
+        <w:t xml:space="preserve">values; ≥0.80 was the threshold for strong shared-variant support. The figure displays the discordance between association strength and shared-variant evidence without treating either as proof of a therapeutic effect.</w:t>
+      </w:r>
+    </w:p>
+    <w:p>
+      <w:pPr>
+        <w:pStyle w:val="BodyText"/>
+        <w:widowControl/>
+      </w:pPr>
+      <w:r>
+        <w:rPr>
+          <w:b/>
+          <w:bCs/>
+        </w:rPr>
+        <w:t xml:space="preserve">Figure 3. Shared-variant evidence across candidates and sensitivity to prior assumptions.</w:t>
+      </w:r>
+      <w:r>
+        <w:t xml:space="preserve"> </w:t>
+      </w:r>
+      <w:r>
+        <w:t xml:space="preserve">(A) Primary-prior PP.H4 values for all nine evaluated genes and three outcomes. Outlined cells meet the ≥0.80 threshold; probabilities below 0.001 are labelled &lt;0.001. A gene passes the combined criterion only when both BBJ and FinnGen meet that threshold; UKB is an additional comparison.</w:t>
+      </w:r>
+      <w:r>
+        <w:t xml:space="preserve"> </w:t>
+      </w:r>
+      <w:r>
+        <w:rPr>
+          <w:i/>
+          <w:iCs/>
+        </w:rPr>
+        <w:t xml:space="preserve">TSHR</w:t>
+      </w:r>
+      <w:r>
+        <w:t xml:space="preserve">,</w:t>
+      </w:r>
+      <w:r>
+        <w:t xml:space="preserve"> </w:t>
+      </w:r>
+      <w:r>
+        <w:rPr>
+          <w:i/>
+          <w:iCs/>
+        </w:rPr>
+        <w:t xml:space="preserve">IGF1R</w:t>
+      </w:r>
+      <w:r>
+        <w:t xml:space="preserve"> </w:t>
+      </w:r>
+      <w:r>
+        <w:t xml:space="preserve">and</w:t>
+      </w:r>
+      <w:r>
+        <w:t xml:space="preserve"> </w:t>
+      </w:r>
+      <w:r>
+        <w:rPr>
+          <w:i/>
+          <w:iCs/>
+        </w:rPr>
+        <w:t xml:space="preserve">CTLA4</w:t>
+      </w:r>
+      <w:r>
+        <w:t xml:space="preserve"> </w:t>
+      </w:r>
+      <w:r>
+        <w:t xml:space="preserve">were biologically selected, while the other six genes were additional discovery candidates. (B) Prior sensitivity for the three selected genes. D, I and C denote default, intermediate and conservative shared-association priors (p12 = 10⁻⁵, 5×10⁻⁶ and 10⁻⁶), with p1 = p2 = 10⁻⁴ throughout. The dashed line marks 0.80. Prior changes can alter classification even when frequency substitution does not; Tables S3–S4 report the separate cohort-frequency sensitivity. Full H0–H4 probabilities and all 81 gene–outcome–prior settings are in Supplementary Data 3.</w:t>
+      </w:r>
+    </w:p>
+    <w:bookmarkEnd w:id="26"/>
+    <w:bookmarkStart w:id="27" w:name="tables"/>
     <w:p>
       <w:pPr>
         <w:sectPr>
@@ -7360,8 +7554,8 @@
         <w:t xml:space="preserve">estimate is 0.977 (0.967–0.987) at three decimals: a precisely estimated but very small per-unit effect, not a weak one. The five MHC genes were not treated as new independent targets. The six additional candidates were TNFSF14, IFNGR1, MAPKAPK5, HSD3B7, VKORC1 and PRSS36; none showed strong shared-variant support in both BBJ and FinnGen. Full outcome comparisons and model probabilities remain in Supplementary Data 2–3.</w:t>
       </w:r>
     </w:p>
-    <w:bookmarkEnd w:id="25"/>
-    <w:bookmarkEnd w:id="26"/>
+    <w:bookmarkEnd w:id="27"/>
+    <w:bookmarkEnd w:id="28"/>
     <w:sectPr>
       <w:footnotePr>
         <w:numRestart w:val="eachSect"/>

</xml_diff>

<commit_message>
Revise manuscript, complete table exports and clarify remaining scientific checks
</commit_message>
<xml_diff>
--- a/submission/candidate_20260911_review/MANUSCRIPT_Submission.docx
+++ b/submission/candidate_20260911_review/MANUSCRIPT_Submission.docx
@@ -21,14 +21,14 @@
         <w:t xml:space="preserve">TSHR and IGF1R genetics in Graves disease</w:t>
       </w:r>
     </w:p>
-    <w:bookmarkStart w:id="28" w:name="X170644179862b888655a49e077d6639ab7a50ca"/>
+    <w:bookmarkStart w:id="28" w:name="Xf588694525d787d8d8044e892b46f091a821748"/>
     <w:p>
       <w:pPr>
         <w:pStyle w:val="Title"/>
         <w:widowControl/>
       </w:pPr>
       <w:r>
-        <w:t xml:space="preserve">Genetic evidence for TSHR and IGF1R in Graves disease and thyroid eye disease</w:t>
+        <w:t xml:space="preserve">TSHR and IGF1R expression in Graves disease: Mendelian randomization and colocalization</w:t>
       </w:r>
     </w:p>
     <w:p>
@@ -212,7 +212,7 @@
         <w:t xml:space="preserve"> </w:t>
       </w:r>
       <w:r>
-        <w:t xml:space="preserve">Thirteen genes met the multiple-testing threshold. Higher genetically proxied</w:t>
+        <w:t xml:space="preserve">Thirteen genes met the multiple-testing threshold. Per approximately one standard deviation (SD) higher genetically proxied blood</w:t>
       </w:r>
       <w:r>
         <w:t xml:space="preserve"> </w:t>
@@ -228,7 +228,7 @@
         <w:t xml:space="preserve"> </w:t>
       </w:r>
       <w:r>
-        <w:t xml:space="preserve">expression was associated with lower odds of BBJ GD (OR 0.12, 95% CI 0.07–0.21;</w:t>
+        <w:t xml:space="preserve">expression, the OR for BBJ GD was 0.12 (95% CI 0.07–0.21;</w:t>
       </w:r>
       <w:r>
         <w:t xml:space="preserve"> </w:t>
@@ -350,23 +350,7 @@
         <w:t xml:space="preserve"> </w:t>
       </w:r>
       <w:r>
-        <w:t xml:space="preserve">in this analysis. These results do not exclude an inherited</w:t>
-      </w:r>
-      <w:r>
-        <w:t xml:space="preserve"> </w:t>
-      </w:r>
-      <w:r>
-        <w:rPr>
-          <w:i/>
-          <w:iCs/>
-        </w:rPr>
-        <w:t xml:space="preserve">IGF1R</w:t>
-      </w:r>
-      <w:r>
-        <w:t xml:space="preserve"> </w:t>
-      </w:r>
-      <w:r>
-        <w:t xml:space="preserve">contribution or alter evidence supporting IGF-1R blockade. FinnGen comparisons with population controls cannot establish an effect specific to TED within GD.</w:t>
+        <w:t xml:space="preserve">in this analysis. An effector role for IGF-1R remains compatible with these findings, alongside an unresolved inherited contribution. FinnGen comparisons with population controls cannot establish an effect specific to TED within GD.</w:t>
       </w:r>
     </w:p>
     <w:p>
@@ -723,7 +707,7 @@
         <w:t xml:space="preserve"> </w:t>
       </w:r>
       <w:r>
-        <w:t xml:space="preserve">&lt; 1.965×10⁻⁵, correcting for 2,544 eligible genes. Associations at</w:t>
+        <w:t xml:space="preserve">&lt; 1.965×10⁻⁵, correcting for 2,544 eligible genes. This Bonferroni correction is conservative when gene-level tests are correlated. Associations at</w:t>
       </w:r>
       <w:r>
         <w:t xml:space="preserve"> </w:t>
@@ -813,7 +797,7 @@
         <w:t xml:space="preserve"> </w:t>
       </w:r>
       <w:r>
-        <w:t xml:space="preserve">value. We report it alongside the MR results and tested more conservative assumptions (Table S2) [24]. Colocalization used the regional expression and disease statistics without any significance filter, giving 1,479 to 7,740 variants per gene and outcome. Requiring support in both the discovery outcome and the TED-enriched outcome is a stringent cross-outcome filter: it selects candidates whose shared-variant evidence is not confined to one dataset, and it is not a test of Graves disease association on its own. The model assumes at most one causal variant per trait in the region; full model details and all probabilities are supplied in Supplementary Methods and Supplementary Data 3.</w:t>
+        <w:t xml:space="preserve">value. We report it alongside the MR results and tested more conservative assumptions (Table S2) [24]. Colocalization used the regional expression and disease statistics without any significance filter, giving 1,479 to 7,740 variants per gene and outcome. Requiring support in both the discovery outcome and the TED-enriched outcome is a stringent cross-outcome filter: it selects candidates whose shared-variant evidence is not confined to one dataset, and it is not a test of Graves disease association on its own. The combined criterion was not prospectively registered, and the available analysis plan does not establish that this exact rule preceded inspection of results. The model assumes at most one causal variant per trait in the region; full model details and all probabilities are supplied in Supplementary Methods and Supplementary Data 3.</w:t>
       </w:r>
     </w:p>
     <w:p>
@@ -872,7 +856,7 @@
         <w:widowControl/>
       </w:pPr>
       <w:r>
-        <w:t xml:space="preserve">Analyses used R 4.3.3, TwoSampleMR 0.7.4, coloc 5.2.3 and PLINK 1.9. Python reproduced the colocalization calculations for verification and frequency sensitivity. The instruments and complete numerical results are supplied in Supplementary Data 1–4. No prospective study registration was available.</w:t>
+        <w:t xml:space="preserve">Analyses used R 4.3.3, TwoSampleMR 0.7.4, coloc 5.2.3 and PLINK 1.9. Python reproduced the colocalization calculations for verification and frequency sensitivity. The instruments and complete numerical results are supplied in Supplementary Data 1–5. No prospective study registration was available.</w:t>
       </w:r>
     </w:p>
     <w:bookmarkEnd w:id="13"/>
@@ -1022,7 +1006,7 @@
         <w:widowControl/>
       </w:pPr>
       <w:r>
-        <w:t xml:space="preserve">Expression and disease showed strong shared-variant support in BBJ and FinnGen, with probabilities of 0.951 and 0.986, respectively. The leading variant was rs179252 in both. UKB did not show the same support (0.226), despite a strong MR association. There the posterior favoured distinct causal variants (PP.H3 = 0.774), so the expression and disease signals were more consistent with two linked variants than with one shared variant. Thus, a highly significant MR result alone did not establish a shared genetic signal in every outcome. The contrast is visible in Figure 2: the MR estimates all favoured lower odds, whereas the UKB posterior favoured distinct expression and disease variants. This discordance was not resolved by substituting cohort allele frequencies.</w:t>
+        <w:t xml:space="preserve">Expression and disease showed strong shared-variant support in BBJ and FinnGen, with probabilities of 0.951 and 0.986, respectively. The highest-probability variant conditional on the shared-variant model was rs179252 in both. UKB did not show the same support (0.226), despite a strong MR association. Under the single-causal-variant model, the UKB posterior favoured distinct variants (PP.H3 = 0.774); this does not establish the number of independent regional signals. Thus, a highly significant MR result alone did not establish a shared genetic signal in every outcome. The contrast is visible in Figure 2: the MR estimates all favoured lower odds, whereas the UKB posterior favoured distinct expression and disease variants. This discordance was not resolved by substituting cohort allele frequencies.</w:t>
       </w:r>
     </w:p>
     <w:bookmarkEnd w:id="16"/>
@@ -1115,7 +1099,7 @@
         <w:widowControl/>
       </w:pPr>
       <w:r>
-        <w:t xml:space="preserve">Shared-variant support was below 0.80 in all three outcomes (BBJ 0.073, UKB 0.404 and FinnGen 0.032). The UKB posterior was divided between an expression-only signal (PP.H2 = 0.400) and a shared variant (PP.H4 = 0.404), with little support for distinct variants (PP.H3 = 0.196), and should be regarded as unresolved rather than negative. Alternative MR estimators agreed in direction but differed in statistical significance (Table S1). Weighted-median estimates were nominally significant in BBJ and UKB, whereas weighted-mode estimates were not; neither provided nominal support in FinnGen. These methods used the same limited instrument sets and therefore do not constitute independent replication. Taken together, these results provide weaker genetic support for</w:t>
+        <w:t xml:space="preserve">Shared-variant support was below 0.80 in all three outcomes (BBJ 0.073, UKB 0.404 and FinnGen 0.032). Expression-only model support (PP.H2) was 0.690 in BBJ and 0.623 in FinnGen. This model preference does not establish an absence of marginal disease association. The UKB posterior was divided between an expression-only signal (PP.H2 = 0.400) and a shared variant (PP.H4 = 0.404), with little support for distinct variants (PP.H3 = 0.196), and should be regarded as unresolved rather than negative. Alternative MR estimators agreed in direction but differed in statistical significance (Table S1). Weighted-median estimates were nominally significant in BBJ and UKB, whereas weighted-mode estimates were not; neither provided nominal support in FinnGen. These methods used the same limited instrument sets and therefore do not constitute independent replication. Taken together, these results provide weaker genetic support for</w:t>
       </w:r>
       <w:r>
         <w:t xml:space="preserve"> </w:t>
@@ -1562,23 +1546,7 @@
         <w:widowControl/>
       </w:pPr>
       <w:r>
-        <w:t xml:space="preserve">For clinicians, the distinction between disease susceptibility and therapeutic response is central. Teprotumumab improved outcomes in a randomized trial of active TED [3], while experimental work supports functional interaction between TSHR and IGF-1R in orbital fibroblasts [5]. These observations concern receptor activity in established disease. Our analysis concerns inherited variation associated with blood gene expression and disease odds. Tissue-specific regulation documented by GTEx further cautions against treating blood expression as a complete representation of orbital biology [26]. A receptor can remain relevant to treatment even when this particular genetic analysis provides limited evidence for an expression-mediated susceptibility effect. The</w:t>
-      </w:r>
-      <w:r>
-        <w:t xml:space="preserve"> </w:t>
-      </w:r>
-      <w:r>
-        <w:rPr>
-          <w:i/>
-          <w:iCs/>
-        </w:rPr>
-        <w:t xml:space="preserve">IGF1R</w:t>
-      </w:r>
-      <w:r>
-        <w:t xml:space="preserve"> </w:t>
-      </w:r>
-      <w:r>
-        <w:t xml:space="preserve">findings neither challenge the clinical evidence for IGF-1R blockade nor establish an exclusively downstream effector role.</w:t>
+        <w:t xml:space="preserve">For clinicians, susceptibility and therapeutic response concern different stages of disease. Teprotumumab showed efficacy in the phase 2 and phase 3 randomized trials of active TED [3, 26]. OPTIC-X provided extension and re-treatment data [27], and a placebo-controlled trial in longstanding, low-activity TED also found improved proptosis [28]. These studies support treatment effects in established disease; none tests inherited blood-expression effects on disease onset. Experimental receptor crosstalk [5] and tissue-specific regulation [29] provide complementary biological context. A plausible model compatible with our findings is that IGF-1R contributes to orbital effector processes even when inherited blood-expression variation provides weaker susceptibility evidence. This is a hypothesis rather than proof of an exclusively downstream role: the nominal BBJ and UKB associations and imprecise FinnGen estimate leave an inherited contribution unresolved.</w:t>
       </w:r>
     </w:p>
     <w:p>
@@ -1587,7 +1555,7 @@
         <w:widowControl/>
       </w:pPr>
       <w:r>
-        <w:t xml:space="preserve">The</w:t>
+        <w:t xml:space="preserve">The protective direction of the</w:t>
       </w:r>
       <w:r>
         <w:t xml:space="preserve"> </w:t>
@@ -1603,7 +1571,7 @@
         <w:t xml:space="preserve"> </w:t>
       </w:r>
       <w:r>
-        <w:t xml:space="preserve">findings provide a useful susceptibility anchor, but they require equally careful translation. The established role of TSHR in GD makes an association at this locus biologically coherent [1, 2]. Nonetheless, an OR below one for genetically proxied expression does not imply that increasing TSHR expression or stimulating its receptor would prevent disease. Genetic evidence can inform target prioritization [27], but the measured exposure, relevant tissue, timing and direction of a pharmacologic intervention must still match the proposed mechanism. Here, reconstructed blood expression is neither receptor stimulation nor a drug dose. The strongest defensible interpretation is that</w:t>
+        <w:t xml:space="preserve">estimate is compatible with a central-tolerance hypothesis. Human thymic studies associated the GD-protective rs179247 allele with greater intrathymic</w:t>
       </w:r>
       <w:r>
         <w:t xml:space="preserve"> </w:t>
@@ -1616,7 +1584,10 @@
         <w:t xml:space="preserve">TSHR</w:t>
       </w:r>
       <w:r>
-        <w:t xml:space="preserve">-region expression and GD susceptibility share genetic support under the primary model in BBJ, with a corresponding signal recovered in the TED-enriched FinnGen outcome.</w:t>
+        <w:t xml:space="preserve"> </w:t>
+      </w:r>
+      <w:r>
+        <w:t xml:space="preserve">transcription, a pattern that could improve immune recognition of TSHR as self [30, 31]. We calculated strong LD between rs179252 and rs179247 in European and East Asian reference samples (r² = 0.957 and 0.992, respectively; Supplementary Methods). This connects the instrument to a biologically relevant region, but neither LD nor a blood eQTL demonstrates the same regulatory direction in thymus. If the relevant allele increases thymic antigen expression, the protective association would be biologically coherent; that tissue-specific step remains untested here. The variant-level disease ORs were approximately 0.80, 0.77 and 0.78, whereas the larger MR effects are scaled to approximately one SD of reconstructed expression (Table 2). Genetic target evidence [32] therefore requires tissue and exposure interpretation before translation into an intervention.</w:t>
       </w:r>
     </w:p>
     <w:p>
@@ -1625,7 +1596,7 @@
         <w:widowControl/>
       </w:pPr>
       <w:r>
-        <w:t xml:space="preserve">The UKB result shows why MR and colocalization should be read together.</w:t>
+        <w:t xml:space="preserve">The UKB</w:t>
       </w:r>
       <w:r>
         <w:t xml:space="preserve"> </w:t>
@@ -1641,39 +1612,23 @@
         <w:t xml:space="preserve"> </w:t>
       </w:r>
       <w:r>
-        <w:t xml:space="preserve">had a highly significant MR association in UKB, yet the regional evidence favoured distinct expression and disease variants. Colocalization addresses a different question from the association test: whether the two traits plausibly share the same underlying variant [8]. A small</w:t>
-      </w:r>
-      <w:r>
-        <w:t xml:space="preserve"> </w:t>
-      </w:r>
-      <w:r>
-        <w:rPr>
-          <w:i/>
-          <w:iCs/>
-        </w:rPr>
-        <w:t xml:space="preserve">P</w:t>
-      </w:r>
-      <w:r>
-        <w:t xml:space="preserve"> </w:t>
-      </w:r>
-      <w:r>
-        <w:t xml:space="preserve">value cannot answer that question by itself. The broader hyperthyroidism phenotype and differences in ancestry or available variants are possible contributors to the outcome contrast, but this study cannot identify which explanation is responsible. Conversely, the divided H2/H4 posterior for</w:t>
-      </w:r>
-      <w:r>
-        <w:t xml:space="preserve"> </w:t>
-      </w:r>
-      <w:r>
-        <w:rPr>
-          <w:i/>
-          <w:iCs/>
-        </w:rPr>
-        <w:t xml:space="preserve">IGF1R</w:t>
-      </w:r>
-      <w:r>
-        <w:t xml:space="preserve"> </w:t>
-      </w:r>
-      <w:r>
-        <w:t xml:space="preserve">in UKB should remain unresolved. Calling it negative would discard the shared-variant component, while calling it positive would overstate its support.</w:t>
+        <w:t xml:space="preserve">and BBJ</w:t>
+      </w:r>
+      <w:r>
+        <w:t xml:space="preserve"> </w:t>
+      </w:r>
+      <w:r>
+        <w:rPr>
+          <w:i/>
+          <w:iCs/>
+        </w:rPr>
+        <w:t xml:space="preserve">CTLA4</w:t>
+      </w:r>
+      <w:r>
+        <w:t xml:space="preserve"> </w:t>
+      </w:r>
+      <w:r>
+        <w:t xml:space="preserve">discordances deserve further regional analysis. Their H3-dominant posteriors favour distinct variants under the fitted single-causal-variant model; they do not demonstrate multiple independent signals. Multiple causal variants can nevertheless produce misleading single-variant colocalization summaries and are an important alternative explanation [33]. Both UKB and FinnGen are broadly European-ancestry outcomes, so ancestry mismatch alone cannot explain the UKB result. Phenotype definition, signal complexity, sample composition and variant coverage remain possible contributors. The reported top SNP is conditional on the shared-variant model and is not necessarily the lead disease-association SNP. Resolving this issue requires allele-aligned, ancestry-appropriate LD and multi-signal colocalization; the present analyses do not provide that validation.</w:t>
       </w:r>
     </w:p>
     <w:p>
@@ -1682,7 +1637,7 @@
         <w:widowControl/>
       </w:pPr>
       <w:r>
-        <w:t xml:space="preserve">The</w:t>
+        <w:t xml:space="preserve">The combined BBJ-plus-FinnGen filter favours evidence that is detectable in both outcomes and may miss valid susceptibility loci. Seven of nine evaluated FinnGen loci had H2-dominant posteriors, consistent with limited outcome evidence relative to expression evidence under this model. However, H2 is not a test proving that marginal disease association is absent.</w:t>
       </w:r>
       <w:r>
         <w:t xml:space="preserve"> </w:t>
@@ -1698,23 +1653,7 @@
         <w:t xml:space="preserve"> </w:t>
       </w:r>
       <w:r>
-        <w:t xml:space="preserve">comparison also helps define what the combined filter can and cannot establish. As a known autoimmune susceptibility locus [25],</w:t>
-      </w:r>
-      <w:r>
-        <w:t xml:space="preserve"> </w:t>
-      </w:r>
-      <w:r>
-        <w:rPr>
-          <w:i/>
-          <w:iCs/>
-        </w:rPr>
-        <w:t xml:space="preserve">CTLA4</w:t>
-      </w:r>
-      <w:r>
-        <w:t xml:space="preserve"> </w:t>
-      </w:r>
-      <w:r>
-        <w:t xml:space="preserve">showed the expected disease-association signal, but its BBJ posterior favoured distinct variants and it did not pass the combined BBJ-plus-FinnGen criterion. This makes it a biologically informative comparator rather than a validating positive control for the full analysis. Among the additional candidates,</w:t>
+        <w:t xml:space="preserve">illustrates a different failure mode: it passed in FinnGen (PP.H4 = 0.978) and failed in BBJ (0.201), where H3 was dominant. Failure of this known autoimmune locus cautions against interpreting filter failure as exclusion of susceptibility, although one comparator cannot quantify the filter’s sensitivity. The criterion is therefore a stringent prioritization rule rather than a validated diagnostic test. Significant associations such as</w:t>
       </w:r>
       <w:r>
         <w:t xml:space="preserve"> </w:t>
@@ -1746,7 +1685,7 @@
         <w:t xml:space="preserve"> </w:t>
       </w:r>
       <w:r>
-        <w:t xml:space="preserve">had strong shared-variant support only in BBJ, whereas the chromosome 16p11.2 genes were consistent with a shared regional signal. These results support separating association discovery from gene-level prioritization. They complement previous MR studies of GD-related molecular traits [9, 10] by showing how an explicit comparison across outcomes can change the interpretation of statistically significant findings.</w:t>
+        <w:t xml:space="preserve">remain relevant to follow-up even when they fail that rule [9, 10].</w:t>
       </w:r>
     </w:p>
     <w:p>
@@ -1780,7 +1719,7 @@
         <w:widowControl/>
       </w:pPr>
       <w:r>
-        <w:t xml:space="preserve">A clinically useful next step is to test whether these susceptibility patterns relate to eye-disease development among patients who already have GD. A direct GD-with-TED versus GD-without-TED comparison would address that question more closely than population controls. Larger, ancestry-matched molecular datasets from relevant cell types could then assess whether blood-derived signals transfer to orbital tissue. The present orbital observations cannot provide that confirmation: four TED samples and one control support descriptive context only, and altered expression in established disease may reflect its consequences as well as its causes. Accordingly, the genetic and tissue components should guide focused follow-up questions rather than be combined into a claim of demonstrated therapeutic mechanism.</w:t>
+        <w:t xml:space="preserve">The clinical question remains why some patients with GD develop eye disease. Established clinical risk factors and disease context discussed in the TED literature [1, 2] cannot be quantified from these summary statistics, and our analysis does not apportion genetic versus non-genetic risk. A direct GD-with-TED versus GD-without-TED comparison is needed to isolate eye-disease susceptibility. Similar effects in two population-control GWAS would not by themselves resolve this issue because the phenotypes and participants can overlap. Larger molecular datasets from relevant cell types could test whether the blood-derived signals transfer to thymus or orbital tissue. The present orbital observations—four TED samples and one control—remain descriptive and cannot establish that transfer or distinguish causes from consequences of established disease.</w:t>
       </w:r>
     </w:p>
     <w:bookmarkStart w:id="21" w:name="limitations"/>
@@ -1799,7 +1738,7 @@
         <w:widowControl/>
       </w:pPr>
       <w:r>
-        <w:t xml:space="preserve">The main limitations concern phenotype definition, exposure relevance and available information. FinnGen compared 858 Graves ophthalmopathy cases with population controls rather than GD patients without eye disease, so its associations may reflect GD susceptibility and cannot isolate a TED-specific effect. UKB hyperthyroidism was broader than GD, making phenotype and ancestry differences partly confounded. The predominantly European blood-expression data may not transfer fully to East Asian discovery participants or orbital cell types because regulation, linkage patterns and variant availability differ. Participant overlap between eQTLGen and the European outcomes could not be quantified. Cohort-frequency substitution addressed one part of exposure reconstruction, but the published frequencies excluded Framingham participants and did not resolve these broader issues. The tissue series had only one control, was not externally replicated and cannot support differential-expression or causal inference.</w:t>
+        <w:t xml:space="preserve">The main limitations concern phenotype definition, exposure relevance and available information. FinnGen compared 858 Graves ophthalmopathy cases with population controls rather than GD patients without eye disease, so its associations may reflect GD susceptibility and cannot isolate a TED-specific effect. UKB hyperthyroidism was broader than GD, making phenotype and ancestry differences partly confounded. The Wald ratio divides the outcome effect by the exposure effect; applying European eQTL weights to BBJ therefore assumes that the relevant expression effects transfer across ancestries. Differences in regulation, linkage patterns and variant availability may violate this assumption, and European blood expression may not represent thymic or orbital regulation. Participant overlap between eQTLGen and the European outcomes could not be quantified. Cohort-frequency substitution addressed one part of exposure reconstruction, but the published frequencies excluded Framingham participants and did not resolve these broader issues. The tissue series had only one control, was not externally replicated and cannot support differential-expression or causal inference.</w:t>
       </w:r>
     </w:p>
     <w:p>
@@ -1856,7 +1795,7 @@
         <w:t xml:space="preserve"> </w:t>
       </w:r>
       <w:r>
-        <w:t xml:space="preserve">in BBJ. Multi-variant colocalization, formal colocalization power and the probability of passing the combined filter were not evaluated. Together with the screen’s limited MR detection range, these constraints leave smaller or otherwise undetected genetic effects unresolved.</w:t>
+        <w:t xml:space="preserve">in BBJ. Multi-variant colocalization, genetic directionality, formal colocalization power and the probability of passing the combined filter were not evaluated. In particular, the UKB TSHR and BBJ CTLA4 discordances remain unresolved by a multi-signal model. Together with the screen’s limited MR detection range, these constraints leave smaller or otherwise undetected genetic effects unresolved.</w:t>
       </w:r>
     </w:p>
     <w:bookmarkEnd w:id="21"/>
@@ -2047,7 +1986,7 @@
         <w:t xml:space="preserve"> </w:t>
       </w:r>
       <w:r>
-        <w:t xml:space="preserve">Instruments, primary MR and colocalization results, and frequency-sensitivity results are supplied as Supplementary Data 1–4. Analysis code is available from the corresponding author on reasonable request. Public summary statistics analyzed in this study are available from their original repositories: blood</w:t>
+        <w:t xml:space="preserve">Instruments, primary MR and colocalization results, and frequency-sensitivity results are supplied as Supplementary Data 1–5. Analysis code is available from the corresponding author on reasonable request. Public summary statistics analyzed in this study are available from their original repositories: blood</w:t>
       </w:r>
       <w:r>
         <w:t xml:space="preserve"> </w:t>
@@ -2422,7 +2361,7 @@
         </w:numPr>
       </w:pPr>
       <w:r>
-        <w:t xml:space="preserve">GTEx Consortium. The GTEx Consortium atlas of genetic regulatory effects across human tissues. Science. 2020;369:1318-1330. doi:10.1126/science.aaz1776.</w:t>
+        <w:t xml:space="preserve">Smith TJ, Kahaly GJ, Ezra DG, Fleming JC, Dailey RA, Tang RA, Harris GJ, Antonelli A, Salvi M, Goldberg RA, et al. Teprotumumab for Thyroid-Associated Ophthalmopathy. N Engl J Med. 2017;376:1748-1761. doi:10.1056/nejmoa1614949.</w:t>
       </w:r>
     </w:p>
     <w:p>
@@ -2434,7 +2373,79 @@
         </w:numPr>
       </w:pPr>
       <w:r>
+        <w:t xml:space="preserve">Douglas RS, Kahaly GJ, Ugradar S, Elflein H, Ponto KA, Fowler BT, Dailey R, Harris GJ, Schiffman J, Tang R, et al. Teprotumumab Efficacy, Safety, and Durability in Longer-Duration Thyroid Eye Disease and Re-treatment: OPTIC-X Study. Ophthalmology. 2022;129:438-449. doi:10.1016/j.ophtha.2021.10.017.</w:t>
+      </w:r>
+    </w:p>
+    <w:p>
+      <w:pPr>
+        <w:widowControl/>
+        <w:numPr>
+          <w:ilvl w:val="0"/>
+          <w:numId w:val="1001"/>
+        </w:numPr>
+      </w:pPr>
+      <w:r>
+        <w:t xml:space="preserve">Douglas RS, Couch S, Wester ST, Fowler BT, Liu CY, Subramanian PS, Tang R, Nguyen QT, Maamari RN, Ugradar S, et al. Efficacy and Safety of Teprotumumab in Patients With Thyroid Eye Disease of Long Duration and Low Disease Activity. J Clin Endocrinol Metab. 2024;109:25-35. doi:10.1210/clinem/dgad637.</w:t>
+      </w:r>
+    </w:p>
+    <w:p>
+      <w:pPr>
+        <w:widowControl/>
+        <w:numPr>
+          <w:ilvl w:val="0"/>
+          <w:numId w:val="1001"/>
+        </w:numPr>
+      </w:pPr>
+      <w:r>
+        <w:t xml:space="preserve">GTEx Consortium. The GTEx Consortium atlas of genetic regulatory effects across human tissues. Science. 2020;369:1318-1330. doi:10.1126/science.aaz1776.</w:t>
+      </w:r>
+    </w:p>
+    <w:p>
+      <w:pPr>
+        <w:widowControl/>
+        <w:numPr>
+          <w:ilvl w:val="0"/>
+          <w:numId w:val="1001"/>
+        </w:numPr>
+      </w:pPr>
+      <w:r>
+        <w:t xml:space="preserve">Colobran R, Armengol Mdel P, Faner R, Gärtner M, Tykocinski LO, Lucas A, Ruiz M, Juan M, Kyewski B, Pujol-Borrell R. Association of an SNP with intrathymic transcription of TSHR and Graves’ disease: a role for defective thymic tolerance. Hum Mol Genet. 2011;20:3415-3423. doi:10.1093/hmg/ddr247.</w:t>
+      </w:r>
+    </w:p>
+    <w:p>
+      <w:pPr>
+        <w:widowControl/>
+        <w:numPr>
+          <w:ilvl w:val="0"/>
+          <w:numId w:val="1001"/>
+        </w:numPr>
+      </w:pPr>
+      <w:r>
+        <w:t xml:space="preserve">Marín-Sánchez A, Álvarez-Sierra D, González O, Lucas-Martin A, Sellés-Sánchez A, Rudilla F, Enrich E, Colobran R, Pujol-Borrell R. Regulation of TSHR Expression in the Thyroid and Thymus May Contribute to TSHR Tolerance Failure in Graves’ Disease Patients via Two Distinct Mechanisms. Front Immunol. 2019;10:1695. doi:10.3389/fimmu.2019.01695.</w:t>
+      </w:r>
+    </w:p>
+    <w:p>
+      <w:pPr>
+        <w:widowControl/>
+        <w:numPr>
+          <w:ilvl w:val="0"/>
+          <w:numId w:val="1001"/>
+        </w:numPr>
+      </w:pPr>
+      <w:r>
         <w:t xml:space="preserve">Nelson MR, Tipney H, Painter JL, Shen J, Nicoletti P, Shen Y, Floratos A, Sham PC, Li MJ, Wang J, et al. The support of human genetic evidence for approved drug indications. Nat Genet. 2015;47:856-860. doi:10.1038/ng.3314.</w:t>
+      </w:r>
+    </w:p>
+    <w:p>
+      <w:pPr>
+        <w:widowControl/>
+        <w:numPr>
+          <w:ilvl w:val="0"/>
+          <w:numId w:val="1001"/>
+        </w:numPr>
+      </w:pPr>
+      <w:r>
+        <w:t xml:space="preserve">Wallace C. A more accurate method for colocalisation analysis allowing for multiple causal variants. PLoS Genet. 2021;17:e1009440. doi:10.1371/journal.pgen.1009440.</w:t>
       </w:r>
     </w:p>
     <w:bookmarkEnd w:id="25"/>
@@ -2561,7 +2572,55 @@
         <w:t xml:space="preserve"> </w:t>
       </w:r>
       <w:r>
-        <w:t xml:space="preserve">values. The OR axis is logarithmic, with a reference line at one. ORs refer to reconstructed genetically proxied blood expression, not treatment effects. All nine comparisons are included. (B) Regional colocalization probabilities under the primary prior, aligned with the same gene–outcome rows. Stacked bars show expression-only support (H2), support for distinct variants (H3), shared-variant support (H4), and residual H0/H1 support. Exact displayed H4 probabilities are given at right. These probabilities are not</w:t>
+        <w:t xml:space="preserve">values. Bold</w:t>
+      </w:r>
+      <w:r>
+        <w:t xml:space="preserve"> </w:t>
+      </w:r>
+      <w:r>
+        <w:rPr>
+          <w:i/>
+          <w:iCs/>
+        </w:rPr>
+        <w:t xml:space="preserve">P</w:t>
+      </w:r>
+      <w:r>
+        <w:t xml:space="preserve"> </w:t>
+      </w:r>
+      <w:r>
+        <w:t xml:space="preserve">values and asterisks (*) indicate nominal</w:t>
+      </w:r>
+      <w:r>
+        <w:t xml:space="preserve"> </w:t>
+      </w:r>
+      <w:r>
+        <w:rPr>
+          <w:i/>
+          <w:iCs/>
+        </w:rPr>
+        <w:t xml:space="preserve">P</w:t>
+      </w:r>
+      <w:r>
+        <w:t xml:space="preserve"> </w:t>
+      </w:r>
+      <w:r>
+        <w:t xml:space="preserve">&lt; 0.05; daggers (†) additionally mark BBJ discovery significance at</w:t>
+      </w:r>
+      <w:r>
+        <w:t xml:space="preserve"> </w:t>
+      </w:r>
+      <w:r>
+        <w:rPr>
+          <w:i/>
+          <w:iCs/>
+        </w:rPr>
+        <w:t xml:space="preserve">P</w:t>
+      </w:r>
+      <w:r>
+        <w:t xml:space="preserve"> </w:t>
+      </w:r>
+      <w:r>
+        <w:t xml:space="preserve">&lt; 0.05/2,544. The OR axis is logarithmic, with a reference line at one. ORs refer to reconstructed genetically proxied blood expression, not treatment effects. All nine comparisons are included. (B) Regional colocalization probabilities under the primary prior, aligned with the same gene–outcome rows. Stacked bars show expression-only support (H2), support for distinct variants (H3), shared-variant support (H4), and residual H0/H1 support. Exact displayed H4 probabilities are given at right. These probabilities are not</w:t>
       </w:r>
       <w:r>
         <w:t xml:space="preserve"> </w:t>
@@ -2596,7 +2655,20 @@
         <w:t xml:space="preserve"> </w:t>
       </w:r>
       <w:r>
-        <w:t xml:space="preserve">(A) Primary-prior PP.H4 values for all nine evaluated genes and three outcomes. Outlined cells meet the ≥0.80 threshold; probabilities below 0.001 are labelled &lt;0.001. A gene passes the combined criterion only when both BBJ and FinnGen meet that threshold; UKB is an additional comparison.</w:t>
+        <w:t xml:space="preserve">(A) Primary-prior PP.H4 values for all nine evaluated genes and three outcomes. Black cell borders indicate strong shared-variant support (PP.H4 ≥ 0.80), not</w:t>
+      </w:r>
+      <w:r>
+        <w:t xml:space="preserve"> </w:t>
+      </w:r>
+      <w:r>
+        <w:rPr>
+          <w:i/>
+          <w:iCs/>
+        </w:rPr>
+        <w:t xml:space="preserve">P</w:t>
+      </w:r>
+      <w:r>
+        <w:t xml:space="preserve">-value significance; probabilities below 0.001 are labelled &lt;0.001. A gene passes the combined criterion only when both BBJ and FinnGen meet that threshold; UKB is an additional comparison.</w:t>
       </w:r>
       <w:r>
         <w:t xml:space="preserve"> </w:t>
@@ -3417,13 +3489,14 @@
         <w:tblLook w:firstColumn="1" w:firstRow="1" w:lastColumn="0" w:lastRow="0" w:noHBand="0" w:noVBand="1" w:val="04A0"/>
       </w:tblPr>
       <w:tblGrid>
-        <w:gridCol w:w="2117"/>
-        <w:gridCol w:w="2117"/>
-        <w:gridCol w:w="2117"/>
-        <w:gridCol w:w="2117"/>
-        <w:gridCol w:w="2117"/>
-        <w:gridCol w:w="2117"/>
-        <w:gridCol w:w="2117"/>
+        <w:gridCol w:w="1092"/>
+        <w:gridCol w:w="3119"/>
+        <w:gridCol w:w="1482"/>
+        <w:gridCol w:w="2262"/>
+        <w:gridCol w:w="1560"/>
+        <w:gridCol w:w="1794"/>
+        <w:gridCol w:w="1794"/>
+        <w:gridCol w:w="1716"/>
       </w:tblGrid>
       <w:tr>
         <w:trPr>
@@ -3432,7 +3505,7 @@
         </w:trPr>
         <w:tc>
           <w:tcPr>
-            <w:tcW w:type="dxa" w:w="2117"/>
+            <w:tcW w:type="dxa" w:w="1092"/>
             <w:vAlign w:val="center"/>
             <w:tcMar>
               <w:top w:w="80" w:type="dxa"/>
@@ -3452,7 +3525,7 @@
               <w:rPr>
                 <w:rFonts w:ascii="Times New Roman" w:hAnsi="Times New Roman"/>
                 <w:b/>
-                <w:sz w:val="20"/>
+                <w:sz w:val="19"/>
               </w:rPr>
               <w:t xml:space="preserve">Gene</w:t>
             </w:r>
@@ -3460,7 +3533,7 @@
         </w:tc>
         <w:tc>
           <w:tcPr>
-            <w:tcW w:type="dxa" w:w="2117"/>
+            <w:tcW w:type="dxa" w:w="3119"/>
             <w:vAlign w:val="center"/>
             <w:tcMar>
               <w:top w:w="80" w:type="dxa"/>
@@ -3480,7 +3553,7 @@
               <w:rPr>
                 <w:rFonts w:ascii="Times New Roman" w:hAnsi="Times New Roman"/>
                 <w:b/>
-                <w:sz w:val="20"/>
+                <w:sz w:val="19"/>
               </w:rPr>
               <w:t xml:space="preserve">Outcome</w:t>
             </w:r>
@@ -3488,7 +3561,7 @@
         </w:tc>
         <w:tc>
           <w:tcPr>
-            <w:tcW w:type="dxa" w:w="2117"/>
+            <w:tcW w:type="dxa" w:w="1482"/>
             <w:vAlign w:val="center"/>
             <w:tcMar>
               <w:top w:w="80" w:type="dxa"/>
@@ -3508,7 +3581,7 @@
               <w:rPr>
                 <w:rFonts w:ascii="Times New Roman" w:hAnsi="Times New Roman"/>
                 <w:b/>
-                <w:sz w:val="20"/>
+                <w:sz w:val="19"/>
               </w:rPr>
               <w:t xml:space="preserve">Instruments</w:t>
             </w:r>
@@ -3516,7 +3589,7 @@
         </w:tc>
         <w:tc>
           <w:tcPr>
-            <w:tcW w:type="dxa" w:w="2117"/>
+            <w:tcW w:type="dxa" w:w="2262"/>
             <w:vAlign w:val="center"/>
             <w:tcMar>
               <w:top w:w="80" w:type="dxa"/>
@@ -3536,7 +3609,7 @@
               <w:rPr>
                 <w:rFonts w:ascii="Times New Roman" w:hAnsi="Times New Roman"/>
                 <w:b/>
-                <w:sz w:val="20"/>
+                <w:sz w:val="19"/>
               </w:rPr>
               <w:t xml:space="preserve">OR (95% CI)</w:t>
             </w:r>
@@ -3544,7 +3617,7 @@
         </w:tc>
         <w:tc>
           <w:tcPr>
-            <w:tcW w:type="dxa" w:w="2117"/>
+            <w:tcW w:type="dxa" w:w="1560"/>
             <w:vAlign w:val="center"/>
             <w:tcMar>
               <w:top w:w="80" w:type="dxa"/>
@@ -3566,7 +3639,7 @@
                 <w:b/>
                 <w:i/>
                 <w:iCs/>
-                <w:sz w:val="20"/>
+                <w:sz w:val="19"/>
               </w:rPr>
               <w:t xml:space="preserve">P</w:t>
             </w:r>
@@ -3574,7 +3647,7 @@
               <w:rPr>
                 <w:rFonts w:ascii="Times New Roman" w:hAnsi="Times New Roman"/>
                 <w:b/>
-                <w:sz w:val="20"/>
+                <w:sz w:val="19"/>
               </w:rPr>
               <w:t xml:space="preserve"> </w:t>
             </w:r>
@@ -3582,7 +3655,7 @@
               <w:rPr>
                 <w:rFonts w:ascii="Times New Roman" w:hAnsi="Times New Roman"/>
                 <w:b/>
-                <w:sz w:val="20"/>
+                <w:sz w:val="19"/>
               </w:rPr>
               <w:t xml:space="preserve">value</w:t>
             </w:r>
@@ -3590,7 +3663,7 @@
         </w:tc>
         <w:tc>
           <w:tcPr>
-            <w:tcW w:type="dxa" w:w="2117"/>
+            <w:tcW w:type="dxa" w:w="1794"/>
             <w:vAlign w:val="center"/>
             <w:tcMar>
               <w:top w:w="80" w:type="dxa"/>
@@ -3610,7 +3683,35 @@
               <w:rPr>
                 <w:rFonts w:ascii="Times New Roman" w:hAnsi="Times New Roman"/>
                 <w:b/>
-                <w:sz w:val="20"/>
+                <w:sz w:val="19"/>
+              </w:rPr>
+              <w:t xml:space="preserve">Expression only (PP.H2)</w:t>
+            </w:r>
+          </w:p>
+        </w:tc>
+        <w:tc>
+          <w:tcPr>
+            <w:tcW w:type="dxa" w:w="1794"/>
+            <w:vAlign w:val="center"/>
+            <w:tcMar>
+              <w:top w:w="80" w:type="dxa"/>
+              <w:bottom w:w="80" w:type="dxa"/>
+              <w:left w:w="80" w:type="dxa"/>
+              <w:right w:w="80" w:type="dxa"/>
+            </w:tcMar>
+            <w:shd w:fill="EEEEEE"/>
+          </w:tcPr>
+          <w:p>
+            <w:pPr>
+              <w:keepNext w:val="0"/>
+              <w:spacing w:line="252" w:lineRule="auto" w:before="0" w:after="0"/>
+              <w:jc w:val="center"/>
+            </w:pPr>
+            <w:r>
+              <w:rPr>
+                <w:rFonts w:ascii="Times New Roman" w:hAnsi="Times New Roman"/>
+                <w:b/>
+                <w:sz w:val="19"/>
               </w:rPr>
               <w:t xml:space="preserve">Distinct variants (PP.H3)</w:t>
             </w:r>
@@ -3618,7 +3719,7 @@
         </w:tc>
         <w:tc>
           <w:tcPr>
-            <w:tcW w:type="dxa" w:w="2117"/>
+            <w:tcW w:type="dxa" w:w="1716"/>
             <w:vAlign w:val="center"/>
             <w:tcMar>
               <w:top w:w="80" w:type="dxa"/>
@@ -3638,7 +3739,7 @@
               <w:rPr>
                 <w:rFonts w:ascii="Times New Roman" w:hAnsi="Times New Roman"/>
                 <w:b/>
-                <w:sz w:val="20"/>
+                <w:sz w:val="19"/>
               </w:rPr>
               <w:t xml:space="preserve">Shared variant (PP.H4)</w:t>
             </w:r>
@@ -3651,7 +3752,7 @@
         </w:trPr>
         <w:tc>
           <w:tcPr>
-            <w:tcW w:type="dxa" w:w="2117"/>
+            <w:tcW w:type="dxa" w:w="1092"/>
             <w:vAlign w:val="center"/>
             <w:tcMar>
               <w:top w:w="80" w:type="dxa"/>
@@ -3671,7 +3772,7 @@
                 <w:rFonts w:ascii="Times New Roman" w:hAnsi="Times New Roman"/>
                 <w:i/>
                 <w:iCs/>
-                <w:sz w:val="20"/>
+                <w:sz w:val="19"/>
               </w:rPr>
               <w:t xml:space="preserve">TSHR</w:t>
             </w:r>
@@ -3679,7 +3780,7 @@
         </w:tc>
         <w:tc>
           <w:tcPr>
-            <w:tcW w:type="dxa" w:w="2117"/>
+            <w:tcW w:type="dxa" w:w="3119"/>
             <w:vAlign w:val="center"/>
             <w:tcMar>
               <w:top w:w="80" w:type="dxa"/>
@@ -3697,7 +3798,7 @@
             <w:r>
               <w:rPr>
                 <w:rFonts w:ascii="Times New Roman" w:hAnsi="Times New Roman"/>
-                <w:sz w:val="20"/>
+                <w:sz w:val="19"/>
               </w:rPr>
               <w:t xml:space="preserve">BBJ Graves disease</w:t>
             </w:r>
@@ -3705,25 +3806,25 @@
         </w:tc>
         <w:tc>
           <w:tcPr>
-            <w:tcW w:type="dxa" w:w="2117"/>
-            <w:vAlign w:val="center"/>
-            <w:tcMar>
-              <w:top w:w="80" w:type="dxa"/>
-              <w:bottom w:w="80" w:type="dxa"/>
-              <w:left w:w="80" w:type="dxa"/>
-              <w:right w:w="80" w:type="dxa"/>
-            </w:tcMar>
-          </w:tcPr>
-          <w:p>
-            <w:pPr>
-              <w:keepNext w:val="0"/>
-              <w:spacing w:line="252" w:lineRule="auto" w:before="0" w:after="0"/>
-              <w:jc w:val="center"/>
-            </w:pPr>
-            <w:r>
-              <w:rPr>
-                <w:rFonts w:ascii="Times New Roman" w:hAnsi="Times New Roman"/>
-                <w:sz w:val="20"/>
+            <w:tcW w:type="dxa" w:w="1482"/>
+            <w:vAlign w:val="center"/>
+            <w:tcMar>
+              <w:top w:w="80" w:type="dxa"/>
+              <w:bottom w:w="80" w:type="dxa"/>
+              <w:left w:w="80" w:type="dxa"/>
+              <w:right w:w="80" w:type="dxa"/>
+            </w:tcMar>
+          </w:tcPr>
+          <w:p>
+            <w:pPr>
+              <w:keepNext w:val="0"/>
+              <w:spacing w:line="252" w:lineRule="auto" w:before="0" w:after="0"/>
+              <w:jc w:val="center"/>
+            </w:pPr>
+            <w:r>
+              <w:rPr>
+                <w:rFonts w:ascii="Times New Roman" w:hAnsi="Times New Roman"/>
+                <w:sz w:val="19"/>
               </w:rPr>
               <w:t xml:space="preserve">1</w:t>
             </w:r>
@@ -3731,25 +3832,25 @@
         </w:tc>
         <w:tc>
           <w:tcPr>
-            <w:tcW w:type="dxa" w:w="2117"/>
-            <w:vAlign w:val="center"/>
-            <w:tcMar>
-              <w:top w:w="80" w:type="dxa"/>
-              <w:bottom w:w="80" w:type="dxa"/>
-              <w:left w:w="80" w:type="dxa"/>
-              <w:right w:w="80" w:type="dxa"/>
-            </w:tcMar>
-          </w:tcPr>
-          <w:p>
-            <w:pPr>
-              <w:keepNext w:val="0"/>
-              <w:spacing w:line="252" w:lineRule="auto" w:before="0" w:after="0"/>
-              <w:jc w:val="center"/>
-            </w:pPr>
-            <w:r>
-              <w:rPr>
-                <w:rFonts w:ascii="Times New Roman" w:hAnsi="Times New Roman"/>
-                <w:sz w:val="20"/>
+            <w:tcW w:type="dxa" w:w="2262"/>
+            <w:vAlign w:val="center"/>
+            <w:tcMar>
+              <w:top w:w="80" w:type="dxa"/>
+              <w:bottom w:w="80" w:type="dxa"/>
+              <w:left w:w="80" w:type="dxa"/>
+              <w:right w:w="80" w:type="dxa"/>
+            </w:tcMar>
+          </w:tcPr>
+          <w:p>
+            <w:pPr>
+              <w:keepNext w:val="0"/>
+              <w:spacing w:line="252" w:lineRule="auto" w:before="0" w:after="0"/>
+              <w:jc w:val="center"/>
+            </w:pPr>
+            <w:r>
+              <w:rPr>
+                <w:rFonts w:ascii="Times New Roman" w:hAnsi="Times New Roman"/>
+                <w:sz w:val="19"/>
               </w:rPr>
               <w:t xml:space="preserve">0.12 (0.07–0.21)</w:t>
             </w:r>
@@ -3757,7 +3858,7 @@
         </w:tc>
         <w:tc>
           <w:tcPr>
-            <w:tcW w:type="dxa" w:w="2117"/>
+            <w:tcW w:type="dxa" w:w="1560"/>
             <w:vAlign w:val="center"/>
             <w:tcMar>
               <w:top w:w="80" w:type="dxa"/>
@@ -3776,7 +3877,7 @@
               <w:rPr>
                 <w:rFonts w:ascii="Times New Roman" w:hAnsi="Times New Roman"/>
                 <w:b/>
-                <w:sz w:val="20"/>
+                <w:sz w:val="19"/>
               </w:rPr>
               <w:t xml:space="preserve">1.09×10⁻¹⁴</w:t>
             </w:r>
@@ -3784,25 +3885,51 @@
         </w:tc>
         <w:tc>
           <w:tcPr>
-            <w:tcW w:type="dxa" w:w="2117"/>
-            <w:vAlign w:val="center"/>
-            <w:tcMar>
-              <w:top w:w="80" w:type="dxa"/>
-              <w:bottom w:w="80" w:type="dxa"/>
-              <w:left w:w="80" w:type="dxa"/>
-              <w:right w:w="80" w:type="dxa"/>
-            </w:tcMar>
-          </w:tcPr>
-          <w:p>
-            <w:pPr>
-              <w:keepNext w:val="0"/>
-              <w:spacing w:line="252" w:lineRule="auto" w:before="0" w:after="0"/>
-              <w:jc w:val="center"/>
-            </w:pPr>
-            <w:r>
-              <w:rPr>
-                <w:rFonts w:ascii="Times New Roman" w:hAnsi="Times New Roman"/>
-                <w:sz w:val="20"/>
+            <w:tcW w:type="dxa" w:w="1794"/>
+            <w:vAlign w:val="center"/>
+            <w:tcMar>
+              <w:top w:w="80" w:type="dxa"/>
+              <w:bottom w:w="80" w:type="dxa"/>
+              <w:left w:w="80" w:type="dxa"/>
+              <w:right w:w="80" w:type="dxa"/>
+            </w:tcMar>
+          </w:tcPr>
+          <w:p>
+            <w:pPr>
+              <w:keepNext w:val="0"/>
+              <w:spacing w:line="252" w:lineRule="auto" w:before="0" w:after="0"/>
+              <w:jc w:val="center"/>
+            </w:pPr>
+            <w:r>
+              <w:rPr>
+                <w:rFonts w:ascii="Times New Roman" w:hAnsi="Times New Roman"/>
+                <w:sz w:val="19"/>
+              </w:rPr>
+              <w:t xml:space="preserve">&lt;0.001</w:t>
+            </w:r>
+          </w:p>
+        </w:tc>
+        <w:tc>
+          <w:tcPr>
+            <w:tcW w:type="dxa" w:w="1794"/>
+            <w:vAlign w:val="center"/>
+            <w:tcMar>
+              <w:top w:w="80" w:type="dxa"/>
+              <w:bottom w:w="80" w:type="dxa"/>
+              <w:left w:w="80" w:type="dxa"/>
+              <w:right w:w="80" w:type="dxa"/>
+            </w:tcMar>
+          </w:tcPr>
+          <w:p>
+            <w:pPr>
+              <w:keepNext w:val="0"/>
+              <w:spacing w:line="252" w:lineRule="auto" w:before="0" w:after="0"/>
+              <w:jc w:val="center"/>
+            </w:pPr>
+            <w:r>
+              <w:rPr>
+                <w:rFonts w:ascii="Times New Roman" w:hAnsi="Times New Roman"/>
+                <w:sz w:val="19"/>
               </w:rPr>
               <w:t xml:space="preserve">0.049</w:t>
             </w:r>
@@ -3810,25 +3937,25 @@
         </w:tc>
         <w:tc>
           <w:tcPr>
-            <w:tcW w:type="dxa" w:w="2117"/>
-            <w:vAlign w:val="center"/>
-            <w:tcMar>
-              <w:top w:w="80" w:type="dxa"/>
-              <w:bottom w:w="80" w:type="dxa"/>
-              <w:left w:w="80" w:type="dxa"/>
-              <w:right w:w="80" w:type="dxa"/>
-            </w:tcMar>
-          </w:tcPr>
-          <w:p>
-            <w:pPr>
-              <w:keepNext w:val="0"/>
-              <w:spacing w:line="252" w:lineRule="auto" w:before="0" w:after="0"/>
-              <w:jc w:val="center"/>
-            </w:pPr>
-            <w:r>
-              <w:rPr>
-                <w:rFonts w:ascii="Times New Roman" w:hAnsi="Times New Roman"/>
-                <w:sz w:val="20"/>
+            <w:tcW w:type="dxa" w:w="1716"/>
+            <w:vAlign w:val="center"/>
+            <w:tcMar>
+              <w:top w:w="80" w:type="dxa"/>
+              <w:bottom w:w="80" w:type="dxa"/>
+              <w:left w:w="80" w:type="dxa"/>
+              <w:right w:w="80" w:type="dxa"/>
+            </w:tcMar>
+          </w:tcPr>
+          <w:p>
+            <w:pPr>
+              <w:keepNext w:val="0"/>
+              <w:spacing w:line="252" w:lineRule="auto" w:before="0" w:after="0"/>
+              <w:jc w:val="center"/>
+            </w:pPr>
+            <w:r>
+              <w:rPr>
+                <w:rFonts w:ascii="Times New Roman" w:hAnsi="Times New Roman"/>
+                <w:sz w:val="19"/>
               </w:rPr>
               <w:t xml:space="preserve">0.951</w:t>
             </w:r>
@@ -3841,7 +3968,7 @@
         </w:trPr>
         <w:tc>
           <w:tcPr>
-            <w:tcW w:type="dxa" w:w="2117"/>
+            <w:tcW w:type="dxa" w:w="1092"/>
             <w:vAlign w:val="center"/>
             <w:tcMar>
               <w:top w:w="80" w:type="dxa"/>
@@ -3861,7 +3988,7 @@
                 <w:rFonts w:ascii="Times New Roman" w:hAnsi="Times New Roman"/>
                 <w:i/>
                 <w:iCs/>
-                <w:sz w:val="20"/>
+                <w:sz w:val="19"/>
               </w:rPr>
               <w:t xml:space="preserve">TSHR</w:t>
             </w:r>
@@ -3869,7 +3996,7 @@
         </w:tc>
         <w:tc>
           <w:tcPr>
-            <w:tcW w:type="dxa" w:w="2117"/>
+            <w:tcW w:type="dxa" w:w="3119"/>
             <w:vAlign w:val="center"/>
             <w:tcMar>
               <w:top w:w="80" w:type="dxa"/>
@@ -3887,7 +4014,7 @@
             <w:r>
               <w:rPr>
                 <w:rFonts w:ascii="Times New Roman" w:hAnsi="Times New Roman"/>
-                <w:sz w:val="20"/>
+                <w:sz w:val="19"/>
               </w:rPr>
               <w:t xml:space="preserve">UKB hyperthyroidism</w:t>
             </w:r>
@@ -3895,25 +4022,25 @@
         </w:tc>
         <w:tc>
           <w:tcPr>
-            <w:tcW w:type="dxa" w:w="2117"/>
-            <w:vAlign w:val="center"/>
-            <w:tcMar>
-              <w:top w:w="80" w:type="dxa"/>
-              <w:bottom w:w="80" w:type="dxa"/>
-              <w:left w:w="80" w:type="dxa"/>
-              <w:right w:w="80" w:type="dxa"/>
-            </w:tcMar>
-          </w:tcPr>
-          <w:p>
-            <w:pPr>
-              <w:keepNext w:val="0"/>
-              <w:spacing w:line="252" w:lineRule="auto" w:before="0" w:after="0"/>
-              <w:jc w:val="center"/>
-            </w:pPr>
-            <w:r>
-              <w:rPr>
-                <w:rFonts w:ascii="Times New Roman" w:hAnsi="Times New Roman"/>
-                <w:sz w:val="20"/>
+            <w:tcW w:type="dxa" w:w="1482"/>
+            <w:vAlign w:val="center"/>
+            <w:tcMar>
+              <w:top w:w="80" w:type="dxa"/>
+              <w:bottom w:w="80" w:type="dxa"/>
+              <w:left w:w="80" w:type="dxa"/>
+              <w:right w:w="80" w:type="dxa"/>
+            </w:tcMar>
+          </w:tcPr>
+          <w:p>
+            <w:pPr>
+              <w:keepNext w:val="0"/>
+              <w:spacing w:line="252" w:lineRule="auto" w:before="0" w:after="0"/>
+              <w:jc w:val="center"/>
+            </w:pPr>
+            <w:r>
+              <w:rPr>
+                <w:rFonts w:ascii="Times New Roman" w:hAnsi="Times New Roman"/>
+                <w:sz w:val="19"/>
               </w:rPr>
               <w:t xml:space="preserve">1</w:t>
             </w:r>
@@ -3921,25 +4048,25 @@
         </w:tc>
         <w:tc>
           <w:tcPr>
-            <w:tcW w:type="dxa" w:w="2117"/>
-            <w:vAlign w:val="center"/>
-            <w:tcMar>
-              <w:top w:w="80" w:type="dxa"/>
-              <w:bottom w:w="80" w:type="dxa"/>
-              <w:left w:w="80" w:type="dxa"/>
-              <w:right w:w="80" w:type="dxa"/>
-            </w:tcMar>
-          </w:tcPr>
-          <w:p>
-            <w:pPr>
-              <w:keepNext w:val="0"/>
-              <w:spacing w:line="252" w:lineRule="auto" w:before="0" w:after="0"/>
-              <w:jc w:val="center"/>
-            </w:pPr>
-            <w:r>
-              <w:rPr>
-                <w:rFonts w:ascii="Times New Roman" w:hAnsi="Times New Roman"/>
-                <w:sz w:val="20"/>
+            <w:tcW w:type="dxa" w:w="2262"/>
+            <w:vAlign w:val="center"/>
+            <w:tcMar>
+              <w:top w:w="80" w:type="dxa"/>
+              <w:bottom w:w="80" w:type="dxa"/>
+              <w:left w:w="80" w:type="dxa"/>
+              <w:right w:w="80" w:type="dxa"/>
+            </w:tcMar>
+          </w:tcPr>
+          <w:p>
+            <w:pPr>
+              <w:keepNext w:val="0"/>
+              <w:spacing w:line="252" w:lineRule="auto" w:before="0" w:after="0"/>
+              <w:jc w:val="center"/>
+            </w:pPr>
+            <w:r>
+              <w:rPr>
+                <w:rFonts w:ascii="Times New Roman" w:hAnsi="Times New Roman"/>
+                <w:sz w:val="19"/>
               </w:rPr>
               <w:t xml:space="preserve">0.09 (0.06–0.14)</w:t>
             </w:r>
@@ -3947,7 +4074,7 @@
         </w:tc>
         <w:tc>
           <w:tcPr>
-            <w:tcW w:type="dxa" w:w="2117"/>
+            <w:tcW w:type="dxa" w:w="1560"/>
             <w:vAlign w:val="center"/>
             <w:tcMar>
               <w:top w:w="80" w:type="dxa"/>
@@ -3966,7 +4093,7 @@
               <w:rPr>
                 <w:rFonts w:ascii="Times New Roman" w:hAnsi="Times New Roman"/>
                 <w:b/>
-                <w:sz w:val="20"/>
+                <w:sz w:val="19"/>
               </w:rPr>
               <w:t xml:space="preserve">8.77×10⁻²⁸</w:t>
             </w:r>
@@ -3974,25 +4101,51 @@
         </w:tc>
         <w:tc>
           <w:tcPr>
-            <w:tcW w:type="dxa" w:w="2117"/>
-            <w:vAlign w:val="center"/>
-            <w:tcMar>
-              <w:top w:w="80" w:type="dxa"/>
-              <w:bottom w:w="80" w:type="dxa"/>
-              <w:left w:w="80" w:type="dxa"/>
-              <w:right w:w="80" w:type="dxa"/>
-            </w:tcMar>
-          </w:tcPr>
-          <w:p>
-            <w:pPr>
-              <w:keepNext w:val="0"/>
-              <w:spacing w:line="252" w:lineRule="auto" w:before="0" w:after="0"/>
-              <w:jc w:val="center"/>
-            </w:pPr>
-            <w:r>
-              <w:rPr>
-                <w:rFonts w:ascii="Times New Roman" w:hAnsi="Times New Roman"/>
-                <w:sz w:val="20"/>
+            <w:tcW w:type="dxa" w:w="1794"/>
+            <w:vAlign w:val="center"/>
+            <w:tcMar>
+              <w:top w:w="80" w:type="dxa"/>
+              <w:bottom w:w="80" w:type="dxa"/>
+              <w:left w:w="80" w:type="dxa"/>
+              <w:right w:w="80" w:type="dxa"/>
+            </w:tcMar>
+          </w:tcPr>
+          <w:p>
+            <w:pPr>
+              <w:keepNext w:val="0"/>
+              <w:spacing w:line="252" w:lineRule="auto" w:before="0" w:after="0"/>
+              <w:jc w:val="center"/>
+            </w:pPr>
+            <w:r>
+              <w:rPr>
+                <w:rFonts w:ascii="Times New Roman" w:hAnsi="Times New Roman"/>
+                <w:sz w:val="19"/>
+              </w:rPr>
+              <w:t xml:space="preserve">&lt;0.001</w:t>
+            </w:r>
+          </w:p>
+        </w:tc>
+        <w:tc>
+          <w:tcPr>
+            <w:tcW w:type="dxa" w:w="1794"/>
+            <w:vAlign w:val="center"/>
+            <w:tcMar>
+              <w:top w:w="80" w:type="dxa"/>
+              <w:bottom w:w="80" w:type="dxa"/>
+              <w:left w:w="80" w:type="dxa"/>
+              <w:right w:w="80" w:type="dxa"/>
+            </w:tcMar>
+          </w:tcPr>
+          <w:p>
+            <w:pPr>
+              <w:keepNext w:val="0"/>
+              <w:spacing w:line="252" w:lineRule="auto" w:before="0" w:after="0"/>
+              <w:jc w:val="center"/>
+            </w:pPr>
+            <w:r>
+              <w:rPr>
+                <w:rFonts w:ascii="Times New Roman" w:hAnsi="Times New Roman"/>
+                <w:sz w:val="19"/>
               </w:rPr>
               <w:t xml:space="preserve">0.774</w:t>
             </w:r>
@@ -4000,25 +4153,25 @@
         </w:tc>
         <w:tc>
           <w:tcPr>
-            <w:tcW w:type="dxa" w:w="2117"/>
-            <w:vAlign w:val="center"/>
-            <w:tcMar>
-              <w:top w:w="80" w:type="dxa"/>
-              <w:bottom w:w="80" w:type="dxa"/>
-              <w:left w:w="80" w:type="dxa"/>
-              <w:right w:w="80" w:type="dxa"/>
-            </w:tcMar>
-          </w:tcPr>
-          <w:p>
-            <w:pPr>
-              <w:keepNext w:val="0"/>
-              <w:spacing w:line="252" w:lineRule="auto" w:before="0" w:after="0"/>
-              <w:jc w:val="center"/>
-            </w:pPr>
-            <w:r>
-              <w:rPr>
-                <w:rFonts w:ascii="Times New Roman" w:hAnsi="Times New Roman"/>
-                <w:sz w:val="20"/>
+            <w:tcW w:type="dxa" w:w="1716"/>
+            <w:vAlign w:val="center"/>
+            <w:tcMar>
+              <w:top w:w="80" w:type="dxa"/>
+              <w:bottom w:w="80" w:type="dxa"/>
+              <w:left w:w="80" w:type="dxa"/>
+              <w:right w:w="80" w:type="dxa"/>
+            </w:tcMar>
+          </w:tcPr>
+          <w:p>
+            <w:pPr>
+              <w:keepNext w:val="0"/>
+              <w:spacing w:line="252" w:lineRule="auto" w:before="0" w:after="0"/>
+              <w:jc w:val="center"/>
+            </w:pPr>
+            <w:r>
+              <w:rPr>
+                <w:rFonts w:ascii="Times New Roman" w:hAnsi="Times New Roman"/>
+                <w:sz w:val="19"/>
               </w:rPr>
               <w:t xml:space="preserve">0.226</w:t>
             </w:r>
@@ -4031,7 +4184,7 @@
         </w:trPr>
         <w:tc>
           <w:tcPr>
-            <w:tcW w:type="dxa" w:w="2117"/>
+            <w:tcW w:type="dxa" w:w="1092"/>
             <w:vAlign w:val="center"/>
             <w:tcMar>
               <w:top w:w="80" w:type="dxa"/>
@@ -4051,7 +4204,7 @@
                 <w:rFonts w:ascii="Times New Roman" w:hAnsi="Times New Roman"/>
                 <w:i/>
                 <w:iCs/>
-                <w:sz w:val="20"/>
+                <w:sz w:val="19"/>
               </w:rPr>
               <w:t xml:space="preserve">TSHR</w:t>
             </w:r>
@@ -4059,7 +4212,7 @@
         </w:tc>
         <w:tc>
           <w:tcPr>
-            <w:tcW w:type="dxa" w:w="2117"/>
+            <w:tcW w:type="dxa" w:w="3119"/>
             <w:vAlign w:val="center"/>
             <w:tcMar>
               <w:top w:w="80" w:type="dxa"/>
@@ -4077,7 +4230,7 @@
             <w:r>
               <w:rPr>
                 <w:rFonts w:ascii="Times New Roman" w:hAnsi="Times New Roman"/>
-                <w:sz w:val="20"/>
+                <w:sz w:val="19"/>
               </w:rPr>
               <w:t xml:space="preserve">FinnGen Graves ophthalmopathy</w:t>
             </w:r>
@@ -4085,25 +4238,25 @@
         </w:tc>
         <w:tc>
           <w:tcPr>
-            <w:tcW w:type="dxa" w:w="2117"/>
-            <w:vAlign w:val="center"/>
-            <w:tcMar>
-              <w:top w:w="80" w:type="dxa"/>
-              <w:bottom w:w="80" w:type="dxa"/>
-              <w:left w:w="80" w:type="dxa"/>
-              <w:right w:w="80" w:type="dxa"/>
-            </w:tcMar>
-          </w:tcPr>
-          <w:p>
-            <w:pPr>
-              <w:keepNext w:val="0"/>
-              <w:spacing w:line="252" w:lineRule="auto" w:before="0" w:after="0"/>
-              <w:jc w:val="center"/>
-            </w:pPr>
-            <w:r>
-              <w:rPr>
-                <w:rFonts w:ascii="Times New Roman" w:hAnsi="Times New Roman"/>
-                <w:sz w:val="20"/>
+            <w:tcW w:type="dxa" w:w="1482"/>
+            <w:vAlign w:val="center"/>
+            <w:tcMar>
+              <w:top w:w="80" w:type="dxa"/>
+              <w:bottom w:w="80" w:type="dxa"/>
+              <w:left w:w="80" w:type="dxa"/>
+              <w:right w:w="80" w:type="dxa"/>
+            </w:tcMar>
+          </w:tcPr>
+          <w:p>
+            <w:pPr>
+              <w:keepNext w:val="0"/>
+              <w:spacing w:line="252" w:lineRule="auto" w:before="0" w:after="0"/>
+              <w:jc w:val="center"/>
+            </w:pPr>
+            <w:r>
+              <w:rPr>
+                <w:rFonts w:ascii="Times New Roman" w:hAnsi="Times New Roman"/>
+                <w:sz w:val="19"/>
               </w:rPr>
               <w:t xml:space="preserve">1</w:t>
             </w:r>
@@ -4111,25 +4264,25 @@
         </w:tc>
         <w:tc>
           <w:tcPr>
-            <w:tcW w:type="dxa" w:w="2117"/>
-            <w:vAlign w:val="center"/>
-            <w:tcMar>
-              <w:top w:w="80" w:type="dxa"/>
-              <w:bottom w:w="80" w:type="dxa"/>
-              <w:left w:w="80" w:type="dxa"/>
-              <w:right w:w="80" w:type="dxa"/>
-            </w:tcMar>
-          </w:tcPr>
-          <w:p>
-            <w:pPr>
-              <w:keepNext w:val="0"/>
-              <w:spacing w:line="252" w:lineRule="auto" w:before="0" w:after="0"/>
-              <w:jc w:val="center"/>
-            </w:pPr>
-            <w:r>
-              <w:rPr>
-                <w:rFonts w:ascii="Times New Roman" w:hAnsi="Times New Roman"/>
-                <w:sz w:val="20"/>
+            <w:tcW w:type="dxa" w:w="2262"/>
+            <w:vAlign w:val="center"/>
+            <w:tcMar>
+              <w:top w:w="80" w:type="dxa"/>
+              <w:bottom w:w="80" w:type="dxa"/>
+              <w:left w:w="80" w:type="dxa"/>
+              <w:right w:w="80" w:type="dxa"/>
+            </w:tcMar>
+          </w:tcPr>
+          <w:p>
+            <w:pPr>
+              <w:keepNext w:val="0"/>
+              <w:spacing w:line="252" w:lineRule="auto" w:before="0" w:after="0"/>
+              <w:jc w:val="center"/>
+            </w:pPr>
+            <w:r>
+              <w:rPr>
+                <w:rFonts w:ascii="Times New Roman" w:hAnsi="Times New Roman"/>
+                <w:sz w:val="19"/>
               </w:rPr>
               <w:t xml:space="preserve">0.10 (0.04–0.24)</w:t>
             </w:r>
@@ -4137,7 +4290,7 @@
         </w:tc>
         <w:tc>
           <w:tcPr>
-            <w:tcW w:type="dxa" w:w="2117"/>
+            <w:tcW w:type="dxa" w:w="1560"/>
             <w:vAlign w:val="center"/>
             <w:tcMar>
               <w:top w:w="80" w:type="dxa"/>
@@ -4156,7 +4309,7 @@
               <w:rPr>
                 <w:rFonts w:ascii="Times New Roman" w:hAnsi="Times New Roman"/>
                 <w:b/>
-                <w:sz w:val="20"/>
+                <w:sz w:val="19"/>
               </w:rPr>
               <w:t xml:space="preserve">2.82×10⁻⁷</w:t>
             </w:r>
@@ -4164,25 +4317,51 @@
         </w:tc>
         <w:tc>
           <w:tcPr>
-            <w:tcW w:type="dxa" w:w="2117"/>
-            <w:vAlign w:val="center"/>
-            <w:tcMar>
-              <w:top w:w="80" w:type="dxa"/>
-              <w:bottom w:w="80" w:type="dxa"/>
-              <w:left w:w="80" w:type="dxa"/>
-              <w:right w:w="80" w:type="dxa"/>
-            </w:tcMar>
-          </w:tcPr>
-          <w:p>
-            <w:pPr>
-              <w:keepNext w:val="0"/>
-              <w:spacing w:line="252" w:lineRule="auto" w:before="0" w:after="0"/>
-              <w:jc w:val="center"/>
-            </w:pPr>
-            <w:r>
-              <w:rPr>
-                <w:rFonts w:ascii="Times New Roman" w:hAnsi="Times New Roman"/>
-                <w:sz w:val="20"/>
+            <w:tcW w:type="dxa" w:w="1794"/>
+            <w:vAlign w:val="center"/>
+            <w:tcMar>
+              <w:top w:w="80" w:type="dxa"/>
+              <w:bottom w:w="80" w:type="dxa"/>
+              <w:left w:w="80" w:type="dxa"/>
+              <w:right w:w="80" w:type="dxa"/>
+            </w:tcMar>
+          </w:tcPr>
+          <w:p>
+            <w:pPr>
+              <w:keepNext w:val="0"/>
+              <w:spacing w:line="252" w:lineRule="auto" w:before="0" w:after="0"/>
+              <w:jc w:val="center"/>
+            </w:pPr>
+            <w:r>
+              <w:rPr>
+                <w:rFonts w:ascii="Times New Roman" w:hAnsi="Times New Roman"/>
+                <w:sz w:val="19"/>
+              </w:rPr>
+              <w:t xml:space="preserve">&lt;0.001</w:t>
+            </w:r>
+          </w:p>
+        </w:tc>
+        <w:tc>
+          <w:tcPr>
+            <w:tcW w:type="dxa" w:w="1794"/>
+            <w:vAlign w:val="center"/>
+            <w:tcMar>
+              <w:top w:w="80" w:type="dxa"/>
+              <w:bottom w:w="80" w:type="dxa"/>
+              <w:left w:w="80" w:type="dxa"/>
+              <w:right w:w="80" w:type="dxa"/>
+            </w:tcMar>
+          </w:tcPr>
+          <w:p>
+            <w:pPr>
+              <w:keepNext w:val="0"/>
+              <w:spacing w:line="252" w:lineRule="auto" w:before="0" w:after="0"/>
+              <w:jc w:val="center"/>
+            </w:pPr>
+            <w:r>
+              <w:rPr>
+                <w:rFonts w:ascii="Times New Roman" w:hAnsi="Times New Roman"/>
+                <w:sz w:val="19"/>
               </w:rPr>
               <w:t xml:space="preserve">0.014</w:t>
             </w:r>
@@ -4190,25 +4369,25 @@
         </w:tc>
         <w:tc>
           <w:tcPr>
-            <w:tcW w:type="dxa" w:w="2117"/>
-            <w:vAlign w:val="center"/>
-            <w:tcMar>
-              <w:top w:w="80" w:type="dxa"/>
-              <w:bottom w:w="80" w:type="dxa"/>
-              <w:left w:w="80" w:type="dxa"/>
-              <w:right w:w="80" w:type="dxa"/>
-            </w:tcMar>
-          </w:tcPr>
-          <w:p>
-            <w:pPr>
-              <w:keepNext w:val="0"/>
-              <w:spacing w:line="252" w:lineRule="auto" w:before="0" w:after="0"/>
-              <w:jc w:val="center"/>
-            </w:pPr>
-            <w:r>
-              <w:rPr>
-                <w:rFonts w:ascii="Times New Roman" w:hAnsi="Times New Roman"/>
-                <w:sz w:val="20"/>
+            <w:tcW w:type="dxa" w:w="1716"/>
+            <w:vAlign w:val="center"/>
+            <w:tcMar>
+              <w:top w:w="80" w:type="dxa"/>
+              <w:bottom w:w="80" w:type="dxa"/>
+              <w:left w:w="80" w:type="dxa"/>
+              <w:right w:w="80" w:type="dxa"/>
+            </w:tcMar>
+          </w:tcPr>
+          <w:p>
+            <w:pPr>
+              <w:keepNext w:val="0"/>
+              <w:spacing w:line="252" w:lineRule="auto" w:before="0" w:after="0"/>
+              <w:jc w:val="center"/>
+            </w:pPr>
+            <w:r>
+              <w:rPr>
+                <w:rFonts w:ascii="Times New Roman" w:hAnsi="Times New Roman"/>
+                <w:sz w:val="19"/>
               </w:rPr>
               <w:t xml:space="preserve">0.986</w:t>
             </w:r>
@@ -4221,7 +4400,7 @@
         </w:trPr>
         <w:tc>
           <w:tcPr>
-            <w:tcW w:type="dxa" w:w="2117"/>
+            <w:tcW w:type="dxa" w:w="1092"/>
             <w:vAlign w:val="center"/>
             <w:tcMar>
               <w:top w:w="80" w:type="dxa"/>
@@ -4241,7 +4420,7 @@
                 <w:rFonts w:ascii="Times New Roman" w:hAnsi="Times New Roman"/>
                 <w:i/>
                 <w:iCs/>
-                <w:sz w:val="20"/>
+                <w:sz w:val="19"/>
               </w:rPr>
               <w:t xml:space="preserve">IGF1R</w:t>
             </w:r>
@@ -4249,7 +4428,7 @@
         </w:tc>
         <w:tc>
           <w:tcPr>
-            <w:tcW w:type="dxa" w:w="2117"/>
+            <w:tcW w:type="dxa" w:w="3119"/>
             <w:vAlign w:val="center"/>
             <w:tcMar>
               <w:top w:w="80" w:type="dxa"/>
@@ -4267,7 +4446,7 @@
             <w:r>
               <w:rPr>
                 <w:rFonts w:ascii="Times New Roman" w:hAnsi="Times New Roman"/>
-                <w:sz w:val="20"/>
+                <w:sz w:val="19"/>
               </w:rPr>
               <w:t xml:space="preserve">BBJ Graves disease</w:t>
             </w:r>
@@ -4275,25 +4454,25 @@
         </w:tc>
         <w:tc>
           <w:tcPr>
-            <w:tcW w:type="dxa" w:w="2117"/>
-            <w:vAlign w:val="center"/>
-            <w:tcMar>
-              <w:top w:w="80" w:type="dxa"/>
-              <w:bottom w:w="80" w:type="dxa"/>
-              <w:left w:w="80" w:type="dxa"/>
-              <w:right w:w="80" w:type="dxa"/>
-            </w:tcMar>
-          </w:tcPr>
-          <w:p>
-            <w:pPr>
-              <w:keepNext w:val="0"/>
-              <w:spacing w:line="252" w:lineRule="auto" w:before="0" w:after="0"/>
-              <w:jc w:val="center"/>
-            </w:pPr>
-            <w:r>
-              <w:rPr>
-                <w:rFonts w:ascii="Times New Roman" w:hAnsi="Times New Roman"/>
-                <w:sz w:val="20"/>
+            <w:tcW w:type="dxa" w:w="1482"/>
+            <w:vAlign w:val="center"/>
+            <w:tcMar>
+              <w:top w:w="80" w:type="dxa"/>
+              <w:bottom w:w="80" w:type="dxa"/>
+              <w:left w:w="80" w:type="dxa"/>
+              <w:right w:w="80" w:type="dxa"/>
+            </w:tcMar>
+          </w:tcPr>
+          <w:p>
+            <w:pPr>
+              <w:keepNext w:val="0"/>
+              <w:spacing w:line="252" w:lineRule="auto" w:before="0" w:after="0"/>
+              <w:jc w:val="center"/>
+            </w:pPr>
+            <w:r>
+              <w:rPr>
+                <w:rFonts w:ascii="Times New Roman" w:hAnsi="Times New Roman"/>
+                <w:sz w:val="19"/>
               </w:rPr>
               <w:t xml:space="preserve">4</w:t>
             </w:r>
@@ -4301,25 +4480,25 @@
         </w:tc>
         <w:tc>
           <w:tcPr>
-            <w:tcW w:type="dxa" w:w="2117"/>
-            <w:vAlign w:val="center"/>
-            <w:tcMar>
-              <w:top w:w="80" w:type="dxa"/>
-              <w:bottom w:w="80" w:type="dxa"/>
-              <w:left w:w="80" w:type="dxa"/>
-              <w:right w:w="80" w:type="dxa"/>
-            </w:tcMar>
-          </w:tcPr>
-          <w:p>
-            <w:pPr>
-              <w:keepNext w:val="0"/>
-              <w:spacing w:line="252" w:lineRule="auto" w:before="0" w:after="0"/>
-              <w:jc w:val="center"/>
-            </w:pPr>
-            <w:r>
-              <w:rPr>
-                <w:rFonts w:ascii="Times New Roman" w:hAnsi="Times New Roman"/>
-                <w:sz w:val="20"/>
+            <w:tcW w:type="dxa" w:w="2262"/>
+            <w:vAlign w:val="center"/>
+            <w:tcMar>
+              <w:top w:w="80" w:type="dxa"/>
+              <w:bottom w:w="80" w:type="dxa"/>
+              <w:left w:w="80" w:type="dxa"/>
+              <w:right w:w="80" w:type="dxa"/>
+            </w:tcMar>
+          </w:tcPr>
+          <w:p>
+            <w:pPr>
+              <w:keepNext w:val="0"/>
+              <w:spacing w:line="252" w:lineRule="auto" w:before="0" w:after="0"/>
+              <w:jc w:val="center"/>
+            </w:pPr>
+            <w:r>
+              <w:rPr>
+                <w:rFonts w:ascii="Times New Roman" w:hAnsi="Times New Roman"/>
+                <w:sz w:val="19"/>
               </w:rPr>
               <w:t xml:space="preserve">1.56 (1.07–2.28)</w:t>
             </w:r>
@@ -4327,7 +4506,7 @@
         </w:tc>
         <w:tc>
           <w:tcPr>
-            <w:tcW w:type="dxa" w:w="2117"/>
+            <w:tcW w:type="dxa" w:w="1560"/>
             <w:vAlign w:val="center"/>
             <w:tcMar>
               <w:top w:w="80" w:type="dxa"/>
@@ -4346,7 +4525,7 @@
               <w:rPr>
                 <w:rFonts w:ascii="Times New Roman" w:hAnsi="Times New Roman"/>
                 <w:b/>
-                <w:sz w:val="20"/>
+                <w:sz w:val="19"/>
               </w:rPr>
               <w:t xml:space="preserve">0.0212</w:t>
             </w:r>
@@ -4354,25 +4533,51 @@
         </w:tc>
         <w:tc>
           <w:tcPr>
-            <w:tcW w:type="dxa" w:w="2117"/>
-            <w:vAlign w:val="center"/>
-            <w:tcMar>
-              <w:top w:w="80" w:type="dxa"/>
-              <w:bottom w:w="80" w:type="dxa"/>
-              <w:left w:w="80" w:type="dxa"/>
-              <w:right w:w="80" w:type="dxa"/>
-            </w:tcMar>
-          </w:tcPr>
-          <w:p>
-            <w:pPr>
-              <w:keepNext w:val="0"/>
-              <w:spacing w:line="252" w:lineRule="auto" w:before="0" w:after="0"/>
-              <w:jc w:val="center"/>
-            </w:pPr>
-            <w:r>
-              <w:rPr>
-                <w:rFonts w:ascii="Times New Roman" w:hAnsi="Times New Roman"/>
-                <w:sz w:val="20"/>
+            <w:tcW w:type="dxa" w:w="1794"/>
+            <w:vAlign w:val="center"/>
+            <w:tcMar>
+              <w:top w:w="80" w:type="dxa"/>
+              <w:bottom w:w="80" w:type="dxa"/>
+              <w:left w:w="80" w:type="dxa"/>
+              <w:right w:w="80" w:type="dxa"/>
+            </w:tcMar>
+          </w:tcPr>
+          <w:p>
+            <w:pPr>
+              <w:keepNext w:val="0"/>
+              <w:spacing w:line="252" w:lineRule="auto" w:before="0" w:after="0"/>
+              <w:jc w:val="center"/>
+            </w:pPr>
+            <w:r>
+              <w:rPr>
+                <w:rFonts w:ascii="Times New Roman" w:hAnsi="Times New Roman"/>
+                <w:sz w:val="19"/>
+              </w:rPr>
+              <w:t xml:space="preserve">0.690</w:t>
+            </w:r>
+          </w:p>
+        </w:tc>
+        <w:tc>
+          <w:tcPr>
+            <w:tcW w:type="dxa" w:w="1794"/>
+            <w:vAlign w:val="center"/>
+            <w:tcMar>
+              <w:top w:w="80" w:type="dxa"/>
+              <w:bottom w:w="80" w:type="dxa"/>
+              <w:left w:w="80" w:type="dxa"/>
+              <w:right w:w="80" w:type="dxa"/>
+            </w:tcMar>
+          </w:tcPr>
+          <w:p>
+            <w:pPr>
+              <w:keepNext w:val="0"/>
+              <w:spacing w:line="252" w:lineRule="auto" w:before="0" w:after="0"/>
+              <w:jc w:val="center"/>
+            </w:pPr>
+            <w:r>
+              <w:rPr>
+                <w:rFonts w:ascii="Times New Roman" w:hAnsi="Times New Roman"/>
+                <w:sz w:val="19"/>
               </w:rPr>
               <w:t xml:space="preserve">0.236</w:t>
             </w:r>
@@ -4380,25 +4585,25 @@
         </w:tc>
         <w:tc>
           <w:tcPr>
-            <w:tcW w:type="dxa" w:w="2117"/>
-            <w:vAlign w:val="center"/>
-            <w:tcMar>
-              <w:top w:w="80" w:type="dxa"/>
-              <w:bottom w:w="80" w:type="dxa"/>
-              <w:left w:w="80" w:type="dxa"/>
-              <w:right w:w="80" w:type="dxa"/>
-            </w:tcMar>
-          </w:tcPr>
-          <w:p>
-            <w:pPr>
-              <w:keepNext w:val="0"/>
-              <w:spacing w:line="252" w:lineRule="auto" w:before="0" w:after="0"/>
-              <w:jc w:val="center"/>
-            </w:pPr>
-            <w:r>
-              <w:rPr>
-                <w:rFonts w:ascii="Times New Roman" w:hAnsi="Times New Roman"/>
-                <w:sz w:val="20"/>
+            <w:tcW w:type="dxa" w:w="1716"/>
+            <w:vAlign w:val="center"/>
+            <w:tcMar>
+              <w:top w:w="80" w:type="dxa"/>
+              <w:bottom w:w="80" w:type="dxa"/>
+              <w:left w:w="80" w:type="dxa"/>
+              <w:right w:w="80" w:type="dxa"/>
+            </w:tcMar>
+          </w:tcPr>
+          <w:p>
+            <w:pPr>
+              <w:keepNext w:val="0"/>
+              <w:spacing w:line="252" w:lineRule="auto" w:before="0" w:after="0"/>
+              <w:jc w:val="center"/>
+            </w:pPr>
+            <w:r>
+              <w:rPr>
+                <w:rFonts w:ascii="Times New Roman" w:hAnsi="Times New Roman"/>
+                <w:sz w:val="19"/>
               </w:rPr>
               <w:t xml:space="preserve">0.073</w:t>
             </w:r>
@@ -4411,7 +4616,7 @@
         </w:trPr>
         <w:tc>
           <w:tcPr>
-            <w:tcW w:type="dxa" w:w="2117"/>
+            <w:tcW w:type="dxa" w:w="1092"/>
             <w:vAlign w:val="center"/>
             <w:tcMar>
               <w:top w:w="80" w:type="dxa"/>
@@ -4431,7 +4636,7 @@
                 <w:rFonts w:ascii="Times New Roman" w:hAnsi="Times New Roman"/>
                 <w:i/>
                 <w:iCs/>
-                <w:sz w:val="20"/>
+                <w:sz w:val="19"/>
               </w:rPr>
               <w:t xml:space="preserve">IGF1R</w:t>
             </w:r>
@@ -4439,7 +4644,7 @@
         </w:tc>
         <w:tc>
           <w:tcPr>
-            <w:tcW w:type="dxa" w:w="2117"/>
+            <w:tcW w:type="dxa" w:w="3119"/>
             <w:vAlign w:val="center"/>
             <w:tcMar>
               <w:top w:w="80" w:type="dxa"/>
@@ -4457,7 +4662,7 @@
             <w:r>
               <w:rPr>
                 <w:rFonts w:ascii="Times New Roman" w:hAnsi="Times New Roman"/>
-                <w:sz w:val="20"/>
+                <w:sz w:val="19"/>
               </w:rPr>
               <w:t xml:space="preserve">UKB hyperthyroidism</w:t>
             </w:r>
@@ -4465,25 +4670,25 @@
         </w:tc>
         <w:tc>
           <w:tcPr>
-            <w:tcW w:type="dxa" w:w="2117"/>
-            <w:vAlign w:val="center"/>
-            <w:tcMar>
-              <w:top w:w="80" w:type="dxa"/>
-              <w:bottom w:w="80" w:type="dxa"/>
-              <w:left w:w="80" w:type="dxa"/>
-              <w:right w:w="80" w:type="dxa"/>
-            </w:tcMar>
-          </w:tcPr>
-          <w:p>
-            <w:pPr>
-              <w:keepNext w:val="0"/>
-              <w:spacing w:line="252" w:lineRule="auto" w:before="0" w:after="0"/>
-              <w:jc w:val="center"/>
-            </w:pPr>
-            <w:r>
-              <w:rPr>
-                <w:rFonts w:ascii="Times New Roman" w:hAnsi="Times New Roman"/>
-                <w:sz w:val="20"/>
+            <w:tcW w:type="dxa" w:w="1482"/>
+            <w:vAlign w:val="center"/>
+            <w:tcMar>
+              <w:top w:w="80" w:type="dxa"/>
+              <w:bottom w:w="80" w:type="dxa"/>
+              <w:left w:w="80" w:type="dxa"/>
+              <w:right w:w="80" w:type="dxa"/>
+            </w:tcMar>
+          </w:tcPr>
+          <w:p>
+            <w:pPr>
+              <w:keepNext w:val="0"/>
+              <w:spacing w:line="252" w:lineRule="auto" w:before="0" w:after="0"/>
+              <w:jc w:val="center"/>
+            </w:pPr>
+            <w:r>
+              <w:rPr>
+                <w:rFonts w:ascii="Times New Roman" w:hAnsi="Times New Roman"/>
+                <w:sz w:val="19"/>
               </w:rPr>
               <w:t xml:space="preserve">4</w:t>
             </w:r>
@@ -4491,25 +4696,25 @@
         </w:tc>
         <w:tc>
           <w:tcPr>
-            <w:tcW w:type="dxa" w:w="2117"/>
-            <w:vAlign w:val="center"/>
-            <w:tcMar>
-              <w:top w:w="80" w:type="dxa"/>
-              <w:bottom w:w="80" w:type="dxa"/>
-              <w:left w:w="80" w:type="dxa"/>
-              <w:right w:w="80" w:type="dxa"/>
-            </w:tcMar>
-          </w:tcPr>
-          <w:p>
-            <w:pPr>
-              <w:keepNext w:val="0"/>
-              <w:spacing w:line="252" w:lineRule="auto" w:before="0" w:after="0"/>
-              <w:jc w:val="center"/>
-            </w:pPr>
-            <w:r>
-              <w:rPr>
-                <w:rFonts w:ascii="Times New Roman" w:hAnsi="Times New Roman"/>
-                <w:sz w:val="20"/>
+            <w:tcW w:type="dxa" w:w="2262"/>
+            <w:vAlign w:val="center"/>
+            <w:tcMar>
+              <w:top w:w="80" w:type="dxa"/>
+              <w:bottom w:w="80" w:type="dxa"/>
+              <w:left w:w="80" w:type="dxa"/>
+              <w:right w:w="80" w:type="dxa"/>
+            </w:tcMar>
+          </w:tcPr>
+          <w:p>
+            <w:pPr>
+              <w:keepNext w:val="0"/>
+              <w:spacing w:line="252" w:lineRule="auto" w:before="0" w:after="0"/>
+              <w:jc w:val="center"/>
+            </w:pPr>
+            <w:r>
+              <w:rPr>
+                <w:rFonts w:ascii="Times New Roman" w:hAnsi="Times New Roman"/>
+                <w:sz w:val="19"/>
               </w:rPr>
               <w:t xml:space="preserve">1.35 (1.07–1.70)</w:t>
             </w:r>
@@ -4517,7 +4722,7 @@
         </w:tc>
         <w:tc>
           <w:tcPr>
-            <w:tcW w:type="dxa" w:w="2117"/>
+            <w:tcW w:type="dxa" w:w="1560"/>
             <w:vAlign w:val="center"/>
             <w:tcMar>
               <w:top w:w="80" w:type="dxa"/>
@@ -4536,7 +4741,7 @@
               <w:rPr>
                 <w:rFonts w:ascii="Times New Roman" w:hAnsi="Times New Roman"/>
                 <w:b/>
-                <w:sz w:val="20"/>
+                <w:sz w:val="19"/>
               </w:rPr>
               <w:t xml:space="preserve">0.0117</w:t>
             </w:r>
@@ -4544,25 +4749,51 @@
         </w:tc>
         <w:tc>
           <w:tcPr>
-            <w:tcW w:type="dxa" w:w="2117"/>
-            <w:vAlign w:val="center"/>
-            <w:tcMar>
-              <w:top w:w="80" w:type="dxa"/>
-              <w:bottom w:w="80" w:type="dxa"/>
-              <w:left w:w="80" w:type="dxa"/>
-              <w:right w:w="80" w:type="dxa"/>
-            </w:tcMar>
-          </w:tcPr>
-          <w:p>
-            <w:pPr>
-              <w:keepNext w:val="0"/>
-              <w:spacing w:line="252" w:lineRule="auto" w:before="0" w:after="0"/>
-              <w:jc w:val="center"/>
-            </w:pPr>
-            <w:r>
-              <w:rPr>
-                <w:rFonts w:ascii="Times New Roman" w:hAnsi="Times New Roman"/>
-                <w:sz w:val="20"/>
+            <w:tcW w:type="dxa" w:w="1794"/>
+            <w:vAlign w:val="center"/>
+            <w:tcMar>
+              <w:top w:w="80" w:type="dxa"/>
+              <w:bottom w:w="80" w:type="dxa"/>
+              <w:left w:w="80" w:type="dxa"/>
+              <w:right w:w="80" w:type="dxa"/>
+            </w:tcMar>
+          </w:tcPr>
+          <w:p>
+            <w:pPr>
+              <w:keepNext w:val="0"/>
+              <w:spacing w:line="252" w:lineRule="auto" w:before="0" w:after="0"/>
+              <w:jc w:val="center"/>
+            </w:pPr>
+            <w:r>
+              <w:rPr>
+                <w:rFonts w:ascii="Times New Roman" w:hAnsi="Times New Roman"/>
+                <w:sz w:val="19"/>
+              </w:rPr>
+              <w:t xml:space="preserve">0.400</w:t>
+            </w:r>
+          </w:p>
+        </w:tc>
+        <w:tc>
+          <w:tcPr>
+            <w:tcW w:type="dxa" w:w="1794"/>
+            <w:vAlign w:val="center"/>
+            <w:tcMar>
+              <w:top w:w="80" w:type="dxa"/>
+              <w:bottom w:w="80" w:type="dxa"/>
+              <w:left w:w="80" w:type="dxa"/>
+              <w:right w:w="80" w:type="dxa"/>
+            </w:tcMar>
+          </w:tcPr>
+          <w:p>
+            <w:pPr>
+              <w:keepNext w:val="0"/>
+              <w:spacing w:line="252" w:lineRule="auto" w:before="0" w:after="0"/>
+              <w:jc w:val="center"/>
+            </w:pPr>
+            <w:r>
+              <w:rPr>
+                <w:rFonts w:ascii="Times New Roman" w:hAnsi="Times New Roman"/>
+                <w:sz w:val="19"/>
               </w:rPr>
               <w:t xml:space="preserve">0.196</w:t>
             </w:r>
@@ -4570,25 +4801,25 @@
         </w:tc>
         <w:tc>
           <w:tcPr>
-            <w:tcW w:type="dxa" w:w="2117"/>
-            <w:vAlign w:val="center"/>
-            <w:tcMar>
-              <w:top w:w="80" w:type="dxa"/>
-              <w:bottom w:w="80" w:type="dxa"/>
-              <w:left w:w="80" w:type="dxa"/>
-              <w:right w:w="80" w:type="dxa"/>
-            </w:tcMar>
-          </w:tcPr>
-          <w:p>
-            <w:pPr>
-              <w:keepNext w:val="0"/>
-              <w:spacing w:line="252" w:lineRule="auto" w:before="0" w:after="0"/>
-              <w:jc w:val="center"/>
-            </w:pPr>
-            <w:r>
-              <w:rPr>
-                <w:rFonts w:ascii="Times New Roman" w:hAnsi="Times New Roman"/>
-                <w:sz w:val="20"/>
+            <w:tcW w:type="dxa" w:w="1716"/>
+            <w:vAlign w:val="center"/>
+            <w:tcMar>
+              <w:top w:w="80" w:type="dxa"/>
+              <w:bottom w:w="80" w:type="dxa"/>
+              <w:left w:w="80" w:type="dxa"/>
+              <w:right w:w="80" w:type="dxa"/>
+            </w:tcMar>
+          </w:tcPr>
+          <w:p>
+            <w:pPr>
+              <w:keepNext w:val="0"/>
+              <w:spacing w:line="252" w:lineRule="auto" w:before="0" w:after="0"/>
+              <w:jc w:val="center"/>
+            </w:pPr>
+            <w:r>
+              <w:rPr>
+                <w:rFonts w:ascii="Times New Roman" w:hAnsi="Times New Roman"/>
+                <w:sz w:val="19"/>
               </w:rPr>
               <w:t xml:space="preserve">0.404</w:t>
             </w:r>
@@ -4601,7 +4832,7 @@
         </w:trPr>
         <w:tc>
           <w:tcPr>
-            <w:tcW w:type="dxa" w:w="2117"/>
+            <w:tcW w:type="dxa" w:w="1092"/>
             <w:vAlign w:val="center"/>
             <w:tcMar>
               <w:top w:w="80" w:type="dxa"/>
@@ -4621,7 +4852,7 @@
                 <w:rFonts w:ascii="Times New Roman" w:hAnsi="Times New Roman"/>
                 <w:i/>
                 <w:iCs/>
-                <w:sz w:val="20"/>
+                <w:sz w:val="19"/>
               </w:rPr>
               <w:t xml:space="preserve">IGF1R</w:t>
             </w:r>
@@ -4629,7 +4860,7 @@
         </w:tc>
         <w:tc>
           <w:tcPr>
-            <w:tcW w:type="dxa" w:w="2117"/>
+            <w:tcW w:type="dxa" w:w="3119"/>
             <w:vAlign w:val="center"/>
             <w:tcMar>
               <w:top w:w="80" w:type="dxa"/>
@@ -4647,7 +4878,7 @@
             <w:r>
               <w:rPr>
                 <w:rFonts w:ascii="Times New Roman" w:hAnsi="Times New Roman"/>
-                <w:sz w:val="20"/>
+                <w:sz w:val="19"/>
               </w:rPr>
               <w:t xml:space="preserve">FinnGen Graves ophthalmopathy</w:t>
             </w:r>
@@ -4655,25 +4886,25 @@
         </w:tc>
         <w:tc>
           <w:tcPr>
-            <w:tcW w:type="dxa" w:w="2117"/>
-            <w:vAlign w:val="center"/>
-            <w:tcMar>
-              <w:top w:w="80" w:type="dxa"/>
-              <w:bottom w:w="80" w:type="dxa"/>
-              <w:left w:w="80" w:type="dxa"/>
-              <w:right w:w="80" w:type="dxa"/>
-            </w:tcMar>
-          </w:tcPr>
-          <w:p>
-            <w:pPr>
-              <w:keepNext w:val="0"/>
-              <w:spacing w:line="252" w:lineRule="auto" w:before="0" w:after="0"/>
-              <w:jc w:val="center"/>
-            </w:pPr>
-            <w:r>
-              <w:rPr>
-                <w:rFonts w:ascii="Times New Roman" w:hAnsi="Times New Roman"/>
-                <w:sz w:val="20"/>
+            <w:tcW w:type="dxa" w:w="1482"/>
+            <w:vAlign w:val="center"/>
+            <w:tcMar>
+              <w:top w:w="80" w:type="dxa"/>
+              <w:bottom w:w="80" w:type="dxa"/>
+              <w:left w:w="80" w:type="dxa"/>
+              <w:right w:w="80" w:type="dxa"/>
+            </w:tcMar>
+          </w:tcPr>
+          <w:p>
+            <w:pPr>
+              <w:keepNext w:val="0"/>
+              <w:spacing w:line="252" w:lineRule="auto" w:before="0" w:after="0"/>
+              <w:jc w:val="center"/>
+            </w:pPr>
+            <w:r>
+              <w:rPr>
+                <w:rFonts w:ascii="Times New Roman" w:hAnsi="Times New Roman"/>
+                <w:sz w:val="19"/>
               </w:rPr>
               <w:t xml:space="preserve">3</w:t>
             </w:r>
@@ -4681,25 +4912,25 @@
         </w:tc>
         <w:tc>
           <w:tcPr>
-            <w:tcW w:type="dxa" w:w="2117"/>
-            <w:vAlign w:val="center"/>
-            <w:tcMar>
-              <w:top w:w="80" w:type="dxa"/>
-              <w:bottom w:w="80" w:type="dxa"/>
-              <w:left w:w="80" w:type="dxa"/>
-              <w:right w:w="80" w:type="dxa"/>
-            </w:tcMar>
-          </w:tcPr>
-          <w:p>
-            <w:pPr>
-              <w:keepNext w:val="0"/>
-              <w:spacing w:line="252" w:lineRule="auto" w:before="0" w:after="0"/>
-              <w:jc w:val="center"/>
-            </w:pPr>
-            <w:r>
-              <w:rPr>
-                <w:rFonts w:ascii="Times New Roman" w:hAnsi="Times New Roman"/>
-                <w:sz w:val="20"/>
+            <w:tcW w:type="dxa" w:w="2262"/>
+            <w:vAlign w:val="center"/>
+            <w:tcMar>
+              <w:top w:w="80" w:type="dxa"/>
+              <w:bottom w:w="80" w:type="dxa"/>
+              <w:left w:w="80" w:type="dxa"/>
+              <w:right w:w="80" w:type="dxa"/>
+            </w:tcMar>
+          </w:tcPr>
+          <w:p>
+            <w:pPr>
+              <w:keepNext w:val="0"/>
+              <w:spacing w:line="252" w:lineRule="auto" w:before="0" w:after="0"/>
+              <w:jc w:val="center"/>
+            </w:pPr>
+            <w:r>
+              <w:rPr>
+                <w:rFonts w:ascii="Times New Roman" w:hAnsi="Times New Roman"/>
+                <w:sz w:val="19"/>
               </w:rPr>
               <w:t xml:space="preserve">1.41 (0.85–2.33)</w:t>
             </w:r>
@@ -4707,26 +4938,26 @@
         </w:tc>
         <w:tc>
           <w:tcPr>
-            <w:tcW w:type="dxa" w:w="2117"/>
-            <w:vAlign w:val="center"/>
-            <w:tcMar>
-              <w:top w:w="80" w:type="dxa"/>
-              <w:bottom w:w="80" w:type="dxa"/>
-              <w:left w:w="80" w:type="dxa"/>
-              <w:right w:w="80" w:type="dxa"/>
-            </w:tcMar>
-          </w:tcPr>
-          <w:p>
-            <w:pPr>
-              <w:keepNext w:val="0"/>
-              <w:spacing w:line="252" w:lineRule="auto" w:before="0" w:after="0"/>
-              <w:jc w:val="center"/>
-            </w:pPr>
-            <w:r>
-              <w:rPr>
-                <w:rFonts w:ascii="Times New Roman" w:hAnsi="Times New Roman"/>
-                <w:b/>
-                <w:sz w:val="20"/>
+            <w:tcW w:type="dxa" w:w="1560"/>
+            <w:vAlign w:val="center"/>
+            <w:tcMar>
+              <w:top w:w="80" w:type="dxa"/>
+              <w:bottom w:w="80" w:type="dxa"/>
+              <w:left w:w="80" w:type="dxa"/>
+              <w:right w:w="80" w:type="dxa"/>
+            </w:tcMar>
+          </w:tcPr>
+          <w:p>
+            <w:pPr>
+              <w:keepNext w:val="0"/>
+              <w:spacing w:line="252" w:lineRule="auto" w:before="0" w:after="0"/>
+              <w:jc w:val="center"/>
+            </w:pPr>
+            <w:r>
+              <w:rPr>
+                <w:rFonts w:ascii="Times New Roman" w:hAnsi="Times New Roman"/>
+                <w:b w:val="0"/>
+                <w:sz w:val="19"/>
               </w:rPr>
               <w:t xml:space="preserve">0.182</w:t>
             </w:r>
@@ -4734,25 +4965,51 @@
         </w:tc>
         <w:tc>
           <w:tcPr>
-            <w:tcW w:type="dxa" w:w="2117"/>
-            <w:vAlign w:val="center"/>
-            <w:tcMar>
-              <w:top w:w="80" w:type="dxa"/>
-              <w:bottom w:w="80" w:type="dxa"/>
-              <w:left w:w="80" w:type="dxa"/>
-              <w:right w:w="80" w:type="dxa"/>
-            </w:tcMar>
-          </w:tcPr>
-          <w:p>
-            <w:pPr>
-              <w:keepNext w:val="0"/>
-              <w:spacing w:line="252" w:lineRule="auto" w:before="0" w:after="0"/>
-              <w:jc w:val="center"/>
-            </w:pPr>
-            <w:r>
-              <w:rPr>
-                <w:rFonts w:ascii="Times New Roman" w:hAnsi="Times New Roman"/>
-                <w:sz w:val="20"/>
+            <w:tcW w:type="dxa" w:w="1794"/>
+            <w:vAlign w:val="center"/>
+            <w:tcMar>
+              <w:top w:w="80" w:type="dxa"/>
+              <w:bottom w:w="80" w:type="dxa"/>
+              <w:left w:w="80" w:type="dxa"/>
+              <w:right w:w="80" w:type="dxa"/>
+            </w:tcMar>
+          </w:tcPr>
+          <w:p>
+            <w:pPr>
+              <w:keepNext w:val="0"/>
+              <w:spacing w:line="252" w:lineRule="auto" w:before="0" w:after="0"/>
+              <w:jc w:val="center"/>
+            </w:pPr>
+            <w:r>
+              <w:rPr>
+                <w:rFonts w:ascii="Times New Roman" w:hAnsi="Times New Roman"/>
+                <w:sz w:val="19"/>
+              </w:rPr>
+              <w:t xml:space="preserve">0.623</w:t>
+            </w:r>
+          </w:p>
+        </w:tc>
+        <w:tc>
+          <w:tcPr>
+            <w:tcW w:type="dxa" w:w="1794"/>
+            <w:vAlign w:val="center"/>
+            <w:tcMar>
+              <w:top w:w="80" w:type="dxa"/>
+              <w:bottom w:w="80" w:type="dxa"/>
+              <w:left w:w="80" w:type="dxa"/>
+              <w:right w:w="80" w:type="dxa"/>
+            </w:tcMar>
+          </w:tcPr>
+          <w:p>
+            <w:pPr>
+              <w:keepNext w:val="0"/>
+              <w:spacing w:line="252" w:lineRule="auto" w:before="0" w:after="0"/>
+              <w:jc w:val="center"/>
+            </w:pPr>
+            <w:r>
+              <w:rPr>
+                <w:rFonts w:ascii="Times New Roman" w:hAnsi="Times New Roman"/>
+                <w:sz w:val="19"/>
               </w:rPr>
               <w:t xml:space="preserve">0.346</w:t>
             </w:r>
@@ -4760,25 +5017,25 @@
         </w:tc>
         <w:tc>
           <w:tcPr>
-            <w:tcW w:type="dxa" w:w="2117"/>
-            <w:vAlign w:val="center"/>
-            <w:tcMar>
-              <w:top w:w="80" w:type="dxa"/>
-              <w:bottom w:w="80" w:type="dxa"/>
-              <w:left w:w="80" w:type="dxa"/>
-              <w:right w:w="80" w:type="dxa"/>
-            </w:tcMar>
-          </w:tcPr>
-          <w:p>
-            <w:pPr>
-              <w:keepNext w:val="0"/>
-              <w:spacing w:line="252" w:lineRule="auto" w:before="0" w:after="0"/>
-              <w:jc w:val="center"/>
-            </w:pPr>
-            <w:r>
-              <w:rPr>
-                <w:rFonts w:ascii="Times New Roman" w:hAnsi="Times New Roman"/>
-                <w:sz w:val="20"/>
+            <w:tcW w:type="dxa" w:w="1716"/>
+            <w:vAlign w:val="center"/>
+            <w:tcMar>
+              <w:top w:w="80" w:type="dxa"/>
+              <w:bottom w:w="80" w:type="dxa"/>
+              <w:left w:w="80" w:type="dxa"/>
+              <w:right w:w="80" w:type="dxa"/>
+            </w:tcMar>
+          </w:tcPr>
+          <w:p>
+            <w:pPr>
+              <w:keepNext w:val="0"/>
+              <w:spacing w:line="252" w:lineRule="auto" w:before="0" w:after="0"/>
+              <w:jc w:val="center"/>
+            </w:pPr>
+            <w:r>
+              <w:rPr>
+                <w:rFonts w:ascii="Times New Roman" w:hAnsi="Times New Roman"/>
+                <w:sz w:val="19"/>
               </w:rPr>
               <w:t xml:space="preserve">0.032</w:t>
             </w:r>
@@ -4791,7 +5048,7 @@
         </w:trPr>
         <w:tc>
           <w:tcPr>
-            <w:tcW w:type="dxa" w:w="2117"/>
+            <w:tcW w:type="dxa" w:w="1092"/>
             <w:vAlign w:val="center"/>
             <w:tcMar>
               <w:top w:w="80" w:type="dxa"/>
@@ -4811,7 +5068,7 @@
                 <w:rFonts w:ascii="Times New Roman" w:hAnsi="Times New Roman"/>
                 <w:i/>
                 <w:iCs/>
-                <w:sz w:val="20"/>
+                <w:sz w:val="19"/>
               </w:rPr>
               <w:t xml:space="preserve">CTLA4</w:t>
             </w:r>
@@ -4819,7 +5076,7 @@
         </w:tc>
         <w:tc>
           <w:tcPr>
-            <w:tcW w:type="dxa" w:w="2117"/>
+            <w:tcW w:type="dxa" w:w="3119"/>
             <w:vAlign w:val="center"/>
             <w:tcMar>
               <w:top w:w="80" w:type="dxa"/>
@@ -4837,7 +5094,7 @@
             <w:r>
               <w:rPr>
                 <w:rFonts w:ascii="Times New Roman" w:hAnsi="Times New Roman"/>
-                <w:sz w:val="20"/>
+                <w:sz w:val="19"/>
               </w:rPr>
               <w:t xml:space="preserve">BBJ Graves disease</w:t>
             </w:r>
@@ -4845,25 +5102,25 @@
         </w:tc>
         <w:tc>
           <w:tcPr>
-            <w:tcW w:type="dxa" w:w="2117"/>
-            <w:vAlign w:val="center"/>
-            <w:tcMar>
-              <w:top w:w="80" w:type="dxa"/>
-              <w:bottom w:w="80" w:type="dxa"/>
-              <w:left w:w="80" w:type="dxa"/>
-              <w:right w:w="80" w:type="dxa"/>
-            </w:tcMar>
-          </w:tcPr>
-          <w:p>
-            <w:pPr>
-              <w:keepNext w:val="0"/>
-              <w:spacing w:line="252" w:lineRule="auto" w:before="0" w:after="0"/>
-              <w:jc w:val="center"/>
-            </w:pPr>
-            <w:r>
-              <w:rPr>
-                <w:rFonts w:ascii="Times New Roman" w:hAnsi="Times New Roman"/>
-                <w:sz w:val="20"/>
+            <w:tcW w:type="dxa" w:w="1482"/>
+            <w:vAlign w:val="center"/>
+            <w:tcMar>
+              <w:top w:w="80" w:type="dxa"/>
+              <w:bottom w:w="80" w:type="dxa"/>
+              <w:left w:w="80" w:type="dxa"/>
+              <w:right w:w="80" w:type="dxa"/>
+            </w:tcMar>
+          </w:tcPr>
+          <w:p>
+            <w:pPr>
+              <w:keepNext w:val="0"/>
+              <w:spacing w:line="252" w:lineRule="auto" w:before="0" w:after="0"/>
+              <w:jc w:val="center"/>
+            </w:pPr>
+            <w:r>
+              <w:rPr>
+                <w:rFonts w:ascii="Times New Roman" w:hAnsi="Times New Roman"/>
+                <w:sz w:val="19"/>
               </w:rPr>
               <w:t xml:space="preserve">1</w:t>
             </w:r>
@@ -4871,25 +5128,25 @@
         </w:tc>
         <w:tc>
           <w:tcPr>
-            <w:tcW w:type="dxa" w:w="2117"/>
-            <w:vAlign w:val="center"/>
-            <w:tcMar>
-              <w:top w:w="80" w:type="dxa"/>
-              <w:bottom w:w="80" w:type="dxa"/>
-              <w:left w:w="80" w:type="dxa"/>
-              <w:right w:w="80" w:type="dxa"/>
-            </w:tcMar>
-          </w:tcPr>
-          <w:p>
-            <w:pPr>
-              <w:keepNext w:val="0"/>
-              <w:spacing w:line="252" w:lineRule="auto" w:before="0" w:after="0"/>
-              <w:jc w:val="center"/>
-            </w:pPr>
-            <w:r>
-              <w:rPr>
-                <w:rFonts w:ascii="Times New Roman" w:hAnsi="Times New Roman"/>
-                <w:sz w:val="20"/>
+            <w:tcW w:type="dxa" w:w="2262"/>
+            <w:vAlign w:val="center"/>
+            <w:tcMar>
+              <w:top w:w="80" w:type="dxa"/>
+              <w:bottom w:w="80" w:type="dxa"/>
+              <w:left w:w="80" w:type="dxa"/>
+              <w:right w:w="80" w:type="dxa"/>
+            </w:tcMar>
+          </w:tcPr>
+          <w:p>
+            <w:pPr>
+              <w:keepNext w:val="0"/>
+              <w:spacing w:line="252" w:lineRule="auto" w:before="0" w:after="0"/>
+              <w:jc w:val="center"/>
+            </w:pPr>
+            <w:r>
+              <w:rPr>
+                <w:rFonts w:ascii="Times New Roman" w:hAnsi="Times New Roman"/>
+                <w:sz w:val="19"/>
               </w:rPr>
               <w:t xml:space="preserve">0.18 (0.11–0.27)</w:t>
             </w:r>
@@ -4897,7 +5154,7 @@
         </w:tc>
         <w:tc>
           <w:tcPr>
-            <w:tcW w:type="dxa" w:w="2117"/>
+            <w:tcW w:type="dxa" w:w="1560"/>
             <w:vAlign w:val="center"/>
             <w:tcMar>
               <w:top w:w="80" w:type="dxa"/>
@@ -4916,7 +5173,7 @@
               <w:rPr>
                 <w:rFonts w:ascii="Times New Roman" w:hAnsi="Times New Roman"/>
                 <w:b/>
-                <w:sz w:val="20"/>
+                <w:sz w:val="19"/>
               </w:rPr>
               <w:t xml:space="preserve">5.45×10⁻¹⁵</w:t>
             </w:r>
@@ -4924,25 +5181,51 @@
         </w:tc>
         <w:tc>
           <w:tcPr>
-            <w:tcW w:type="dxa" w:w="2117"/>
-            <w:vAlign w:val="center"/>
-            <w:tcMar>
-              <w:top w:w="80" w:type="dxa"/>
-              <w:bottom w:w="80" w:type="dxa"/>
-              <w:left w:w="80" w:type="dxa"/>
-              <w:right w:w="80" w:type="dxa"/>
-            </w:tcMar>
-          </w:tcPr>
-          <w:p>
-            <w:pPr>
-              <w:keepNext w:val="0"/>
-              <w:spacing w:line="252" w:lineRule="auto" w:before="0" w:after="0"/>
-              <w:jc w:val="center"/>
-            </w:pPr>
-            <w:r>
-              <w:rPr>
-                <w:rFonts w:ascii="Times New Roman" w:hAnsi="Times New Roman"/>
-                <w:sz w:val="20"/>
+            <w:tcW w:type="dxa" w:w="1794"/>
+            <w:vAlign w:val="center"/>
+            <w:tcMar>
+              <w:top w:w="80" w:type="dxa"/>
+              <w:bottom w:w="80" w:type="dxa"/>
+              <w:left w:w="80" w:type="dxa"/>
+              <w:right w:w="80" w:type="dxa"/>
+            </w:tcMar>
+          </w:tcPr>
+          <w:p>
+            <w:pPr>
+              <w:keepNext w:val="0"/>
+              <w:spacing w:line="252" w:lineRule="auto" w:before="0" w:after="0"/>
+              <w:jc w:val="center"/>
+            </w:pPr>
+            <w:r>
+              <w:rPr>
+                <w:rFonts w:ascii="Times New Roman" w:hAnsi="Times New Roman"/>
+                <w:sz w:val="19"/>
+              </w:rPr>
+              <w:t xml:space="preserve">&lt;0.001</w:t>
+            </w:r>
+          </w:p>
+        </w:tc>
+        <w:tc>
+          <w:tcPr>
+            <w:tcW w:type="dxa" w:w="1794"/>
+            <w:vAlign w:val="center"/>
+            <w:tcMar>
+              <w:top w:w="80" w:type="dxa"/>
+              <w:bottom w:w="80" w:type="dxa"/>
+              <w:left w:w="80" w:type="dxa"/>
+              <w:right w:w="80" w:type="dxa"/>
+            </w:tcMar>
+          </w:tcPr>
+          <w:p>
+            <w:pPr>
+              <w:keepNext w:val="0"/>
+              <w:spacing w:line="252" w:lineRule="auto" w:before="0" w:after="0"/>
+              <w:jc w:val="center"/>
+            </w:pPr>
+            <w:r>
+              <w:rPr>
+                <w:rFonts w:ascii="Times New Roman" w:hAnsi="Times New Roman"/>
+                <w:sz w:val="19"/>
               </w:rPr>
               <w:t xml:space="preserve">0.799</w:t>
             </w:r>
@@ -4950,25 +5233,25 @@
         </w:tc>
         <w:tc>
           <w:tcPr>
-            <w:tcW w:type="dxa" w:w="2117"/>
-            <w:vAlign w:val="center"/>
-            <w:tcMar>
-              <w:top w:w="80" w:type="dxa"/>
-              <w:bottom w:w="80" w:type="dxa"/>
-              <w:left w:w="80" w:type="dxa"/>
-              <w:right w:w="80" w:type="dxa"/>
-            </w:tcMar>
-          </w:tcPr>
-          <w:p>
-            <w:pPr>
-              <w:keepNext w:val="0"/>
-              <w:spacing w:line="252" w:lineRule="auto" w:before="0" w:after="0"/>
-              <w:jc w:val="center"/>
-            </w:pPr>
-            <w:r>
-              <w:rPr>
-                <w:rFonts w:ascii="Times New Roman" w:hAnsi="Times New Roman"/>
-                <w:sz w:val="20"/>
+            <w:tcW w:type="dxa" w:w="1716"/>
+            <w:vAlign w:val="center"/>
+            <w:tcMar>
+              <w:top w:w="80" w:type="dxa"/>
+              <w:bottom w:w="80" w:type="dxa"/>
+              <w:left w:w="80" w:type="dxa"/>
+              <w:right w:w="80" w:type="dxa"/>
+            </w:tcMar>
+          </w:tcPr>
+          <w:p>
+            <w:pPr>
+              <w:keepNext w:val="0"/>
+              <w:spacing w:line="252" w:lineRule="auto" w:before="0" w:after="0"/>
+              <w:jc w:val="center"/>
+            </w:pPr>
+            <w:r>
+              <w:rPr>
+                <w:rFonts w:ascii="Times New Roman" w:hAnsi="Times New Roman"/>
+                <w:sz w:val="19"/>
               </w:rPr>
               <w:t xml:space="preserve">0.201</w:t>
             </w:r>
@@ -4981,7 +5264,7 @@
         </w:trPr>
         <w:tc>
           <w:tcPr>
-            <w:tcW w:type="dxa" w:w="2117"/>
+            <w:tcW w:type="dxa" w:w="1092"/>
             <w:vAlign w:val="center"/>
             <w:tcMar>
               <w:top w:w="80" w:type="dxa"/>
@@ -5001,7 +5284,7 @@
                 <w:rFonts w:ascii="Times New Roman" w:hAnsi="Times New Roman"/>
                 <w:i/>
                 <w:iCs/>
-                <w:sz w:val="20"/>
+                <w:sz w:val="19"/>
               </w:rPr>
               <w:t xml:space="preserve">CTLA4</w:t>
             </w:r>
@@ -5009,7 +5292,7 @@
         </w:tc>
         <w:tc>
           <w:tcPr>
-            <w:tcW w:type="dxa" w:w="2117"/>
+            <w:tcW w:type="dxa" w:w="3119"/>
             <w:vAlign w:val="center"/>
             <w:tcMar>
               <w:top w:w="80" w:type="dxa"/>
@@ -5027,7 +5310,7 @@
             <w:r>
               <w:rPr>
                 <w:rFonts w:ascii="Times New Roman" w:hAnsi="Times New Roman"/>
-                <w:sz w:val="20"/>
+                <w:sz w:val="19"/>
               </w:rPr>
               <w:t xml:space="preserve">UKB hyperthyroidism</w:t>
             </w:r>
@@ -5035,25 +5318,25 @@
         </w:tc>
         <w:tc>
           <w:tcPr>
-            <w:tcW w:type="dxa" w:w="2117"/>
-            <w:vAlign w:val="center"/>
-            <w:tcMar>
-              <w:top w:w="80" w:type="dxa"/>
-              <w:bottom w:w="80" w:type="dxa"/>
-              <w:left w:w="80" w:type="dxa"/>
-              <w:right w:w="80" w:type="dxa"/>
-            </w:tcMar>
-          </w:tcPr>
-          <w:p>
-            <w:pPr>
-              <w:keepNext w:val="0"/>
-              <w:spacing w:line="252" w:lineRule="auto" w:before="0" w:after="0"/>
-              <w:jc w:val="center"/>
-            </w:pPr>
-            <w:r>
-              <w:rPr>
-                <w:rFonts w:ascii="Times New Roman" w:hAnsi="Times New Roman"/>
-                <w:sz w:val="20"/>
+            <w:tcW w:type="dxa" w:w="1482"/>
+            <w:vAlign w:val="center"/>
+            <w:tcMar>
+              <w:top w:w="80" w:type="dxa"/>
+              <w:bottom w:w="80" w:type="dxa"/>
+              <w:left w:w="80" w:type="dxa"/>
+              <w:right w:w="80" w:type="dxa"/>
+            </w:tcMar>
+          </w:tcPr>
+          <w:p>
+            <w:pPr>
+              <w:keepNext w:val="0"/>
+              <w:spacing w:line="252" w:lineRule="auto" w:before="0" w:after="0"/>
+              <w:jc w:val="center"/>
+            </w:pPr>
+            <w:r>
+              <w:rPr>
+                <w:rFonts w:ascii="Times New Roman" w:hAnsi="Times New Roman"/>
+                <w:sz w:val="19"/>
               </w:rPr>
               <w:t xml:space="preserve">2</w:t>
             </w:r>
@@ -5061,25 +5344,25 @@
         </w:tc>
         <w:tc>
           <w:tcPr>
-            <w:tcW w:type="dxa" w:w="2117"/>
-            <w:vAlign w:val="center"/>
-            <w:tcMar>
-              <w:top w:w="80" w:type="dxa"/>
-              <w:bottom w:w="80" w:type="dxa"/>
-              <w:left w:w="80" w:type="dxa"/>
-              <w:right w:w="80" w:type="dxa"/>
-            </w:tcMar>
-          </w:tcPr>
-          <w:p>
-            <w:pPr>
-              <w:keepNext w:val="0"/>
-              <w:spacing w:line="252" w:lineRule="auto" w:before="0" w:after="0"/>
-              <w:jc w:val="center"/>
-            </w:pPr>
-            <w:r>
-              <w:rPr>
-                <w:rFonts w:ascii="Times New Roman" w:hAnsi="Times New Roman"/>
-                <w:sz w:val="20"/>
+            <w:tcW w:type="dxa" w:w="2262"/>
+            <w:vAlign w:val="center"/>
+            <w:tcMar>
+              <w:top w:w="80" w:type="dxa"/>
+              <w:bottom w:w="80" w:type="dxa"/>
+              <w:left w:w="80" w:type="dxa"/>
+              <w:right w:w="80" w:type="dxa"/>
+            </w:tcMar>
+          </w:tcPr>
+          <w:p>
+            <w:pPr>
+              <w:keepNext w:val="0"/>
+              <w:spacing w:line="252" w:lineRule="auto" w:before="0" w:after="0"/>
+              <w:jc w:val="center"/>
+            </w:pPr>
+            <w:r>
+              <w:rPr>
+                <w:rFonts w:ascii="Times New Roman" w:hAnsi="Times New Roman"/>
+                <w:sz w:val="19"/>
               </w:rPr>
               <w:t xml:space="preserve">0.21 (0.08–0.57)</w:t>
             </w:r>
@@ -5087,7 +5370,7 @@
         </w:tc>
         <w:tc>
           <w:tcPr>
-            <w:tcW w:type="dxa" w:w="2117"/>
+            <w:tcW w:type="dxa" w:w="1560"/>
             <w:vAlign w:val="center"/>
             <w:tcMar>
               <w:top w:w="80" w:type="dxa"/>
@@ -5106,7 +5389,7 @@
               <w:rPr>
                 <w:rFonts w:ascii="Times New Roman" w:hAnsi="Times New Roman"/>
                 <w:b/>
-                <w:sz w:val="20"/>
+                <w:sz w:val="19"/>
               </w:rPr>
               <w:t xml:space="preserve">0.0022</w:t>
             </w:r>
@@ -5114,25 +5397,51 @@
         </w:tc>
         <w:tc>
           <w:tcPr>
-            <w:tcW w:type="dxa" w:w="2117"/>
-            <w:vAlign w:val="center"/>
-            <w:tcMar>
-              <w:top w:w="80" w:type="dxa"/>
-              <w:bottom w:w="80" w:type="dxa"/>
-              <w:left w:w="80" w:type="dxa"/>
-              <w:right w:w="80" w:type="dxa"/>
-            </w:tcMar>
-          </w:tcPr>
-          <w:p>
-            <w:pPr>
-              <w:keepNext w:val="0"/>
-              <w:spacing w:line="252" w:lineRule="auto" w:before="0" w:after="0"/>
-              <w:jc w:val="center"/>
-            </w:pPr>
-            <w:r>
-              <w:rPr>
-                <w:rFonts w:ascii="Times New Roman" w:hAnsi="Times New Roman"/>
-                <w:sz w:val="20"/>
+            <w:tcW w:type="dxa" w:w="1794"/>
+            <w:vAlign w:val="center"/>
+            <w:tcMar>
+              <w:top w:w="80" w:type="dxa"/>
+              <w:bottom w:w="80" w:type="dxa"/>
+              <w:left w:w="80" w:type="dxa"/>
+              <w:right w:w="80" w:type="dxa"/>
+            </w:tcMar>
+          </w:tcPr>
+          <w:p>
+            <w:pPr>
+              <w:keepNext w:val="0"/>
+              <w:spacing w:line="252" w:lineRule="auto" w:before="0" w:after="0"/>
+              <w:jc w:val="center"/>
+            </w:pPr>
+            <w:r>
+              <w:rPr>
+                <w:rFonts w:ascii="Times New Roman" w:hAnsi="Times New Roman"/>
+                <w:sz w:val="19"/>
+              </w:rPr>
+              <w:t xml:space="preserve">&lt;0.001</w:t>
+            </w:r>
+          </w:p>
+        </w:tc>
+        <w:tc>
+          <w:tcPr>
+            <w:tcW w:type="dxa" w:w="1794"/>
+            <w:vAlign w:val="center"/>
+            <w:tcMar>
+              <w:top w:w="80" w:type="dxa"/>
+              <w:bottom w:w="80" w:type="dxa"/>
+              <w:left w:w="80" w:type="dxa"/>
+              <w:right w:w="80" w:type="dxa"/>
+            </w:tcMar>
+          </w:tcPr>
+          <w:p>
+            <w:pPr>
+              <w:keepNext w:val="0"/>
+              <w:spacing w:line="252" w:lineRule="auto" w:before="0" w:after="0"/>
+              <w:jc w:val="center"/>
+            </w:pPr>
+            <w:r>
+              <w:rPr>
+                <w:rFonts w:ascii="Times New Roman" w:hAnsi="Times New Roman"/>
+                <w:sz w:val="19"/>
               </w:rPr>
               <w:t xml:space="preserve">0.047</w:t>
             </w:r>
@@ -5140,25 +5449,25 @@
         </w:tc>
         <w:tc>
           <w:tcPr>
-            <w:tcW w:type="dxa" w:w="2117"/>
-            <w:vAlign w:val="center"/>
-            <w:tcMar>
-              <w:top w:w="80" w:type="dxa"/>
-              <w:bottom w:w="80" w:type="dxa"/>
-              <w:left w:w="80" w:type="dxa"/>
-              <w:right w:w="80" w:type="dxa"/>
-            </w:tcMar>
-          </w:tcPr>
-          <w:p>
-            <w:pPr>
-              <w:keepNext w:val="0"/>
-              <w:spacing w:line="252" w:lineRule="auto" w:before="0" w:after="0"/>
-              <w:jc w:val="center"/>
-            </w:pPr>
-            <w:r>
-              <w:rPr>
-                <w:rFonts w:ascii="Times New Roman" w:hAnsi="Times New Roman"/>
-                <w:sz w:val="20"/>
+            <w:tcW w:type="dxa" w:w="1716"/>
+            <w:vAlign w:val="center"/>
+            <w:tcMar>
+              <w:top w:w="80" w:type="dxa"/>
+              <w:bottom w:w="80" w:type="dxa"/>
+              <w:left w:w="80" w:type="dxa"/>
+              <w:right w:w="80" w:type="dxa"/>
+            </w:tcMar>
+          </w:tcPr>
+          <w:p>
+            <w:pPr>
+              <w:keepNext w:val="0"/>
+              <w:spacing w:line="252" w:lineRule="auto" w:before="0" w:after="0"/>
+              <w:jc w:val="center"/>
+            </w:pPr>
+            <w:r>
+              <w:rPr>
+                <w:rFonts w:ascii="Times New Roman" w:hAnsi="Times New Roman"/>
+                <w:sz w:val="19"/>
               </w:rPr>
               <w:t xml:space="preserve">0.953</w:t>
             </w:r>
@@ -5171,7 +5480,7 @@
         </w:trPr>
         <w:tc>
           <w:tcPr>
-            <w:tcW w:type="dxa" w:w="2117"/>
+            <w:tcW w:type="dxa" w:w="1092"/>
             <w:vAlign w:val="center"/>
             <w:tcMar>
               <w:top w:w="80" w:type="dxa"/>
@@ -5191,7 +5500,7 @@
                 <w:rFonts w:ascii="Times New Roman" w:hAnsi="Times New Roman"/>
                 <w:i/>
                 <w:iCs/>
-                <w:sz w:val="20"/>
+                <w:sz w:val="19"/>
               </w:rPr>
               <w:t xml:space="preserve">CTLA4</w:t>
             </w:r>
@@ -5199,7 +5508,7 @@
         </w:tc>
         <w:tc>
           <w:tcPr>
-            <w:tcW w:type="dxa" w:w="2117"/>
+            <w:tcW w:type="dxa" w:w="3119"/>
             <w:vAlign w:val="center"/>
             <w:tcMar>
               <w:top w:w="80" w:type="dxa"/>
@@ -5217,7 +5526,7 @@
             <w:r>
               <w:rPr>
                 <w:rFonts w:ascii="Times New Roman" w:hAnsi="Times New Roman"/>
-                <w:sz w:val="20"/>
+                <w:sz w:val="19"/>
               </w:rPr>
               <w:t xml:space="preserve">FinnGen Graves ophthalmopathy</w:t>
             </w:r>
@@ -5225,25 +5534,25 @@
         </w:tc>
         <w:tc>
           <w:tcPr>
-            <w:tcW w:type="dxa" w:w="2117"/>
-            <w:vAlign w:val="center"/>
-            <w:tcMar>
-              <w:top w:w="80" w:type="dxa"/>
-              <w:bottom w:w="80" w:type="dxa"/>
-              <w:left w:w="80" w:type="dxa"/>
-              <w:right w:w="80" w:type="dxa"/>
-            </w:tcMar>
-          </w:tcPr>
-          <w:p>
-            <w:pPr>
-              <w:keepNext w:val="0"/>
-              <w:spacing w:line="252" w:lineRule="auto" w:before="0" w:after="0"/>
-              <w:jc w:val="center"/>
-            </w:pPr>
-            <w:r>
-              <w:rPr>
-                <w:rFonts w:ascii="Times New Roman" w:hAnsi="Times New Roman"/>
-                <w:sz w:val="20"/>
+            <w:tcW w:type="dxa" w:w="1482"/>
+            <w:vAlign w:val="center"/>
+            <w:tcMar>
+              <w:top w:w="80" w:type="dxa"/>
+              <w:bottom w:w="80" w:type="dxa"/>
+              <w:left w:w="80" w:type="dxa"/>
+              <w:right w:w="80" w:type="dxa"/>
+            </w:tcMar>
+          </w:tcPr>
+          <w:p>
+            <w:pPr>
+              <w:keepNext w:val="0"/>
+              <w:spacing w:line="252" w:lineRule="auto" w:before="0" w:after="0"/>
+              <w:jc w:val="center"/>
+            </w:pPr>
+            <w:r>
+              <w:rPr>
+                <w:rFonts w:ascii="Times New Roman" w:hAnsi="Times New Roman"/>
+                <w:sz w:val="19"/>
               </w:rPr>
               <w:t xml:space="preserve">2</w:t>
             </w:r>
@@ -5251,25 +5560,25 @@
         </w:tc>
         <w:tc>
           <w:tcPr>
-            <w:tcW w:type="dxa" w:w="2117"/>
-            <w:vAlign w:val="center"/>
-            <w:tcMar>
-              <w:top w:w="80" w:type="dxa"/>
-              <w:bottom w:w="80" w:type="dxa"/>
-              <w:left w:w="80" w:type="dxa"/>
-              <w:right w:w="80" w:type="dxa"/>
-            </w:tcMar>
-          </w:tcPr>
-          <w:p>
-            <w:pPr>
-              <w:keepNext w:val="0"/>
-              <w:spacing w:line="252" w:lineRule="auto" w:before="0" w:after="0"/>
-              <w:jc w:val="center"/>
-            </w:pPr>
-            <w:r>
-              <w:rPr>
-                <w:rFonts w:ascii="Times New Roman" w:hAnsi="Times New Roman"/>
-                <w:sz w:val="20"/>
+            <w:tcW w:type="dxa" w:w="2262"/>
+            <w:vAlign w:val="center"/>
+            <w:tcMar>
+              <w:top w:w="80" w:type="dxa"/>
+              <w:bottom w:w="80" w:type="dxa"/>
+              <w:left w:w="80" w:type="dxa"/>
+              <w:right w:w="80" w:type="dxa"/>
+            </w:tcMar>
+          </w:tcPr>
+          <w:p>
+            <w:pPr>
+              <w:keepNext w:val="0"/>
+              <w:spacing w:line="252" w:lineRule="auto" w:before="0" w:after="0"/>
+              <w:jc w:val="center"/>
+            </w:pPr>
+            <w:r>
+              <w:rPr>
+                <w:rFonts w:ascii="Times New Roman" w:hAnsi="Times New Roman"/>
+                <w:sz w:val="19"/>
               </w:rPr>
               <w:t xml:space="preserve">0.17 (0.04–0.68)</w:t>
             </w:r>
@@ -5277,7 +5586,7 @@
         </w:tc>
         <w:tc>
           <w:tcPr>
-            <w:tcW w:type="dxa" w:w="2117"/>
+            <w:tcW w:type="dxa" w:w="1560"/>
             <w:vAlign w:val="center"/>
             <w:tcMar>
               <w:top w:w="80" w:type="dxa"/>
@@ -5296,7 +5605,7 @@
               <w:rPr>
                 <w:rFonts w:ascii="Times New Roman" w:hAnsi="Times New Roman"/>
                 <w:b/>
-                <w:sz w:val="20"/>
+                <w:sz w:val="19"/>
               </w:rPr>
               <w:t xml:space="preserve">0.0118</w:t>
             </w:r>
@@ -5304,25 +5613,51 @@
         </w:tc>
         <w:tc>
           <w:tcPr>
-            <w:tcW w:type="dxa" w:w="2117"/>
-            <w:vAlign w:val="center"/>
-            <w:tcMar>
-              <w:top w:w="80" w:type="dxa"/>
-              <w:bottom w:w="80" w:type="dxa"/>
-              <w:left w:w="80" w:type="dxa"/>
-              <w:right w:w="80" w:type="dxa"/>
-            </w:tcMar>
-          </w:tcPr>
-          <w:p>
-            <w:pPr>
-              <w:keepNext w:val="0"/>
-              <w:spacing w:line="252" w:lineRule="auto" w:before="0" w:after="0"/>
-              <w:jc w:val="center"/>
-            </w:pPr>
-            <w:r>
-              <w:rPr>
-                <w:rFonts w:ascii="Times New Roman" w:hAnsi="Times New Roman"/>
-                <w:sz w:val="20"/>
+            <w:tcW w:type="dxa" w:w="1794"/>
+            <w:vAlign w:val="center"/>
+            <w:tcMar>
+              <w:top w:w="80" w:type="dxa"/>
+              <w:bottom w:w="80" w:type="dxa"/>
+              <w:left w:w="80" w:type="dxa"/>
+              <w:right w:w="80" w:type="dxa"/>
+            </w:tcMar>
+          </w:tcPr>
+          <w:p>
+            <w:pPr>
+              <w:keepNext w:val="0"/>
+              <w:spacing w:line="252" w:lineRule="auto" w:before="0" w:after="0"/>
+              <w:jc w:val="center"/>
+            </w:pPr>
+            <w:r>
+              <w:rPr>
+                <w:rFonts w:ascii="Times New Roman" w:hAnsi="Times New Roman"/>
+                <w:sz w:val="19"/>
+              </w:rPr>
+              <w:t xml:space="preserve">&lt;0.001</w:t>
+            </w:r>
+          </w:p>
+        </w:tc>
+        <w:tc>
+          <w:tcPr>
+            <w:tcW w:type="dxa" w:w="1794"/>
+            <w:vAlign w:val="center"/>
+            <w:tcMar>
+              <w:top w:w="80" w:type="dxa"/>
+              <w:bottom w:w="80" w:type="dxa"/>
+              <w:left w:w="80" w:type="dxa"/>
+              <w:right w:w="80" w:type="dxa"/>
+            </w:tcMar>
+          </w:tcPr>
+          <w:p>
+            <w:pPr>
+              <w:keepNext w:val="0"/>
+              <w:spacing w:line="252" w:lineRule="auto" w:before="0" w:after="0"/>
+              <w:jc w:val="center"/>
+            </w:pPr>
+            <w:r>
+              <w:rPr>
+                <w:rFonts w:ascii="Times New Roman" w:hAnsi="Times New Roman"/>
+                <w:sz w:val="19"/>
               </w:rPr>
               <w:t xml:space="preserve">0.022</w:t>
             </w:r>
@@ -5330,25 +5665,25 @@
         </w:tc>
         <w:tc>
           <w:tcPr>
-            <w:tcW w:type="dxa" w:w="2117"/>
-            <w:vAlign w:val="center"/>
-            <w:tcMar>
-              <w:top w:w="80" w:type="dxa"/>
-              <w:bottom w:w="80" w:type="dxa"/>
-              <w:left w:w="80" w:type="dxa"/>
-              <w:right w:w="80" w:type="dxa"/>
-            </w:tcMar>
-          </w:tcPr>
-          <w:p>
-            <w:pPr>
-              <w:keepNext w:val="0"/>
-              <w:spacing w:line="252" w:lineRule="auto" w:before="0" w:after="0"/>
-              <w:jc w:val="center"/>
-            </w:pPr>
-            <w:r>
-              <w:rPr>
-                <w:rFonts w:ascii="Times New Roman" w:hAnsi="Times New Roman"/>
-                <w:sz w:val="20"/>
+            <w:tcW w:type="dxa" w:w="1716"/>
+            <w:vAlign w:val="center"/>
+            <w:tcMar>
+              <w:top w:w="80" w:type="dxa"/>
+              <w:bottom w:w="80" w:type="dxa"/>
+              <w:left w:w="80" w:type="dxa"/>
+              <w:right w:w="80" w:type="dxa"/>
+            </w:tcMar>
+          </w:tcPr>
+          <w:p>
+            <w:pPr>
+              <w:keepNext w:val="0"/>
+              <w:spacing w:line="252" w:lineRule="auto" w:before="0" w:after="0"/>
+              <w:jc w:val="center"/>
+            </w:pPr>
+            <w:r>
+              <w:rPr>
+                <w:rFonts w:ascii="Times New Roman" w:hAnsi="Times New Roman"/>
+                <w:sz w:val="19"/>
               </w:rPr>
               <w:t xml:space="preserve">0.978</w:t>
             </w:r>
@@ -5366,7 +5701,7 @@
         <w:rPr>
           <w:sz w:val="20"/>
         </w:rPr>
-        <w:t xml:space="preserve">ORs are per unit increase in reconstructed, genetically proxied blood expression. Wald ratio was used for one instrument and IVW for multiple instruments.</w:t>
+        <w:t xml:space="preserve">ORs are per approximately one SD higher reconstructed, genetically proxied blood expression. Wald ratio was used for one instrument and IVW for multiple instruments.</w:t>
       </w:r>
       <w:r>
         <w:rPr>
@@ -5392,7 +5727,7 @@
         <w:rPr>
           <w:sz w:val="20"/>
         </w:rPr>
-        <w:t xml:space="preserve">values are two-sided and shown to three significant digits. BBJ discovery significance requires</w:t>
+        <w:t xml:space="preserve">values are two-sided and shown to three significant digits; BBJ discovery significance requires</w:t>
       </w:r>
       <w:r>
         <w:rPr>
@@ -5418,7 +5753,7 @@
         <w:rPr>
           <w:sz w:val="20"/>
         </w:rPr>
-        <w:t xml:space="preserve">&lt; 1.965×10⁻⁵;</w:t>
+        <w:t xml:space="preserve">&lt; 1.965×10⁻⁵, while</w:t>
       </w:r>
       <w:r>
         <w:rPr>
@@ -5444,7 +5779,7 @@
         <w:rPr>
           <w:sz w:val="20"/>
         </w:rPr>
-        <w:t xml:space="preserve">&lt; 0.05 in other outcomes is nominal support. PP.H3 and PP.H4 are the colocalization posterior probabilities of two distinct causal variants and of one shared causal variant; they are model-based measures of support, not</w:t>
+        <w:t xml:space="preserve">&lt; 0.05 in other outcomes is nominal. H2, H3 and H4 denote expression only, distinct variants and a shared variant under the single-causal-variant model; these posterior probabilities are not</w:t>
       </w:r>
       <w:r>
         <w:rPr>
@@ -5470,33 +5805,7 @@
         <w:rPr>
           <w:sz w:val="20"/>
         </w:rPr>
-        <w:t xml:space="preserve">values, and ≥0.80 was the criterion for strong support. The two do not sum to one: the remainder is mostly PP.H2, an expression association without a resolved disease signal, which is why the</w:t>
-      </w:r>
-      <w:r>
-        <w:rPr>
-          <w:sz w:val="20"/>
-        </w:rPr>
-        <w:t xml:space="preserve"> </w:t>
-      </w:r>
-      <w:r>
-        <w:rPr>
-          <w:i/>
-          <w:iCs/>
-          <w:sz w:val="20"/>
-        </w:rPr>
-        <w:t xml:space="preserve">IGF1R</w:t>
-      </w:r>
-      <w:r>
-        <w:rPr>
-          <w:sz w:val="20"/>
-        </w:rPr>
-        <w:t xml:space="preserve"> </w:t>
-      </w:r>
-      <w:r>
-        <w:rPr>
-          <w:sz w:val="20"/>
-        </w:rPr>
-        <w:t xml:space="preserve">results are reported as unresolved rather than as evidence of distinct variants. Full PP.H0–PP.H4 are in Supplementary Data 3. All nine estimates are shown. Sensitivity results are in Tables S1–S3.</w:t>
+        <w:t xml:space="preserve">values. H0/H1 account for any remaining probability. H4 ≥ 0.80 denotes strong shared-variant support. H2 dominance does not prove absence of marginal disease association. For rs179252, the G-allele exposure coefficient was 0.10546; aligned disease log-ORs were −0.22103 (BBJ), −0.25691 (UKB, after scale conversion) and −0.24587 (FinnGen), corresponding to variant-level ORs of 0.802, 0.773 and 0.782. These variant effects and the scaled MR ORs answer different questions. Full probabilities are in Supplementary Data 3; sensitivity results are in Tables S1–S3.</w:t>
       </w:r>
     </w:p>
     <w:p>
@@ -7154,7 +7463,7 @@
                 <w:rFonts w:ascii="Times New Roman" w:hAnsi="Times New Roman"/>
                 <w:sz w:val="20"/>
               </w:rPr>
-              <w:t xml:space="preserve">0.98 (0.97–0.99)</w:t>
+              <w:t xml:space="preserve">0.977 (0.967–0.987)</w:t>
             </w:r>
           </w:p>
         </w:tc>
@@ -7551,7 +7860,7 @@
         <w:rPr>
           <w:sz w:val="20"/>
         </w:rPr>
-        <w:t xml:space="preserve">estimate is 0.977 (0.967–0.987) at three decimals: a precisely estimated but very small per-unit effect, not a weak one. The five MHC genes were not treated as new independent targets. The six additional candidates were TNFSF14, IFNGR1, MAPKAPK5, HSD3B7, VKORC1 and PRSS36; none showed strong shared-variant support in both BBJ and FinnGen. Full outcome comparisons and model probabilities remain in Supplementary Data 2–3.</w:t>
+        <w:t xml:space="preserve">estimate is shown to three decimals to preserve its small effect size. The five MHC genes were not treated as new independent targets. The six additional candidates were TNFSF14, IFNGR1, MAPKAPK5, HSD3B7, VKORC1 and PRSS36; none showed strong shared-variant support in both BBJ and FinnGen. Full outcome comparisons and model probabilities remain in Supplementary Data 2–3.</w:t>
       </w:r>
     </w:p>
     <w:bookmarkEnd w:id="27"/>

</xml_diff>

<commit_message>
Fix portrait table layout and assess additional MR sensitivity analyses
</commit_message>
<xml_diff>
--- a/submission/candidate_20260911_review/MANUSCRIPT_Submission.docx
+++ b/submission/candidate_20260911_review/MANUSCRIPT_Submission.docx
@@ -2752,17 +2752,17 @@
     </w:p>
     <w:tbl>
       <w:tblPr>
-        <w:tblW w:type="dxa" w:w="14818"/>
+        <w:tblW w:type="dxa" w:w="9173"/>
         <w:jc w:val="center"/>
         <w:tblLayout w:type="fixed"/>
         <w:tblLook w:firstColumn="1" w:firstRow="1" w:lastColumn="0" w:lastRow="0" w:noHBand="0" w:noVBand="1" w:val="04A0"/>
       </w:tblPr>
       <w:tblGrid>
-        <w:gridCol w:w="4349"/>
-        <w:gridCol w:w="2899"/>
-        <w:gridCol w:w="1288"/>
-        <w:gridCol w:w="1450"/>
-        <w:gridCol w:w="4832"/>
+        <w:gridCol w:w="2376"/>
+        <w:gridCol w:w="1613"/>
+        <w:gridCol w:w="835"/>
+        <w:gridCol w:w="1008"/>
+        <w:gridCol w:w="3341"/>
       </w:tblGrid>
       <w:tr>
         <w:trPr>
@@ -2771,7 +2771,7 @@
         </w:trPr>
         <w:tc>
           <w:tcPr>
-            <w:tcW w:type="dxa" w:w="4349"/>
+            <w:tcW w:type="dxa" w:w="2376"/>
             <w:vAlign w:val="center"/>
             <w:tcMar>
               <w:top w:w="80" w:type="dxa"/>
@@ -2799,7 +2799,7 @@
         </w:tc>
         <w:tc>
           <w:tcPr>
-            <w:tcW w:type="dxa" w:w="2899"/>
+            <w:tcW w:type="dxa" w:w="1613"/>
             <w:vAlign w:val="center"/>
             <w:tcMar>
               <w:top w:w="80" w:type="dxa"/>
@@ -2827,7 +2827,7 @@
         </w:tc>
         <w:tc>
           <w:tcPr>
-            <w:tcW w:type="dxa" w:w="1288"/>
+            <w:tcW w:type="dxa" w:w="835"/>
             <w:vAlign w:val="center"/>
             <w:tcMar>
               <w:top w:w="80" w:type="dxa"/>
@@ -2855,7 +2855,7 @@
         </w:tc>
         <w:tc>
           <w:tcPr>
-            <w:tcW w:type="dxa" w:w="1450"/>
+            <w:tcW w:type="dxa" w:w="1008"/>
             <w:vAlign w:val="center"/>
             <w:tcMar>
               <w:top w:w="80" w:type="dxa"/>
@@ -2883,7 +2883,7 @@
         </w:tc>
         <w:tc>
           <w:tcPr>
-            <w:tcW w:type="dxa" w:w="4832"/>
+            <w:tcW w:type="dxa" w:w="3341"/>
             <w:vAlign w:val="center"/>
             <w:tcMar>
               <w:top w:w="80" w:type="dxa"/>
@@ -2916,7 +2916,7 @@
         </w:trPr>
         <w:tc>
           <w:tcPr>
-            <w:tcW w:type="dxa" w:w="4349"/>
+            <w:tcW w:type="dxa" w:w="2376"/>
             <w:vAlign w:val="center"/>
             <w:tcMar>
               <w:top w:w="80" w:type="dxa"/>
@@ -2942,7 +2942,7 @@
         </w:tc>
         <w:tc>
           <w:tcPr>
-            <w:tcW w:type="dxa" w:w="2899"/>
+            <w:tcW w:type="dxa" w:w="1613"/>
             <w:vAlign w:val="center"/>
             <w:tcMar>
               <w:top w:w="80" w:type="dxa"/>
@@ -2968,7 +2968,7 @@
         </w:tc>
         <w:tc>
           <w:tcPr>
-            <w:tcW w:type="dxa" w:w="1288"/>
+            <w:tcW w:type="dxa" w:w="835"/>
             <w:vAlign w:val="center"/>
             <w:tcMar>
               <w:top w:w="80" w:type="dxa"/>
@@ -2994,7 +2994,7 @@
         </w:tc>
         <w:tc>
           <w:tcPr>
-            <w:tcW w:type="dxa" w:w="1450"/>
+            <w:tcW w:type="dxa" w:w="1008"/>
             <w:vAlign w:val="center"/>
             <w:tcMar>
               <w:top w:w="80" w:type="dxa"/>
@@ -3020,7 +3020,7 @@
         </w:tc>
         <w:tc>
           <w:tcPr>
-            <w:tcW w:type="dxa" w:w="4832"/>
+            <w:tcW w:type="dxa" w:w="3341"/>
             <w:vAlign w:val="center"/>
             <w:tcMar>
               <w:top w:w="80" w:type="dxa"/>
@@ -3051,7 +3051,7 @@
         </w:trPr>
         <w:tc>
           <w:tcPr>
-            <w:tcW w:type="dxa" w:w="4349"/>
+            <w:tcW w:type="dxa" w:w="2376"/>
             <w:vAlign w:val="center"/>
             <w:tcMar>
               <w:top w:w="80" w:type="dxa"/>
@@ -3077,7 +3077,7 @@
         </w:tc>
         <w:tc>
           <w:tcPr>
-            <w:tcW w:type="dxa" w:w="2899"/>
+            <w:tcW w:type="dxa" w:w="1613"/>
             <w:vAlign w:val="center"/>
             <w:tcMar>
               <w:top w:w="80" w:type="dxa"/>
@@ -3103,7 +3103,7 @@
         </w:tc>
         <w:tc>
           <w:tcPr>
-            <w:tcW w:type="dxa" w:w="1288"/>
+            <w:tcW w:type="dxa" w:w="835"/>
             <w:vAlign w:val="center"/>
             <w:tcMar>
               <w:top w:w="80" w:type="dxa"/>
@@ -3129,7 +3129,7 @@
         </w:tc>
         <w:tc>
           <w:tcPr>
-            <w:tcW w:type="dxa" w:w="1450"/>
+            <w:tcW w:type="dxa" w:w="1008"/>
             <w:vAlign w:val="center"/>
             <w:tcMar>
               <w:top w:w="80" w:type="dxa"/>
@@ -3155,7 +3155,7 @@
         </w:tc>
         <w:tc>
           <w:tcPr>
-            <w:tcW w:type="dxa" w:w="4832"/>
+            <w:tcW w:type="dxa" w:w="3341"/>
             <w:vAlign w:val="center"/>
             <w:tcMar>
               <w:top w:w="80" w:type="dxa"/>
@@ -3186,7 +3186,7 @@
         </w:trPr>
         <w:tc>
           <w:tcPr>
-            <w:tcW w:type="dxa" w:w="4349"/>
+            <w:tcW w:type="dxa" w:w="2376"/>
             <w:vAlign w:val="center"/>
             <w:tcMar>
               <w:top w:w="80" w:type="dxa"/>
@@ -3212,7 +3212,7 @@
         </w:tc>
         <w:tc>
           <w:tcPr>
-            <w:tcW w:type="dxa" w:w="2899"/>
+            <w:tcW w:type="dxa" w:w="1613"/>
             <w:vAlign w:val="center"/>
             <w:tcMar>
               <w:top w:w="80" w:type="dxa"/>
@@ -3238,7 +3238,7 @@
         </w:tc>
         <w:tc>
           <w:tcPr>
-            <w:tcW w:type="dxa" w:w="1288"/>
+            <w:tcW w:type="dxa" w:w="835"/>
             <w:vAlign w:val="center"/>
             <w:tcMar>
               <w:top w:w="80" w:type="dxa"/>
@@ -3264,7 +3264,7 @@
         </w:tc>
         <w:tc>
           <w:tcPr>
-            <w:tcW w:type="dxa" w:w="1450"/>
+            <w:tcW w:type="dxa" w:w="1008"/>
             <w:vAlign w:val="center"/>
             <w:tcMar>
               <w:top w:w="80" w:type="dxa"/>
@@ -3290,7 +3290,7 @@
         </w:tc>
         <w:tc>
           <w:tcPr>
-            <w:tcW w:type="dxa" w:w="4832"/>
+            <w:tcW w:type="dxa" w:w="3341"/>
             <w:vAlign w:val="center"/>
             <w:tcMar>
               <w:top w:w="80" w:type="dxa"/>
@@ -3321,7 +3321,7 @@
         </w:trPr>
         <w:tc>
           <w:tcPr>
-            <w:tcW w:type="dxa" w:w="4349"/>
+            <w:tcW w:type="dxa" w:w="2376"/>
             <w:vAlign w:val="center"/>
             <w:tcMar>
               <w:top w:w="80" w:type="dxa"/>
@@ -3347,7 +3347,7 @@
         </w:tc>
         <w:tc>
           <w:tcPr>
-            <w:tcW w:type="dxa" w:w="2899"/>
+            <w:tcW w:type="dxa" w:w="1613"/>
             <w:vAlign w:val="center"/>
             <w:tcMar>
               <w:top w:w="80" w:type="dxa"/>
@@ -3373,7 +3373,7 @@
         </w:tc>
         <w:tc>
           <w:tcPr>
-            <w:tcW w:type="dxa" w:w="1288"/>
+            <w:tcW w:type="dxa" w:w="835"/>
             <w:vAlign w:val="center"/>
             <w:tcMar>
               <w:top w:w="80" w:type="dxa"/>
@@ -3399,7 +3399,7 @@
         </w:tc>
         <w:tc>
           <w:tcPr>
-            <w:tcW w:type="dxa" w:w="1450"/>
+            <w:tcW w:type="dxa" w:w="1008"/>
             <w:vAlign w:val="center"/>
             <w:tcMar>
               <w:top w:w="80" w:type="dxa"/>
@@ -3425,7 +3425,7 @@
         </w:tc>
         <w:tc>
           <w:tcPr>
-            <w:tcW w:type="dxa" w:w="4832"/>
+            <w:tcW w:type="dxa" w:w="3341"/>
             <w:vAlign w:val="center"/>
             <w:tcMar>
               <w:top w:w="80" w:type="dxa"/>
@@ -3483,20 +3483,20 @@
     </w:p>
     <w:tbl>
       <w:tblPr>
-        <w:tblW w:type="dxa" w:w="14818"/>
+        <w:tblW w:type="dxa" w:w="9173"/>
         <w:jc w:val="center"/>
         <w:tblLayout w:type="fixed"/>
         <w:tblLook w:firstColumn="1" w:firstRow="1" w:lastColumn="0" w:lastRow="0" w:noHBand="0" w:noVBand="1" w:val="04A0"/>
       </w:tblPr>
       <w:tblGrid>
-        <w:gridCol w:w="1092"/>
-        <w:gridCol w:w="3119"/>
-        <w:gridCol w:w="1482"/>
-        <w:gridCol w:w="2262"/>
-        <w:gridCol w:w="1560"/>
-        <w:gridCol w:w="1794"/>
-        <w:gridCol w:w="1794"/>
-        <w:gridCol w:w="1716"/>
+        <w:gridCol w:w="691"/>
+        <w:gridCol w:w="1584"/>
+        <w:gridCol w:w="1296"/>
+        <w:gridCol w:w="1584"/>
+        <w:gridCol w:w="1080"/>
+        <w:gridCol w:w="1080"/>
+        <w:gridCol w:w="965"/>
+        <w:gridCol w:w="893"/>
       </w:tblGrid>
       <w:tr>
         <w:trPr>
@@ -3505,13 +3505,13 @@
         </w:trPr>
         <w:tc>
           <w:tcPr>
-            <w:tcW w:type="dxa" w:w="1092"/>
-            <w:vAlign w:val="center"/>
-            <w:tcMar>
-              <w:top w:w="80" w:type="dxa"/>
-              <w:bottom w:w="80" w:type="dxa"/>
-              <w:left w:w="80" w:type="dxa"/>
-              <w:right w:w="80" w:type="dxa"/>
+            <w:tcW w:type="dxa" w:w="691"/>
+            <w:vAlign w:val="center"/>
+            <w:tcMar>
+              <w:top w:w="80" w:type="dxa"/>
+              <w:bottom w:w="80" w:type="dxa"/>
+              <w:left w:w="40" w:type="dxa"/>
+              <w:right w:w="40" w:type="dxa"/>
             </w:tcMar>
             <w:shd w:fill="EEEEEE"/>
           </w:tcPr>
@@ -3533,7 +3533,7 @@
         </w:tc>
         <w:tc>
           <w:tcPr>
-            <w:tcW w:type="dxa" w:w="3119"/>
+            <w:tcW w:type="dxa" w:w="1584"/>
             <w:vAlign w:val="center"/>
             <w:tcMar>
               <w:top w:w="80" w:type="dxa"/>
@@ -3561,7 +3561,7 @@
         </w:tc>
         <w:tc>
           <w:tcPr>
-            <w:tcW w:type="dxa" w:w="1482"/>
+            <w:tcW w:type="dxa" w:w="1296"/>
             <w:vAlign w:val="center"/>
             <w:tcMar>
               <w:top w:w="80" w:type="dxa"/>
@@ -3589,7 +3589,7 @@
         </w:tc>
         <w:tc>
           <w:tcPr>
-            <w:tcW w:type="dxa" w:w="2262"/>
+            <w:tcW w:type="dxa" w:w="1584"/>
             <w:vAlign w:val="center"/>
             <w:tcMar>
               <w:top w:w="80" w:type="dxa"/>
@@ -3617,7 +3617,7 @@
         </w:tc>
         <w:tc>
           <w:tcPr>
-            <w:tcW w:type="dxa" w:w="1560"/>
+            <w:tcW w:type="dxa" w:w="1080"/>
             <w:vAlign w:val="center"/>
             <w:tcMar>
               <w:top w:w="80" w:type="dxa"/>
@@ -3663,7 +3663,7 @@
         </w:tc>
         <w:tc>
           <w:tcPr>
-            <w:tcW w:type="dxa" w:w="1794"/>
+            <w:tcW w:type="dxa" w:w="1080"/>
             <w:vAlign w:val="center"/>
             <w:tcMar>
               <w:top w:w="80" w:type="dxa"/>
@@ -3691,7 +3691,7 @@
         </w:tc>
         <w:tc>
           <w:tcPr>
-            <w:tcW w:type="dxa" w:w="1794"/>
+            <w:tcW w:type="dxa" w:w="965"/>
             <w:vAlign w:val="center"/>
             <w:tcMar>
               <w:top w:w="80" w:type="dxa"/>
@@ -3719,7 +3719,7 @@
         </w:tc>
         <w:tc>
           <w:tcPr>
-            <w:tcW w:type="dxa" w:w="1716"/>
+            <w:tcW w:type="dxa" w:w="893"/>
             <w:vAlign w:val="center"/>
             <w:tcMar>
               <w:top w:w="80" w:type="dxa"/>
@@ -3752,13 +3752,13 @@
         </w:trPr>
         <w:tc>
           <w:tcPr>
-            <w:tcW w:type="dxa" w:w="1092"/>
-            <w:vAlign w:val="center"/>
-            <w:tcMar>
-              <w:top w:w="80" w:type="dxa"/>
-              <w:bottom w:w="80" w:type="dxa"/>
-              <w:left w:w="80" w:type="dxa"/>
-              <w:right w:w="80" w:type="dxa"/>
+            <w:tcW w:type="dxa" w:w="691"/>
+            <w:vAlign w:val="center"/>
+            <w:tcMar>
+              <w:top w:w="80" w:type="dxa"/>
+              <w:bottom w:w="80" w:type="dxa"/>
+              <w:left w:w="40" w:type="dxa"/>
+              <w:right w:w="40" w:type="dxa"/>
             </w:tcMar>
           </w:tcPr>
           <w:p>
@@ -3780,7 +3780,7 @@
         </w:tc>
         <w:tc>
           <w:tcPr>
-            <w:tcW w:type="dxa" w:w="3119"/>
+            <w:tcW w:type="dxa" w:w="1584"/>
             <w:vAlign w:val="center"/>
             <w:tcMar>
               <w:top w:w="80" w:type="dxa"/>
@@ -3806,7 +3806,7 @@
         </w:tc>
         <w:tc>
           <w:tcPr>
-            <w:tcW w:type="dxa" w:w="1482"/>
+            <w:tcW w:type="dxa" w:w="1296"/>
             <w:vAlign w:val="center"/>
             <w:tcMar>
               <w:top w:w="80" w:type="dxa"/>
@@ -3832,7 +3832,7 @@
         </w:tc>
         <w:tc>
           <w:tcPr>
-            <w:tcW w:type="dxa" w:w="2262"/>
+            <w:tcW w:type="dxa" w:w="1584"/>
             <w:vAlign w:val="center"/>
             <w:tcMar>
               <w:top w:w="80" w:type="dxa"/>
@@ -3858,7 +3858,7 @@
         </w:tc>
         <w:tc>
           <w:tcPr>
-            <w:tcW w:type="dxa" w:w="1560"/>
+            <w:tcW w:type="dxa" w:w="1080"/>
             <w:vAlign w:val="center"/>
             <w:tcMar>
               <w:top w:w="80" w:type="dxa"/>
@@ -3885,7 +3885,7 @@
         </w:tc>
         <w:tc>
           <w:tcPr>
-            <w:tcW w:type="dxa" w:w="1794"/>
+            <w:tcW w:type="dxa" w:w="1080"/>
             <w:vAlign w:val="center"/>
             <w:tcMar>
               <w:top w:w="80" w:type="dxa"/>
@@ -3911,7 +3911,7 @@
         </w:tc>
         <w:tc>
           <w:tcPr>
-            <w:tcW w:type="dxa" w:w="1794"/>
+            <w:tcW w:type="dxa" w:w="965"/>
             <w:vAlign w:val="center"/>
             <w:tcMar>
               <w:top w:w="80" w:type="dxa"/>
@@ -3937,7 +3937,7 @@
         </w:tc>
         <w:tc>
           <w:tcPr>
-            <w:tcW w:type="dxa" w:w="1716"/>
+            <w:tcW w:type="dxa" w:w="893"/>
             <w:vAlign w:val="center"/>
             <w:tcMar>
               <w:top w:w="80" w:type="dxa"/>
@@ -3968,13 +3968,13 @@
         </w:trPr>
         <w:tc>
           <w:tcPr>
-            <w:tcW w:type="dxa" w:w="1092"/>
-            <w:vAlign w:val="center"/>
-            <w:tcMar>
-              <w:top w:w="80" w:type="dxa"/>
-              <w:bottom w:w="80" w:type="dxa"/>
-              <w:left w:w="80" w:type="dxa"/>
-              <w:right w:w="80" w:type="dxa"/>
+            <w:tcW w:type="dxa" w:w="691"/>
+            <w:vAlign w:val="center"/>
+            <w:tcMar>
+              <w:top w:w="80" w:type="dxa"/>
+              <w:bottom w:w="80" w:type="dxa"/>
+              <w:left w:w="40" w:type="dxa"/>
+              <w:right w:w="40" w:type="dxa"/>
             </w:tcMar>
           </w:tcPr>
           <w:p>
@@ -3996,7 +3996,7 @@
         </w:tc>
         <w:tc>
           <w:tcPr>
-            <w:tcW w:type="dxa" w:w="3119"/>
+            <w:tcW w:type="dxa" w:w="1584"/>
             <w:vAlign w:val="center"/>
             <w:tcMar>
               <w:top w:w="80" w:type="dxa"/>
@@ -4022,7 +4022,7 @@
         </w:tc>
         <w:tc>
           <w:tcPr>
-            <w:tcW w:type="dxa" w:w="1482"/>
+            <w:tcW w:type="dxa" w:w="1296"/>
             <w:vAlign w:val="center"/>
             <w:tcMar>
               <w:top w:w="80" w:type="dxa"/>
@@ -4048,7 +4048,7 @@
         </w:tc>
         <w:tc>
           <w:tcPr>
-            <w:tcW w:type="dxa" w:w="2262"/>
+            <w:tcW w:type="dxa" w:w="1584"/>
             <w:vAlign w:val="center"/>
             <w:tcMar>
               <w:top w:w="80" w:type="dxa"/>
@@ -4074,7 +4074,7 @@
         </w:tc>
         <w:tc>
           <w:tcPr>
-            <w:tcW w:type="dxa" w:w="1560"/>
+            <w:tcW w:type="dxa" w:w="1080"/>
             <w:vAlign w:val="center"/>
             <w:tcMar>
               <w:top w:w="80" w:type="dxa"/>
@@ -4101,7 +4101,7 @@
         </w:tc>
         <w:tc>
           <w:tcPr>
-            <w:tcW w:type="dxa" w:w="1794"/>
+            <w:tcW w:type="dxa" w:w="1080"/>
             <w:vAlign w:val="center"/>
             <w:tcMar>
               <w:top w:w="80" w:type="dxa"/>
@@ -4127,7 +4127,7 @@
         </w:tc>
         <w:tc>
           <w:tcPr>
-            <w:tcW w:type="dxa" w:w="1794"/>
+            <w:tcW w:type="dxa" w:w="965"/>
             <w:vAlign w:val="center"/>
             <w:tcMar>
               <w:top w:w="80" w:type="dxa"/>
@@ -4153,7 +4153,7 @@
         </w:tc>
         <w:tc>
           <w:tcPr>
-            <w:tcW w:type="dxa" w:w="1716"/>
+            <w:tcW w:type="dxa" w:w="893"/>
             <w:vAlign w:val="center"/>
             <w:tcMar>
               <w:top w:w="80" w:type="dxa"/>
@@ -4184,13 +4184,13 @@
         </w:trPr>
         <w:tc>
           <w:tcPr>
-            <w:tcW w:type="dxa" w:w="1092"/>
-            <w:vAlign w:val="center"/>
-            <w:tcMar>
-              <w:top w:w="80" w:type="dxa"/>
-              <w:bottom w:w="80" w:type="dxa"/>
-              <w:left w:w="80" w:type="dxa"/>
-              <w:right w:w="80" w:type="dxa"/>
+            <w:tcW w:type="dxa" w:w="691"/>
+            <w:vAlign w:val="center"/>
+            <w:tcMar>
+              <w:top w:w="80" w:type="dxa"/>
+              <w:bottom w:w="80" w:type="dxa"/>
+              <w:left w:w="40" w:type="dxa"/>
+              <w:right w:w="40" w:type="dxa"/>
             </w:tcMar>
           </w:tcPr>
           <w:p>
@@ -4212,7 +4212,7 @@
         </w:tc>
         <w:tc>
           <w:tcPr>
-            <w:tcW w:type="dxa" w:w="3119"/>
+            <w:tcW w:type="dxa" w:w="1584"/>
             <w:vAlign w:val="center"/>
             <w:tcMar>
               <w:top w:w="80" w:type="dxa"/>
@@ -4238,7 +4238,7 @@
         </w:tc>
         <w:tc>
           <w:tcPr>
-            <w:tcW w:type="dxa" w:w="1482"/>
+            <w:tcW w:type="dxa" w:w="1296"/>
             <w:vAlign w:val="center"/>
             <w:tcMar>
               <w:top w:w="80" w:type="dxa"/>
@@ -4264,7 +4264,7 @@
         </w:tc>
         <w:tc>
           <w:tcPr>
-            <w:tcW w:type="dxa" w:w="2262"/>
+            <w:tcW w:type="dxa" w:w="1584"/>
             <w:vAlign w:val="center"/>
             <w:tcMar>
               <w:top w:w="80" w:type="dxa"/>
@@ -4290,7 +4290,7 @@
         </w:tc>
         <w:tc>
           <w:tcPr>
-            <w:tcW w:type="dxa" w:w="1560"/>
+            <w:tcW w:type="dxa" w:w="1080"/>
             <w:vAlign w:val="center"/>
             <w:tcMar>
               <w:top w:w="80" w:type="dxa"/>
@@ -4317,7 +4317,7 @@
         </w:tc>
         <w:tc>
           <w:tcPr>
-            <w:tcW w:type="dxa" w:w="1794"/>
+            <w:tcW w:type="dxa" w:w="1080"/>
             <w:vAlign w:val="center"/>
             <w:tcMar>
               <w:top w:w="80" w:type="dxa"/>
@@ -4343,7 +4343,7 @@
         </w:tc>
         <w:tc>
           <w:tcPr>
-            <w:tcW w:type="dxa" w:w="1794"/>
+            <w:tcW w:type="dxa" w:w="965"/>
             <w:vAlign w:val="center"/>
             <w:tcMar>
               <w:top w:w="80" w:type="dxa"/>
@@ -4369,7 +4369,7 @@
         </w:tc>
         <w:tc>
           <w:tcPr>
-            <w:tcW w:type="dxa" w:w="1716"/>
+            <w:tcW w:type="dxa" w:w="893"/>
             <w:vAlign w:val="center"/>
             <w:tcMar>
               <w:top w:w="80" w:type="dxa"/>
@@ -4400,13 +4400,13 @@
         </w:trPr>
         <w:tc>
           <w:tcPr>
-            <w:tcW w:type="dxa" w:w="1092"/>
-            <w:vAlign w:val="center"/>
-            <w:tcMar>
-              <w:top w:w="80" w:type="dxa"/>
-              <w:bottom w:w="80" w:type="dxa"/>
-              <w:left w:w="80" w:type="dxa"/>
-              <w:right w:w="80" w:type="dxa"/>
+            <w:tcW w:type="dxa" w:w="691"/>
+            <w:vAlign w:val="center"/>
+            <w:tcMar>
+              <w:top w:w="80" w:type="dxa"/>
+              <w:bottom w:w="80" w:type="dxa"/>
+              <w:left w:w="40" w:type="dxa"/>
+              <w:right w:w="40" w:type="dxa"/>
             </w:tcMar>
           </w:tcPr>
           <w:p>
@@ -4428,7 +4428,7 @@
         </w:tc>
         <w:tc>
           <w:tcPr>
-            <w:tcW w:type="dxa" w:w="3119"/>
+            <w:tcW w:type="dxa" w:w="1584"/>
             <w:vAlign w:val="center"/>
             <w:tcMar>
               <w:top w:w="80" w:type="dxa"/>
@@ -4454,7 +4454,7 @@
         </w:tc>
         <w:tc>
           <w:tcPr>
-            <w:tcW w:type="dxa" w:w="1482"/>
+            <w:tcW w:type="dxa" w:w="1296"/>
             <w:vAlign w:val="center"/>
             <w:tcMar>
               <w:top w:w="80" w:type="dxa"/>
@@ -4480,7 +4480,7 @@
         </w:tc>
         <w:tc>
           <w:tcPr>
-            <w:tcW w:type="dxa" w:w="2262"/>
+            <w:tcW w:type="dxa" w:w="1584"/>
             <w:vAlign w:val="center"/>
             <w:tcMar>
               <w:top w:w="80" w:type="dxa"/>
@@ -4506,7 +4506,7 @@
         </w:tc>
         <w:tc>
           <w:tcPr>
-            <w:tcW w:type="dxa" w:w="1560"/>
+            <w:tcW w:type="dxa" w:w="1080"/>
             <w:vAlign w:val="center"/>
             <w:tcMar>
               <w:top w:w="80" w:type="dxa"/>
@@ -4533,7 +4533,7 @@
         </w:tc>
         <w:tc>
           <w:tcPr>
-            <w:tcW w:type="dxa" w:w="1794"/>
+            <w:tcW w:type="dxa" w:w="1080"/>
             <w:vAlign w:val="center"/>
             <w:tcMar>
               <w:top w:w="80" w:type="dxa"/>
@@ -4559,7 +4559,7 @@
         </w:tc>
         <w:tc>
           <w:tcPr>
-            <w:tcW w:type="dxa" w:w="1794"/>
+            <w:tcW w:type="dxa" w:w="965"/>
             <w:vAlign w:val="center"/>
             <w:tcMar>
               <w:top w:w="80" w:type="dxa"/>
@@ -4585,7 +4585,7 @@
         </w:tc>
         <w:tc>
           <w:tcPr>
-            <w:tcW w:type="dxa" w:w="1716"/>
+            <w:tcW w:type="dxa" w:w="893"/>
             <w:vAlign w:val="center"/>
             <w:tcMar>
               <w:top w:w="80" w:type="dxa"/>
@@ -4616,13 +4616,13 @@
         </w:trPr>
         <w:tc>
           <w:tcPr>
-            <w:tcW w:type="dxa" w:w="1092"/>
-            <w:vAlign w:val="center"/>
-            <w:tcMar>
-              <w:top w:w="80" w:type="dxa"/>
-              <w:bottom w:w="80" w:type="dxa"/>
-              <w:left w:w="80" w:type="dxa"/>
-              <w:right w:w="80" w:type="dxa"/>
+            <w:tcW w:type="dxa" w:w="691"/>
+            <w:vAlign w:val="center"/>
+            <w:tcMar>
+              <w:top w:w="80" w:type="dxa"/>
+              <w:bottom w:w="80" w:type="dxa"/>
+              <w:left w:w="40" w:type="dxa"/>
+              <w:right w:w="40" w:type="dxa"/>
             </w:tcMar>
           </w:tcPr>
           <w:p>
@@ -4644,7 +4644,7 @@
         </w:tc>
         <w:tc>
           <w:tcPr>
-            <w:tcW w:type="dxa" w:w="3119"/>
+            <w:tcW w:type="dxa" w:w="1584"/>
             <w:vAlign w:val="center"/>
             <w:tcMar>
               <w:top w:w="80" w:type="dxa"/>
@@ -4670,7 +4670,7 @@
         </w:tc>
         <w:tc>
           <w:tcPr>
-            <w:tcW w:type="dxa" w:w="1482"/>
+            <w:tcW w:type="dxa" w:w="1296"/>
             <w:vAlign w:val="center"/>
             <w:tcMar>
               <w:top w:w="80" w:type="dxa"/>
@@ -4696,7 +4696,7 @@
         </w:tc>
         <w:tc>
           <w:tcPr>
-            <w:tcW w:type="dxa" w:w="2262"/>
+            <w:tcW w:type="dxa" w:w="1584"/>
             <w:vAlign w:val="center"/>
             <w:tcMar>
               <w:top w:w="80" w:type="dxa"/>
@@ -4722,7 +4722,7 @@
         </w:tc>
         <w:tc>
           <w:tcPr>
-            <w:tcW w:type="dxa" w:w="1560"/>
+            <w:tcW w:type="dxa" w:w="1080"/>
             <w:vAlign w:val="center"/>
             <w:tcMar>
               <w:top w:w="80" w:type="dxa"/>
@@ -4749,7 +4749,7 @@
         </w:tc>
         <w:tc>
           <w:tcPr>
-            <w:tcW w:type="dxa" w:w="1794"/>
+            <w:tcW w:type="dxa" w:w="1080"/>
             <w:vAlign w:val="center"/>
             <w:tcMar>
               <w:top w:w="80" w:type="dxa"/>
@@ -4775,7 +4775,7 @@
         </w:tc>
         <w:tc>
           <w:tcPr>
-            <w:tcW w:type="dxa" w:w="1794"/>
+            <w:tcW w:type="dxa" w:w="965"/>
             <w:vAlign w:val="center"/>
             <w:tcMar>
               <w:top w:w="80" w:type="dxa"/>
@@ -4801,7 +4801,7 @@
         </w:tc>
         <w:tc>
           <w:tcPr>
-            <w:tcW w:type="dxa" w:w="1716"/>
+            <w:tcW w:type="dxa" w:w="893"/>
             <w:vAlign w:val="center"/>
             <w:tcMar>
               <w:top w:w="80" w:type="dxa"/>
@@ -4832,13 +4832,13 @@
         </w:trPr>
         <w:tc>
           <w:tcPr>
-            <w:tcW w:type="dxa" w:w="1092"/>
-            <w:vAlign w:val="center"/>
-            <w:tcMar>
-              <w:top w:w="80" w:type="dxa"/>
-              <w:bottom w:w="80" w:type="dxa"/>
-              <w:left w:w="80" w:type="dxa"/>
-              <w:right w:w="80" w:type="dxa"/>
+            <w:tcW w:type="dxa" w:w="691"/>
+            <w:vAlign w:val="center"/>
+            <w:tcMar>
+              <w:top w:w="80" w:type="dxa"/>
+              <w:bottom w:w="80" w:type="dxa"/>
+              <w:left w:w="40" w:type="dxa"/>
+              <w:right w:w="40" w:type="dxa"/>
             </w:tcMar>
           </w:tcPr>
           <w:p>
@@ -4860,7 +4860,7 @@
         </w:tc>
         <w:tc>
           <w:tcPr>
-            <w:tcW w:type="dxa" w:w="3119"/>
+            <w:tcW w:type="dxa" w:w="1584"/>
             <w:vAlign w:val="center"/>
             <w:tcMar>
               <w:top w:w="80" w:type="dxa"/>
@@ -4886,7 +4886,7 @@
         </w:tc>
         <w:tc>
           <w:tcPr>
-            <w:tcW w:type="dxa" w:w="1482"/>
+            <w:tcW w:type="dxa" w:w="1296"/>
             <w:vAlign w:val="center"/>
             <w:tcMar>
               <w:top w:w="80" w:type="dxa"/>
@@ -4912,7 +4912,7 @@
         </w:tc>
         <w:tc>
           <w:tcPr>
-            <w:tcW w:type="dxa" w:w="2262"/>
+            <w:tcW w:type="dxa" w:w="1584"/>
             <w:vAlign w:val="center"/>
             <w:tcMar>
               <w:top w:w="80" w:type="dxa"/>
@@ -4938,7 +4938,7 @@
         </w:tc>
         <w:tc>
           <w:tcPr>
-            <w:tcW w:type="dxa" w:w="1560"/>
+            <w:tcW w:type="dxa" w:w="1080"/>
             <w:vAlign w:val="center"/>
             <w:tcMar>
               <w:top w:w="80" w:type="dxa"/>
@@ -4965,7 +4965,7 @@
         </w:tc>
         <w:tc>
           <w:tcPr>
-            <w:tcW w:type="dxa" w:w="1794"/>
+            <w:tcW w:type="dxa" w:w="1080"/>
             <w:vAlign w:val="center"/>
             <w:tcMar>
               <w:top w:w="80" w:type="dxa"/>
@@ -4991,7 +4991,7 @@
         </w:tc>
         <w:tc>
           <w:tcPr>
-            <w:tcW w:type="dxa" w:w="1794"/>
+            <w:tcW w:type="dxa" w:w="965"/>
             <w:vAlign w:val="center"/>
             <w:tcMar>
               <w:top w:w="80" w:type="dxa"/>
@@ -5017,7 +5017,7 @@
         </w:tc>
         <w:tc>
           <w:tcPr>
-            <w:tcW w:type="dxa" w:w="1716"/>
+            <w:tcW w:type="dxa" w:w="893"/>
             <w:vAlign w:val="center"/>
             <w:tcMar>
               <w:top w:w="80" w:type="dxa"/>
@@ -5048,13 +5048,13 @@
         </w:trPr>
         <w:tc>
           <w:tcPr>
-            <w:tcW w:type="dxa" w:w="1092"/>
-            <w:vAlign w:val="center"/>
-            <w:tcMar>
-              <w:top w:w="80" w:type="dxa"/>
-              <w:bottom w:w="80" w:type="dxa"/>
-              <w:left w:w="80" w:type="dxa"/>
-              <w:right w:w="80" w:type="dxa"/>
+            <w:tcW w:type="dxa" w:w="691"/>
+            <w:vAlign w:val="center"/>
+            <w:tcMar>
+              <w:top w:w="80" w:type="dxa"/>
+              <w:bottom w:w="80" w:type="dxa"/>
+              <w:left w:w="40" w:type="dxa"/>
+              <w:right w:w="40" w:type="dxa"/>
             </w:tcMar>
           </w:tcPr>
           <w:p>
@@ -5076,7 +5076,7 @@
         </w:tc>
         <w:tc>
           <w:tcPr>
-            <w:tcW w:type="dxa" w:w="3119"/>
+            <w:tcW w:type="dxa" w:w="1584"/>
             <w:vAlign w:val="center"/>
             <w:tcMar>
               <w:top w:w="80" w:type="dxa"/>
@@ -5102,7 +5102,7 @@
         </w:tc>
         <w:tc>
           <w:tcPr>
-            <w:tcW w:type="dxa" w:w="1482"/>
+            <w:tcW w:type="dxa" w:w="1296"/>
             <w:vAlign w:val="center"/>
             <w:tcMar>
               <w:top w:w="80" w:type="dxa"/>
@@ -5128,7 +5128,7 @@
         </w:tc>
         <w:tc>
           <w:tcPr>
-            <w:tcW w:type="dxa" w:w="2262"/>
+            <w:tcW w:type="dxa" w:w="1584"/>
             <w:vAlign w:val="center"/>
             <w:tcMar>
               <w:top w:w="80" w:type="dxa"/>
@@ -5154,7 +5154,7 @@
         </w:tc>
         <w:tc>
           <w:tcPr>
-            <w:tcW w:type="dxa" w:w="1560"/>
+            <w:tcW w:type="dxa" w:w="1080"/>
             <w:vAlign w:val="center"/>
             <w:tcMar>
               <w:top w:w="80" w:type="dxa"/>
@@ -5181,7 +5181,7 @@
         </w:tc>
         <w:tc>
           <w:tcPr>
-            <w:tcW w:type="dxa" w:w="1794"/>
+            <w:tcW w:type="dxa" w:w="1080"/>
             <w:vAlign w:val="center"/>
             <w:tcMar>
               <w:top w:w="80" w:type="dxa"/>
@@ -5207,7 +5207,7 @@
         </w:tc>
         <w:tc>
           <w:tcPr>
-            <w:tcW w:type="dxa" w:w="1794"/>
+            <w:tcW w:type="dxa" w:w="965"/>
             <w:vAlign w:val="center"/>
             <w:tcMar>
               <w:top w:w="80" w:type="dxa"/>
@@ -5233,7 +5233,7 @@
         </w:tc>
         <w:tc>
           <w:tcPr>
-            <w:tcW w:type="dxa" w:w="1716"/>
+            <w:tcW w:type="dxa" w:w="893"/>
             <w:vAlign w:val="center"/>
             <w:tcMar>
               <w:top w:w="80" w:type="dxa"/>
@@ -5264,13 +5264,13 @@
         </w:trPr>
         <w:tc>
           <w:tcPr>
-            <w:tcW w:type="dxa" w:w="1092"/>
-            <w:vAlign w:val="center"/>
-            <w:tcMar>
-              <w:top w:w="80" w:type="dxa"/>
-              <w:bottom w:w="80" w:type="dxa"/>
-              <w:left w:w="80" w:type="dxa"/>
-              <w:right w:w="80" w:type="dxa"/>
+            <w:tcW w:type="dxa" w:w="691"/>
+            <w:vAlign w:val="center"/>
+            <w:tcMar>
+              <w:top w:w="80" w:type="dxa"/>
+              <w:bottom w:w="80" w:type="dxa"/>
+              <w:left w:w="40" w:type="dxa"/>
+              <w:right w:w="40" w:type="dxa"/>
             </w:tcMar>
           </w:tcPr>
           <w:p>
@@ -5292,7 +5292,7 @@
         </w:tc>
         <w:tc>
           <w:tcPr>
-            <w:tcW w:type="dxa" w:w="3119"/>
+            <w:tcW w:type="dxa" w:w="1584"/>
             <w:vAlign w:val="center"/>
             <w:tcMar>
               <w:top w:w="80" w:type="dxa"/>
@@ -5318,7 +5318,7 @@
         </w:tc>
         <w:tc>
           <w:tcPr>
-            <w:tcW w:type="dxa" w:w="1482"/>
+            <w:tcW w:type="dxa" w:w="1296"/>
             <w:vAlign w:val="center"/>
             <w:tcMar>
               <w:top w:w="80" w:type="dxa"/>
@@ -5344,7 +5344,7 @@
         </w:tc>
         <w:tc>
           <w:tcPr>
-            <w:tcW w:type="dxa" w:w="2262"/>
+            <w:tcW w:type="dxa" w:w="1584"/>
             <w:vAlign w:val="center"/>
             <w:tcMar>
               <w:top w:w="80" w:type="dxa"/>
@@ -5370,7 +5370,7 @@
         </w:tc>
         <w:tc>
           <w:tcPr>
-            <w:tcW w:type="dxa" w:w="1560"/>
+            <w:tcW w:type="dxa" w:w="1080"/>
             <w:vAlign w:val="center"/>
             <w:tcMar>
               <w:top w:w="80" w:type="dxa"/>
@@ -5397,7 +5397,7 @@
         </w:tc>
         <w:tc>
           <w:tcPr>
-            <w:tcW w:type="dxa" w:w="1794"/>
+            <w:tcW w:type="dxa" w:w="1080"/>
             <w:vAlign w:val="center"/>
             <w:tcMar>
               <w:top w:w="80" w:type="dxa"/>
@@ -5423,7 +5423,7 @@
         </w:tc>
         <w:tc>
           <w:tcPr>
-            <w:tcW w:type="dxa" w:w="1794"/>
+            <w:tcW w:type="dxa" w:w="965"/>
             <w:vAlign w:val="center"/>
             <w:tcMar>
               <w:top w:w="80" w:type="dxa"/>
@@ -5449,7 +5449,7 @@
         </w:tc>
         <w:tc>
           <w:tcPr>
-            <w:tcW w:type="dxa" w:w="1716"/>
+            <w:tcW w:type="dxa" w:w="893"/>
             <w:vAlign w:val="center"/>
             <w:tcMar>
               <w:top w:w="80" w:type="dxa"/>
@@ -5480,13 +5480,13 @@
         </w:trPr>
         <w:tc>
           <w:tcPr>
-            <w:tcW w:type="dxa" w:w="1092"/>
-            <w:vAlign w:val="center"/>
-            <w:tcMar>
-              <w:top w:w="80" w:type="dxa"/>
-              <w:bottom w:w="80" w:type="dxa"/>
-              <w:left w:w="80" w:type="dxa"/>
-              <w:right w:w="80" w:type="dxa"/>
+            <w:tcW w:type="dxa" w:w="691"/>
+            <w:vAlign w:val="center"/>
+            <w:tcMar>
+              <w:top w:w="80" w:type="dxa"/>
+              <w:bottom w:w="80" w:type="dxa"/>
+              <w:left w:w="40" w:type="dxa"/>
+              <w:right w:w="40" w:type="dxa"/>
             </w:tcMar>
           </w:tcPr>
           <w:p>
@@ -5508,7 +5508,7 @@
         </w:tc>
         <w:tc>
           <w:tcPr>
-            <w:tcW w:type="dxa" w:w="3119"/>
+            <w:tcW w:type="dxa" w:w="1584"/>
             <w:vAlign w:val="center"/>
             <w:tcMar>
               <w:top w:w="80" w:type="dxa"/>
@@ -5534,7 +5534,7 @@
         </w:tc>
         <w:tc>
           <w:tcPr>
-            <w:tcW w:type="dxa" w:w="1482"/>
+            <w:tcW w:type="dxa" w:w="1296"/>
             <w:vAlign w:val="center"/>
             <w:tcMar>
               <w:top w:w="80" w:type="dxa"/>
@@ -5560,7 +5560,7 @@
         </w:tc>
         <w:tc>
           <w:tcPr>
-            <w:tcW w:type="dxa" w:w="2262"/>
+            <w:tcW w:type="dxa" w:w="1584"/>
             <w:vAlign w:val="center"/>
             <w:tcMar>
               <w:top w:w="80" w:type="dxa"/>
@@ -5586,7 +5586,7 @@
         </w:tc>
         <w:tc>
           <w:tcPr>
-            <w:tcW w:type="dxa" w:w="1560"/>
+            <w:tcW w:type="dxa" w:w="1080"/>
             <w:vAlign w:val="center"/>
             <w:tcMar>
               <w:top w:w="80" w:type="dxa"/>
@@ -5613,7 +5613,7 @@
         </w:tc>
         <w:tc>
           <w:tcPr>
-            <w:tcW w:type="dxa" w:w="1794"/>
+            <w:tcW w:type="dxa" w:w="1080"/>
             <w:vAlign w:val="center"/>
             <w:tcMar>
               <w:top w:w="80" w:type="dxa"/>
@@ -5639,7 +5639,7 @@
         </w:tc>
         <w:tc>
           <w:tcPr>
-            <w:tcW w:type="dxa" w:w="1794"/>
+            <w:tcW w:type="dxa" w:w="965"/>
             <w:vAlign w:val="center"/>
             <w:tcMar>
               <w:top w:w="80" w:type="dxa"/>
@@ -5665,7 +5665,7 @@
         </w:tc>
         <w:tc>
           <w:tcPr>
-            <w:tcW w:type="dxa" w:w="1716"/>
+            <w:tcW w:type="dxa" w:w="893"/>
             <w:vAlign w:val="center"/>
             <w:tcMar>
               <w:top w:w="80" w:type="dxa"/>
@@ -5827,17 +5827,17 @@
     </w:p>
     <w:tbl>
       <w:tblPr>
-        <w:tblW w:type="dxa" w:w="14818"/>
+        <w:tblW w:type="dxa" w:w="9173"/>
         <w:jc w:val="center"/>
         <w:tblLayout w:type="fixed"/>
         <w:tblLook w:firstColumn="1" w:firstRow="1" w:lastColumn="0" w:lastRow="0" w:noHBand="0" w:noVBand="1" w:val="04A0"/>
       </w:tblPr>
       <w:tblGrid>
-        <w:gridCol w:w="1674"/>
-        <w:gridCol w:w="1339"/>
-        <w:gridCol w:w="4018"/>
-        <w:gridCol w:w="1758"/>
-        <w:gridCol w:w="6027"/>
+        <w:gridCol w:w="1195"/>
+        <w:gridCol w:w="1368"/>
+        <w:gridCol w:w="1901"/>
+        <w:gridCol w:w="1267"/>
+        <w:gridCol w:w="3442"/>
       </w:tblGrid>
       <w:tr>
         <w:trPr>
@@ -5846,7 +5846,7 @@
         </w:trPr>
         <w:tc>
           <w:tcPr>
-            <w:tcW w:type="dxa" w:w="1674"/>
+            <w:tcW w:type="dxa" w:w="1195"/>
             <w:vAlign w:val="center"/>
             <w:tcMar>
               <w:top w:w="80" w:type="dxa"/>
@@ -5874,7 +5874,7 @@
         </w:tc>
         <w:tc>
           <w:tcPr>
-            <w:tcW w:type="dxa" w:w="1339"/>
+            <w:tcW w:type="dxa" w:w="1368"/>
             <w:vAlign w:val="center"/>
             <w:tcMar>
               <w:top w:w="80" w:type="dxa"/>
@@ -5902,7 +5902,7 @@
         </w:tc>
         <w:tc>
           <w:tcPr>
-            <w:tcW w:type="dxa" w:w="4018"/>
+            <w:tcW w:type="dxa" w:w="1901"/>
             <w:vAlign w:val="center"/>
             <w:tcMar>
               <w:top w:w="80" w:type="dxa"/>
@@ -5930,7 +5930,7 @@
         </w:tc>
         <w:tc>
           <w:tcPr>
-            <w:tcW w:type="dxa" w:w="1758"/>
+            <w:tcW w:type="dxa" w:w="1267"/>
             <w:vAlign w:val="center"/>
             <w:tcMar>
               <w:top w:w="80" w:type="dxa"/>
@@ -5976,7 +5976,7 @@
         </w:tc>
         <w:tc>
           <w:tcPr>
-            <w:tcW w:type="dxa" w:w="6027"/>
+            <w:tcW w:type="dxa" w:w="3442"/>
             <w:vAlign w:val="center"/>
             <w:tcMar>
               <w:top w:w="80" w:type="dxa"/>
@@ -6009,7 +6009,7 @@
         </w:trPr>
         <w:tc>
           <w:tcPr>
-            <w:tcW w:type="dxa" w:w="1674"/>
+            <w:tcW w:type="dxa" w:w="1195"/>
             <w:vAlign w:val="center"/>
             <w:tcMar>
               <w:top w:w="80" w:type="dxa"/>
@@ -6037,7 +6037,7 @@
         </w:tc>
         <w:tc>
           <w:tcPr>
-            <w:tcW w:type="dxa" w:w="1339"/>
+            <w:tcW w:type="dxa" w:w="1368"/>
             <w:vAlign w:val="center"/>
             <w:tcMar>
               <w:top w:w="80" w:type="dxa"/>
@@ -6063,7 +6063,7 @@
         </w:tc>
         <w:tc>
           <w:tcPr>
-            <w:tcW w:type="dxa" w:w="4018"/>
+            <w:tcW w:type="dxa" w:w="1901"/>
             <w:vAlign w:val="center"/>
             <w:tcMar>
               <w:top w:w="80" w:type="dxa"/>
@@ -6089,7 +6089,7 @@
         </w:tc>
         <w:tc>
           <w:tcPr>
-            <w:tcW w:type="dxa" w:w="1758"/>
+            <w:tcW w:type="dxa" w:w="1267"/>
             <w:vAlign w:val="center"/>
             <w:tcMar>
               <w:top w:w="80" w:type="dxa"/>
@@ -6116,7 +6116,7 @@
         </w:tc>
         <w:tc>
           <w:tcPr>
-            <w:tcW w:type="dxa" w:w="6027"/>
+            <w:tcW w:type="dxa" w:w="3442"/>
             <w:vAlign w:val="center"/>
             <w:tcMar>
               <w:top w:w="80" w:type="dxa"/>
@@ -6147,7 +6147,7 @@
         </w:trPr>
         <w:tc>
           <w:tcPr>
-            <w:tcW w:type="dxa" w:w="1674"/>
+            <w:tcW w:type="dxa" w:w="1195"/>
             <w:vAlign w:val="center"/>
             <w:tcMar>
               <w:top w:w="80" w:type="dxa"/>
@@ -6175,7 +6175,7 @@
         </w:tc>
         <w:tc>
           <w:tcPr>
-            <w:tcW w:type="dxa" w:w="1339"/>
+            <w:tcW w:type="dxa" w:w="1368"/>
             <w:vAlign w:val="center"/>
             <w:tcMar>
               <w:top w:w="80" w:type="dxa"/>
@@ -6201,7 +6201,7 @@
         </w:tc>
         <w:tc>
           <w:tcPr>
-            <w:tcW w:type="dxa" w:w="4018"/>
+            <w:tcW w:type="dxa" w:w="1901"/>
             <w:vAlign w:val="center"/>
             <w:tcMar>
               <w:top w:w="80" w:type="dxa"/>
@@ -6227,7 +6227,7 @@
         </w:tc>
         <w:tc>
           <w:tcPr>
-            <w:tcW w:type="dxa" w:w="1758"/>
+            <w:tcW w:type="dxa" w:w="1267"/>
             <w:vAlign w:val="center"/>
             <w:tcMar>
               <w:top w:w="80" w:type="dxa"/>
@@ -6254,7 +6254,7 @@
         </w:tc>
         <w:tc>
           <w:tcPr>
-            <w:tcW w:type="dxa" w:w="6027"/>
+            <w:tcW w:type="dxa" w:w="3442"/>
             <w:vAlign w:val="center"/>
             <w:tcMar>
               <w:top w:w="80" w:type="dxa"/>
@@ -6285,7 +6285,7 @@
         </w:trPr>
         <w:tc>
           <w:tcPr>
-            <w:tcW w:type="dxa" w:w="1674"/>
+            <w:tcW w:type="dxa" w:w="1195"/>
             <w:vAlign w:val="center"/>
             <w:tcMar>
               <w:top w:w="80" w:type="dxa"/>
@@ -6313,7 +6313,7 @@
         </w:tc>
         <w:tc>
           <w:tcPr>
-            <w:tcW w:type="dxa" w:w="1339"/>
+            <w:tcW w:type="dxa" w:w="1368"/>
             <w:vAlign w:val="center"/>
             <w:tcMar>
               <w:top w:w="80" w:type="dxa"/>
@@ -6339,7 +6339,7 @@
         </w:tc>
         <w:tc>
           <w:tcPr>
-            <w:tcW w:type="dxa" w:w="4018"/>
+            <w:tcW w:type="dxa" w:w="1901"/>
             <w:vAlign w:val="center"/>
             <w:tcMar>
               <w:top w:w="80" w:type="dxa"/>
@@ -6365,7 +6365,7 @@
         </w:tc>
         <w:tc>
           <w:tcPr>
-            <w:tcW w:type="dxa" w:w="1758"/>
+            <w:tcW w:type="dxa" w:w="1267"/>
             <w:vAlign w:val="center"/>
             <w:tcMar>
               <w:top w:w="80" w:type="dxa"/>
@@ -6392,7 +6392,7 @@
         </w:tc>
         <w:tc>
           <w:tcPr>
-            <w:tcW w:type="dxa" w:w="6027"/>
+            <w:tcW w:type="dxa" w:w="3442"/>
             <w:vAlign w:val="center"/>
             <w:tcMar>
               <w:top w:w="80" w:type="dxa"/>
@@ -6423,7 +6423,7 @@
         </w:trPr>
         <w:tc>
           <w:tcPr>
-            <w:tcW w:type="dxa" w:w="1674"/>
+            <w:tcW w:type="dxa" w:w="1195"/>
             <w:vAlign w:val="center"/>
             <w:tcMar>
               <w:top w:w="80" w:type="dxa"/>
@@ -6451,7 +6451,7 @@
         </w:tc>
         <w:tc>
           <w:tcPr>
-            <w:tcW w:type="dxa" w:w="1339"/>
+            <w:tcW w:type="dxa" w:w="1368"/>
             <w:vAlign w:val="center"/>
             <w:tcMar>
               <w:top w:w="80" w:type="dxa"/>
@@ -6477,7 +6477,7 @@
         </w:tc>
         <w:tc>
           <w:tcPr>
-            <w:tcW w:type="dxa" w:w="4018"/>
+            <w:tcW w:type="dxa" w:w="1901"/>
             <w:vAlign w:val="center"/>
             <w:tcMar>
               <w:top w:w="80" w:type="dxa"/>
@@ -6503,7 +6503,7 @@
         </w:tc>
         <w:tc>
           <w:tcPr>
-            <w:tcW w:type="dxa" w:w="1758"/>
+            <w:tcW w:type="dxa" w:w="1267"/>
             <w:vAlign w:val="center"/>
             <w:tcMar>
               <w:top w:w="80" w:type="dxa"/>
@@ -6530,7 +6530,7 @@
         </w:tc>
         <w:tc>
           <w:tcPr>
-            <w:tcW w:type="dxa" w:w="6027"/>
+            <w:tcW w:type="dxa" w:w="3442"/>
             <w:vAlign w:val="center"/>
             <w:tcMar>
               <w:top w:w="80" w:type="dxa"/>
@@ -6561,7 +6561,7 @@
         </w:trPr>
         <w:tc>
           <w:tcPr>
-            <w:tcW w:type="dxa" w:w="1674"/>
+            <w:tcW w:type="dxa" w:w="1195"/>
             <w:vAlign w:val="center"/>
             <w:tcMar>
               <w:top w:w="80" w:type="dxa"/>
@@ -6589,7 +6589,7 @@
         </w:tc>
         <w:tc>
           <w:tcPr>
-            <w:tcW w:type="dxa" w:w="1339"/>
+            <w:tcW w:type="dxa" w:w="1368"/>
             <w:vAlign w:val="center"/>
             <w:tcMar>
               <w:top w:w="80" w:type="dxa"/>
@@ -6615,7 +6615,7 @@
         </w:tc>
         <w:tc>
           <w:tcPr>
-            <w:tcW w:type="dxa" w:w="4018"/>
+            <w:tcW w:type="dxa" w:w="1901"/>
             <w:vAlign w:val="center"/>
             <w:tcMar>
               <w:top w:w="80" w:type="dxa"/>
@@ -6641,7 +6641,7 @@
         </w:tc>
         <w:tc>
           <w:tcPr>
-            <w:tcW w:type="dxa" w:w="1758"/>
+            <w:tcW w:type="dxa" w:w="1267"/>
             <w:vAlign w:val="center"/>
             <w:tcMar>
               <w:top w:w="80" w:type="dxa"/>
@@ -6668,7 +6668,7 @@
         </w:tc>
         <w:tc>
           <w:tcPr>
-            <w:tcW w:type="dxa" w:w="6027"/>
+            <w:tcW w:type="dxa" w:w="3442"/>
             <w:vAlign w:val="center"/>
             <w:tcMar>
               <w:top w:w="80" w:type="dxa"/>
@@ -6699,7 +6699,7 @@
         </w:trPr>
         <w:tc>
           <w:tcPr>
-            <w:tcW w:type="dxa" w:w="1674"/>
+            <w:tcW w:type="dxa" w:w="1195"/>
             <w:vAlign w:val="center"/>
             <w:tcMar>
               <w:top w:w="80" w:type="dxa"/>
@@ -6727,7 +6727,7 @@
         </w:tc>
         <w:tc>
           <w:tcPr>
-            <w:tcW w:type="dxa" w:w="1339"/>
+            <w:tcW w:type="dxa" w:w="1368"/>
             <w:vAlign w:val="center"/>
             <w:tcMar>
               <w:top w:w="80" w:type="dxa"/>
@@ -6753,7 +6753,7 @@
         </w:tc>
         <w:tc>
           <w:tcPr>
-            <w:tcW w:type="dxa" w:w="4018"/>
+            <w:tcW w:type="dxa" w:w="1901"/>
             <w:vAlign w:val="center"/>
             <w:tcMar>
               <w:top w:w="80" w:type="dxa"/>
@@ -6779,7 +6779,7 @@
         </w:tc>
         <w:tc>
           <w:tcPr>
-            <w:tcW w:type="dxa" w:w="1758"/>
+            <w:tcW w:type="dxa" w:w="1267"/>
             <w:vAlign w:val="center"/>
             <w:tcMar>
               <w:top w:w="80" w:type="dxa"/>
@@ -6806,7 +6806,7 @@
         </w:tc>
         <w:tc>
           <w:tcPr>
-            <w:tcW w:type="dxa" w:w="6027"/>
+            <w:tcW w:type="dxa" w:w="3442"/>
             <w:vAlign w:val="center"/>
             <w:tcMar>
               <w:top w:w="80" w:type="dxa"/>
@@ -6837,7 +6837,7 @@
         </w:trPr>
         <w:tc>
           <w:tcPr>
-            <w:tcW w:type="dxa" w:w="1674"/>
+            <w:tcW w:type="dxa" w:w="1195"/>
             <w:vAlign w:val="center"/>
             <w:tcMar>
               <w:top w:w="80" w:type="dxa"/>
@@ -6865,7 +6865,7 @@
         </w:tc>
         <w:tc>
           <w:tcPr>
-            <w:tcW w:type="dxa" w:w="1339"/>
+            <w:tcW w:type="dxa" w:w="1368"/>
             <w:vAlign w:val="center"/>
             <w:tcMar>
               <w:top w:w="80" w:type="dxa"/>
@@ -6891,7 +6891,7 @@
         </w:tc>
         <w:tc>
           <w:tcPr>
-            <w:tcW w:type="dxa" w:w="4018"/>
+            <w:tcW w:type="dxa" w:w="1901"/>
             <w:vAlign w:val="center"/>
             <w:tcMar>
               <w:top w:w="80" w:type="dxa"/>
@@ -6917,7 +6917,7 @@
         </w:tc>
         <w:tc>
           <w:tcPr>
-            <w:tcW w:type="dxa" w:w="1758"/>
+            <w:tcW w:type="dxa" w:w="1267"/>
             <w:vAlign w:val="center"/>
             <w:tcMar>
               <w:top w:w="80" w:type="dxa"/>
@@ -6944,7 +6944,7 @@
         </w:tc>
         <w:tc>
           <w:tcPr>
-            <w:tcW w:type="dxa" w:w="6027"/>
+            <w:tcW w:type="dxa" w:w="3442"/>
             <w:vAlign w:val="center"/>
             <w:tcMar>
               <w:top w:w="80" w:type="dxa"/>
@@ -6975,7 +6975,7 @@
         </w:trPr>
         <w:tc>
           <w:tcPr>
-            <w:tcW w:type="dxa" w:w="1674"/>
+            <w:tcW w:type="dxa" w:w="1195"/>
             <w:vAlign w:val="center"/>
             <w:tcMar>
               <w:top w:w="80" w:type="dxa"/>
@@ -7003,7 +7003,7 @@
         </w:tc>
         <w:tc>
           <w:tcPr>
-            <w:tcW w:type="dxa" w:w="1339"/>
+            <w:tcW w:type="dxa" w:w="1368"/>
             <w:vAlign w:val="center"/>
             <w:tcMar>
               <w:top w:w="80" w:type="dxa"/>
@@ -7029,7 +7029,7 @@
         </w:tc>
         <w:tc>
           <w:tcPr>
-            <w:tcW w:type="dxa" w:w="4018"/>
+            <w:tcW w:type="dxa" w:w="1901"/>
             <w:vAlign w:val="center"/>
             <w:tcMar>
               <w:top w:w="80" w:type="dxa"/>
@@ -7055,7 +7055,7 @@
         </w:tc>
         <w:tc>
           <w:tcPr>
-            <w:tcW w:type="dxa" w:w="1758"/>
+            <w:tcW w:type="dxa" w:w="1267"/>
             <w:vAlign w:val="center"/>
             <w:tcMar>
               <w:top w:w="80" w:type="dxa"/>
@@ -7082,7 +7082,7 @@
         </w:tc>
         <w:tc>
           <w:tcPr>
-            <w:tcW w:type="dxa" w:w="6027"/>
+            <w:tcW w:type="dxa" w:w="3442"/>
             <w:vAlign w:val="center"/>
             <w:tcMar>
               <w:top w:w="80" w:type="dxa"/>
@@ -7113,7 +7113,7 @@
         </w:trPr>
         <w:tc>
           <w:tcPr>
-            <w:tcW w:type="dxa" w:w="1674"/>
+            <w:tcW w:type="dxa" w:w="1195"/>
             <w:vAlign w:val="center"/>
             <w:tcMar>
               <w:top w:w="80" w:type="dxa"/>
@@ -7141,7 +7141,7 @@
         </w:tc>
         <w:tc>
           <w:tcPr>
-            <w:tcW w:type="dxa" w:w="1339"/>
+            <w:tcW w:type="dxa" w:w="1368"/>
             <w:vAlign w:val="center"/>
             <w:tcMar>
               <w:top w:w="80" w:type="dxa"/>
@@ -7167,7 +7167,7 @@
         </w:tc>
         <w:tc>
           <w:tcPr>
-            <w:tcW w:type="dxa" w:w="4018"/>
+            <w:tcW w:type="dxa" w:w="1901"/>
             <w:vAlign w:val="center"/>
             <w:tcMar>
               <w:top w:w="80" w:type="dxa"/>
@@ -7193,7 +7193,7 @@
         </w:tc>
         <w:tc>
           <w:tcPr>
-            <w:tcW w:type="dxa" w:w="1758"/>
+            <w:tcW w:type="dxa" w:w="1267"/>
             <w:vAlign w:val="center"/>
             <w:tcMar>
               <w:top w:w="80" w:type="dxa"/>
@@ -7220,7 +7220,7 @@
         </w:tc>
         <w:tc>
           <w:tcPr>
-            <w:tcW w:type="dxa" w:w="6027"/>
+            <w:tcW w:type="dxa" w:w="3442"/>
             <w:vAlign w:val="center"/>
             <w:tcMar>
               <w:top w:w="80" w:type="dxa"/>
@@ -7251,7 +7251,7 @@
         </w:trPr>
         <w:tc>
           <w:tcPr>
-            <w:tcW w:type="dxa" w:w="1674"/>
+            <w:tcW w:type="dxa" w:w="1195"/>
             <w:vAlign w:val="center"/>
             <w:tcMar>
               <w:top w:w="80" w:type="dxa"/>
@@ -7279,7 +7279,7 @@
         </w:tc>
         <w:tc>
           <w:tcPr>
-            <w:tcW w:type="dxa" w:w="1339"/>
+            <w:tcW w:type="dxa" w:w="1368"/>
             <w:vAlign w:val="center"/>
             <w:tcMar>
               <w:top w:w="80" w:type="dxa"/>
@@ -7305,7 +7305,7 @@
         </w:tc>
         <w:tc>
           <w:tcPr>
-            <w:tcW w:type="dxa" w:w="4018"/>
+            <w:tcW w:type="dxa" w:w="1901"/>
             <w:vAlign w:val="center"/>
             <w:tcMar>
               <w:top w:w="80" w:type="dxa"/>
@@ -7331,7 +7331,7 @@
         </w:tc>
         <w:tc>
           <w:tcPr>
-            <w:tcW w:type="dxa" w:w="1758"/>
+            <w:tcW w:type="dxa" w:w="1267"/>
             <w:vAlign w:val="center"/>
             <w:tcMar>
               <w:top w:w="80" w:type="dxa"/>
@@ -7358,7 +7358,7 @@
         </w:tc>
         <w:tc>
           <w:tcPr>
-            <w:tcW w:type="dxa" w:w="6027"/>
+            <w:tcW w:type="dxa" w:w="3442"/>
             <w:vAlign w:val="center"/>
             <w:tcMar>
               <w:top w:w="80" w:type="dxa"/>
@@ -7389,7 +7389,7 @@
         </w:trPr>
         <w:tc>
           <w:tcPr>
-            <w:tcW w:type="dxa" w:w="1674"/>
+            <w:tcW w:type="dxa" w:w="1195"/>
             <w:vAlign w:val="center"/>
             <w:tcMar>
               <w:top w:w="80" w:type="dxa"/>
@@ -7417,7 +7417,7 @@
         </w:tc>
         <w:tc>
           <w:tcPr>
-            <w:tcW w:type="dxa" w:w="1339"/>
+            <w:tcW w:type="dxa" w:w="1368"/>
             <w:vAlign w:val="center"/>
             <w:tcMar>
               <w:top w:w="80" w:type="dxa"/>
@@ -7443,7 +7443,7 @@
         </w:tc>
         <w:tc>
           <w:tcPr>
-            <w:tcW w:type="dxa" w:w="4018"/>
+            <w:tcW w:type="dxa" w:w="1901"/>
             <w:vAlign w:val="center"/>
             <w:tcMar>
               <w:top w:w="80" w:type="dxa"/>
@@ -7469,7 +7469,7 @@
         </w:tc>
         <w:tc>
           <w:tcPr>
-            <w:tcW w:type="dxa" w:w="1758"/>
+            <w:tcW w:type="dxa" w:w="1267"/>
             <w:vAlign w:val="center"/>
             <w:tcMar>
               <w:top w:w="80" w:type="dxa"/>
@@ -7496,7 +7496,7 @@
         </w:tc>
         <w:tc>
           <w:tcPr>
-            <w:tcW w:type="dxa" w:w="6027"/>
+            <w:tcW w:type="dxa" w:w="3442"/>
             <w:vAlign w:val="center"/>
             <w:tcMar>
               <w:top w:w="80" w:type="dxa"/>
@@ -7527,7 +7527,7 @@
         </w:trPr>
         <w:tc>
           <w:tcPr>
-            <w:tcW w:type="dxa" w:w="1674"/>
+            <w:tcW w:type="dxa" w:w="1195"/>
             <w:vAlign w:val="center"/>
             <w:tcMar>
               <w:top w:w="80" w:type="dxa"/>
@@ -7555,7 +7555,7 @@
         </w:tc>
         <w:tc>
           <w:tcPr>
-            <w:tcW w:type="dxa" w:w="1339"/>
+            <w:tcW w:type="dxa" w:w="1368"/>
             <w:vAlign w:val="center"/>
             <w:tcMar>
               <w:top w:w="80" w:type="dxa"/>
@@ -7581,7 +7581,7 @@
         </w:tc>
         <w:tc>
           <w:tcPr>
-            <w:tcW w:type="dxa" w:w="4018"/>
+            <w:tcW w:type="dxa" w:w="1901"/>
             <w:vAlign w:val="center"/>
             <w:tcMar>
               <w:top w:w="80" w:type="dxa"/>
@@ -7607,7 +7607,7 @@
         </w:tc>
         <w:tc>
           <w:tcPr>
-            <w:tcW w:type="dxa" w:w="1758"/>
+            <w:tcW w:type="dxa" w:w="1267"/>
             <w:vAlign w:val="center"/>
             <w:tcMar>
               <w:top w:w="80" w:type="dxa"/>
@@ -7634,7 +7634,7 @@
         </w:tc>
         <w:tc>
           <w:tcPr>
-            <w:tcW w:type="dxa" w:w="6027"/>
+            <w:tcW w:type="dxa" w:w="3442"/>
             <w:vAlign w:val="center"/>
             <w:tcMar>
               <w:top w:w="80" w:type="dxa"/>
@@ -7665,7 +7665,7 @@
         </w:trPr>
         <w:tc>
           <w:tcPr>
-            <w:tcW w:type="dxa" w:w="1674"/>
+            <w:tcW w:type="dxa" w:w="1195"/>
             <w:vAlign w:val="center"/>
             <w:tcMar>
               <w:top w:w="80" w:type="dxa"/>
@@ -7693,7 +7693,7 @@
         </w:tc>
         <w:tc>
           <w:tcPr>
-            <w:tcW w:type="dxa" w:w="1339"/>
+            <w:tcW w:type="dxa" w:w="1368"/>
             <w:vAlign w:val="center"/>
             <w:tcMar>
               <w:top w:w="80" w:type="dxa"/>
@@ -7719,7 +7719,7 @@
         </w:tc>
         <w:tc>
           <w:tcPr>
-            <w:tcW w:type="dxa" w:w="4018"/>
+            <w:tcW w:type="dxa" w:w="1901"/>
             <w:vAlign w:val="center"/>
             <w:tcMar>
               <w:top w:w="80" w:type="dxa"/>
@@ -7745,7 +7745,7 @@
         </w:tc>
         <w:tc>
           <w:tcPr>
-            <w:tcW w:type="dxa" w:w="1758"/>
+            <w:tcW w:type="dxa" w:w="1267"/>
             <w:vAlign w:val="center"/>
             <w:tcMar>
               <w:top w:w="80" w:type="dxa"/>
@@ -7772,7 +7772,7 @@
         </w:tc>
         <w:tc>
           <w:tcPr>
-            <w:tcW w:type="dxa" w:w="6027"/>
+            <w:tcW w:type="dxa" w:w="3442"/>
             <w:vAlign w:val="center"/>
             <w:tcMar>
               <w:top w:w="80" w:type="dxa"/>
@@ -7869,8 +7869,8 @@
       <w:footnotePr>
         <w:numRestart w:val="eachSect"/>
       </w:footnotePr>
-      <w:pgSz w:w="16834" w:h="11909" w:orient="landscape"/>
-      <w:pgMar w:left="1008" w:right="1008" w:top="936" w:bottom="936" w:header="432" w:footer="432"/>
+      <w:pgSz w:w="11909" w:h="16834"/>
+      <w:pgMar w:left="1368" w:right="1368" w:top="1152" w:bottom="1152" w:header="432" w:footer="432"/>
     </w:sectPr>
   </w:body>
 </w:document>

</xml_diff>

<commit_message>
Report independently verified leave-one-out sensitivity in submission package
</commit_message>
<xml_diff>
--- a/submission/candidate_20260911_review/MANUSCRIPT_Submission.docx
+++ b/submission/candidate_20260911_review/MANUSCRIPT_Submission.docx
@@ -856,7 +856,16 @@
         <w:widowControl/>
       </w:pPr>
       <w:r>
-        <w:t xml:space="preserve">Analyses used R 4.3.3, TwoSampleMR 0.7.4, coloc 5.2.3 and PLINK 1.9. Python reproduced the colocalization calculations for verification and frequency sensitivity. The instruments and complete numerical results are supplied in Supplementary Data 1–5. No prospective study registration was available.</w:t>
+        <w:t xml:space="preserve">We additionally performed a post hoc leave-one-out analysis for the three selected genes, omitting each retained SNP in turn where at least two instruments were available (Table S5; Figure S2). This assessed sensitivity to individual instruments rather than providing independent replication.</w:t>
+      </w:r>
+    </w:p>
+    <w:p>
+      <w:pPr>
+        <w:pStyle w:val="BodyText"/>
+        <w:widowControl/>
+      </w:pPr>
+      <w:r>
+        <w:t xml:space="preserve">Analyses used R 4.3.3, TwoSampleMR 0.7.4, coloc 5.2.3 and PLINK 1.9. Python reproduced the colocalization calculations for verification and frequency sensitivity. The instruments and complete numerical results are supplied in Supplementary Data 1–6. No prospective study registration was available.</w:t>
       </w:r>
     </w:p>
     <w:bookmarkEnd w:id="13"/>
@@ -1099,7 +1108,55 @@
         <w:widowControl/>
       </w:pPr>
       <w:r>
-        <w:t xml:space="preserve">Shared-variant support was below 0.80 in all three outcomes (BBJ 0.073, UKB 0.404 and FinnGen 0.032). Expression-only model support (PP.H2) was 0.690 in BBJ and 0.623 in FinnGen. This model preference does not establish an absence of marginal disease association. The UKB posterior was divided between an expression-only signal (PP.H2 = 0.400) and a shared variant (PP.H4 = 0.404), with little support for distinct variants (PP.H3 = 0.196), and should be regarded as unresolved rather than negative. Alternative MR estimators agreed in direction but differed in statistical significance (Table S1). Weighted-median estimates were nominally significant in BBJ and UKB, whereas weighted-mode estimates were not; neither provided nominal support in FinnGen. These methods used the same limited instrument sets and therefore do not constitute independent replication. Taken together, these results provide weaker genetic support for</w:t>
+        <w:t xml:space="preserve">Shared-variant support was below 0.80 in all three outcomes (BBJ 0.073, UKB 0.404 and FinnGen 0.032). Expression-only model support (PP.H2) was 0.690 in BBJ and 0.623 in FinnGen. This model preference does not establish an absence of marginal disease association. The UKB posterior was divided between an expression-only signal (PP.H2 = 0.400) and a shared variant (PP.H4 = 0.404), with little support for distinct variants (PP.H3 = 0.196), and should be regarded as unresolved rather than negative. Alternative MR estimators agreed in direction but differed in statistical significance (Table S1). Weighted-median estimates were nominally significant in BBJ and UKB, whereas weighted-mode estimates were not; neither provided nominal support in FinnGen. These methods used the same limited instrument sets and therefore do not constitute independent replication. All 11</w:t>
+      </w:r>
+      <w:r>
+        <w:t xml:space="preserve"> </w:t>
+      </w:r>
+      <w:r>
+        <w:rPr>
+          <w:i/>
+          <w:iCs/>
+        </w:rPr>
+        <w:t xml:space="preserve">IGF1R</w:t>
+      </w:r>
+      <w:r>
+        <w:t xml:space="preserve"> </w:t>
+      </w:r>
+      <w:r>
+        <w:t xml:space="preserve">SNP-exclusion estimates retained the higher-odds direction, but omitting rs2654980 yielded OR 1.49 (95% CI 0.96–2.30;</w:t>
+      </w:r>
+      <w:r>
+        <w:t xml:space="preserve"> </w:t>
+      </w:r>
+      <w:r>
+        <w:rPr>
+          <w:i/>
+          <w:iCs/>
+        </w:rPr>
+        <w:t xml:space="preserve">P</w:t>
+      </w:r>
+      <w:r>
+        <w:t xml:space="preserve"> </w:t>
+      </w:r>
+      <w:r>
+        <w:t xml:space="preserve">= 0.0751) in BBJ and OR 1.16 (0.78–1.72;</w:t>
+      </w:r>
+      <w:r>
+        <w:t xml:space="preserve"> </w:t>
+      </w:r>
+      <w:r>
+        <w:rPr>
+          <w:i/>
+          <w:iCs/>
+        </w:rPr>
+        <w:t xml:space="preserve">P</w:t>
+      </w:r>
+      <w:r>
+        <w:t xml:space="preserve"> </w:t>
+      </w:r>
+      <w:r>
+        <w:t xml:space="preserve">= 0.468) in UKB. Each outcome also lost nominal significance under one other omission (Table S5; Figure S2). rs2654980 ranked first conditional on the shared-variant model, but the MR and colocalization analyses reuse the same underlying association data. Taken together, these results provide weaker genetic support for</w:t>
       </w:r>
       <w:r>
         <w:t xml:space="preserve"> </w:t>
@@ -1247,7 +1304,7 @@
         <w:t xml:space="preserve"> </w:t>
       </w:r>
       <w:r>
-        <w:t xml:space="preserve">itself failed the combined BBJ-plus-FinnGen colocalization criterion.</w:t>
+        <w:t xml:space="preserve">itself failed the combined BBJ-plus-FinnGen colocalization criterion. In the two European outcomes, the MR association was largely supported by rs13030124: omitting it left imprecise estimates based on rs148849825 alone (UKB OR 1.02, 95% CI 0.37–2.82; FinnGen OR 1.72, 0.16–18.90). This agreed with the observed heterogeneity and limits interpretation of the two-SNP IVW estimates (Tables S1 and S5).</w:t>
       </w:r>
     </w:p>
     <w:p>
@@ -1628,7 +1685,7 @@
         <w:t xml:space="preserve"> </w:t>
       </w:r>
       <w:r>
-        <w:t xml:space="preserve">discordances deserve further regional analysis. Their H3-dominant posteriors favour distinct variants under the fitted single-causal-variant model; they do not demonstrate multiple independent signals. Multiple causal variants can nevertheless produce misleading single-variant colocalization summaries and are an important alternative explanation [33]. Both UKB and FinnGen are broadly European-ancestry outcomes, so ancestry mismatch alone cannot explain the UKB result. Phenotype definition, signal complexity, sample composition and variant coverage remain possible contributors. The reported top SNP is conditional on the shared-variant model and is not necessarily the lead disease-association SNP. Resolving this issue requires allele-aligned, ancestry-appropriate LD and multi-signal colocalization; the present analyses do not provide that validation.</w:t>
+        <w:t xml:space="preserve">discordances illustrate the limits of the fitted regional model. Their H3-dominant posteriors favour distinct variants under the fitted single-causal-variant model; they do not demonstrate multiple independent signals. Multiple causal variants can nevertheless produce misleading single-variant colocalization summaries and are an important alternative explanation [33]. Both UKB and FinnGen are broadly European-ancestry outcomes, so ancestry mismatch alone cannot explain the UKB result. Phenotype definition, signal complexity, sample composition and variant coverage remain possible contributors. The reported top SNP is conditional on the shared-variant model and is not necessarily the lead disease-association SNP. These findings are therefore interpreted within the single-causal-variant model. Multi-signal colocalization was not performed, and the regional architecture remains unresolved.</w:t>
       </w:r>
     </w:p>
     <w:p>
@@ -1694,7 +1751,39 @@
         <w:widowControl/>
       </w:pPr>
       <w:r>
-        <w:t xml:space="preserve">The sensitivity analyses improve confidence in specific aspects of the results without removing all uncertainty. Substituting eQTLGen cohort frequencies preserved the discovery-hit set and every tested shared-variant classification. It therefore addresses concern about the reference-frequency approximation used to reconstruct exposure effects. Prior sensitivity answers a separate question:</w:t>
+        <w:t xml:space="preserve">The sensitivity analyses improve confidence in specific aspects of the results without removing all uncertainty. Substituting eQTLGen cohort frequencies preserved the discovery-hit set and every tested shared-variant classification. It therefore addresses concern about the reference-frequency approximation used to reconstruct exposure effects. SNP-exclusion analyses further showed that nominal</w:t>
+      </w:r>
+      <w:r>
+        <w:t xml:space="preserve"> </w:t>
+      </w:r>
+      <w:r>
+        <w:rPr>
+          <w:i/>
+          <w:iCs/>
+        </w:rPr>
+        <w:t xml:space="preserve">IGF1R</w:t>
+      </w:r>
+      <w:r>
+        <w:t xml:space="preserve"> </w:t>
+      </w:r>
+      <w:r>
+        <w:t xml:space="preserve">significance was sensitive to instrument omission and that European</w:t>
+      </w:r>
+      <w:r>
+        <w:t xml:space="preserve"> </w:t>
+      </w:r>
+      <w:r>
+        <w:rPr>
+          <w:i/>
+          <w:iCs/>
+        </w:rPr>
+        <w:t xml:space="preserve">CTLA4</w:t>
+      </w:r>
+      <w:r>
+        <w:t xml:space="preserve"> </w:t>
+      </w:r>
+      <w:r>
+        <w:t xml:space="preserve">support was concentrated in one SNP. These post hoc checks refine interpretation of the same data; changes in significance reflect both effect estimates and precision and do not establish bias in a particular SNP. Prior sensitivity answers a separate question:</w:t>
       </w:r>
       <w:r>
         <w:t xml:space="preserve"> </w:t>
@@ -1986,7 +2075,7 @@
         <w:t xml:space="preserve"> </w:t>
       </w:r>
       <w:r>
-        <w:t xml:space="preserve">Instruments, primary MR and colocalization results, and frequency-sensitivity results are supplied as Supplementary Data 1–5. Analysis code is available from the corresponding author on reasonable request. Public summary statistics analyzed in this study are available from their original repositories: blood</w:t>
+        <w:t xml:space="preserve">Instruments, primary MR and colocalization results, and sensitivity results are supplied as Supplementary Data 1–6. Analysis code is available from the corresponding author on reasonable request. Public summary statistics analyzed in this study are available from their original repositories: blood</w:t>
       </w:r>
       <w:r>
         <w:t xml:space="preserve"> </w:t>
@@ -5805,7 +5894,33 @@
         <w:rPr>
           <w:sz w:val="20"/>
         </w:rPr>
-        <w:t xml:space="preserve">values. H0/H1 account for any remaining probability. H4 ≥ 0.80 denotes strong shared-variant support. H2 dominance does not prove absence of marginal disease association. For rs179252, the G-allele exposure coefficient was 0.10546; aligned disease log-ORs were −0.22103 (BBJ), −0.25691 (UKB, after scale conversion) and −0.24587 (FinnGen), corresponding to variant-level ORs of 0.802, 0.773 and 0.782. These variant effects and the scaled MR ORs answer different questions. Full probabilities are in Supplementary Data 3; sensitivity results are in Tables S1–S3.</w:t>
+        <w:t xml:space="preserve">values. H0/H1 account for any remaining probability. H4 ≥ 0.80 denotes strong shared-variant support. H2 dominance does not prove absence of marginal disease association. For rs179252, the G-allele exposure coefficient was 0.10546; aligned disease log-ORs were −0.22103 (BBJ), −0.25691 (UKB, after scale conversion) and −0.24587 (FinnGen), corresponding to variant-level ORs of 0.802, 0.773 and 0.782. These variant effects and the scaled MR ORs answer different questions. European</w:t>
+      </w:r>
+      <w:r>
+        <w:rPr>
+          <w:sz w:val="20"/>
+        </w:rPr>
+        <w:t xml:space="preserve"> </w:t>
+      </w:r>
+      <w:r>
+        <w:rPr>
+          <w:i/>
+          <w:iCs/>
+          <w:sz w:val="20"/>
+        </w:rPr>
+        <w:t xml:space="preserve">CTLA4</w:t>
+      </w:r>
+      <w:r>
+        <w:rPr>
+          <w:sz w:val="20"/>
+        </w:rPr>
+        <w:t xml:space="preserve"> </w:t>
+      </w:r>
+      <w:r>
+        <w:rPr>
+          <w:sz w:val="20"/>
+        </w:rPr>
+        <w:t xml:space="preserve">MR support was concentrated in rs13030124; the other instrument alone gave imprecise estimates spanning OR = 1 (Table S5). Full probabilities are in Supplementary Data 3; sensitivity results are in Tables S1–S3 and S5.</w:t>
       </w:r>
     </w:p>
     <w:p>

</xml_diff>

<commit_message>
Condense supplementary material to three tables and correct Data 3 guide
</commit_message>
<xml_diff>
--- a/submission/candidate_20260911_review/MANUSCRIPT_Submission.docx
+++ b/submission/candidate_20260911_review/MANUSCRIPT_Submission.docx
@@ -797,7 +797,7 @@
         <w:t xml:space="preserve"> </w:t>
       </w:r>
       <w:r>
-        <w:t xml:space="preserve">value. We report it alongside the MR results and tested more conservative assumptions (Table S2) [24]. Colocalization used the regional expression and disease statistics without any significance filter, giving 1,479 to 7,740 variants per gene and outcome. Requiring support in both the discovery outcome and the TED-enriched outcome is a stringent cross-outcome filter: it selects candidates whose shared-variant evidence is not confined to one dataset, and it is not a test of Graves disease association on its own. The combined criterion was not prospectively registered, and the available analysis plan does not establish that this exact rule preceded inspection of results. The model assumes at most one causal variant per trait in the region; full model details and all probabilities are supplied in Supplementary Methods and Supplementary Data 3.</w:t>
+        <w:t xml:space="preserve">value. We report it alongside the MR results and tested more conservative assumptions (Figure 3B; Supplementary Data 3) [24]. Colocalization used the regional expression and disease statistics without any significance filter, giving 1,479 to 7,740 variants per gene and outcome. Requiring support in both the discovery outcome and the TED-enriched outcome is a stringent cross-outcome filter: it selects candidates whose shared-variant evidence is not confined to one dataset, and it is not a test of Graves disease association on its own. The combined criterion was not prospectively registered, and the available analysis plan does not establish that this exact rule preceded inspection of results. The model assumes at most one causal variant per trait in the region; full model details and all probabilities are supplied in Supplementary Methods and Supplementary Data 3.</w:t>
       </w:r>
     </w:p>
     <w:p>
@@ -822,7 +822,7 @@
         <w:t xml:space="preserve"> </w:t>
       </w:r>
       <w:r>
-        <w:t xml:space="preserve">and whether three neighbouring chromosome 16p11.2 hits represented independent findings. We also repeated the analyses using eQTLGen’s own allele frequencies. Frequency substitution was assessed first with the same variants, then after repeating allele alignment. MR, colocalization and detectable effect sizes were compared with the primary analysis (Tables S3–S4). Details of these checks, including their limitations, are in Supplementary Methods.</w:t>
+        <w:t xml:space="preserve">and whether three neighbouring chromosome 16p11.2 hits represented independent findings. We also repeated the analyses using eQTLGen’s own allele frequencies. Frequency substitution was assessed first with the same variants, then after repeating allele alignment. MR, colocalization and detectable effect sizes were compared with the primary analysis (Tables S2–S3). Details of these checks, including their limitations, are in Supplementary Methods.</w:t>
       </w:r>
     </w:p>
     <w:p>
@@ -856,7 +856,7 @@
         <w:widowControl/>
       </w:pPr>
       <w:r>
-        <w:t xml:space="preserve">We additionally performed a post hoc leave-one-out analysis for the three selected genes, omitting each retained SNP in turn where at least two instruments were available (Table S5; Figure S2). This assessed sensitivity to individual instruments rather than providing independent replication.</w:t>
+        <w:t xml:space="preserve">We additionally performed a post hoc leave-one-out analysis for the three selected genes, omitting each retained SNP in turn where at least two instruments were available (Figure S2; Supplementary Data 6). This assessed sensitivity to individual instruments rather than providing independent replication.</w:t>
       </w:r>
     </w:p>
     <w:p>
@@ -1156,7 +1156,7 @@
         <w:t xml:space="preserve"> </w:t>
       </w:r>
       <w:r>
-        <w:t xml:space="preserve">= 0.468) in UKB. Each outcome also lost nominal significance under one other omission (Table S5; Figure S2). rs2654980 ranked first conditional on the shared-variant model, but the MR and colocalization analyses reuse the same underlying association data. Taken together, these results provide weaker genetic support for</w:t>
+        <w:t xml:space="preserve">= 0.468) in UKB. Each outcome also lost nominal significance under one other omission (Figure S2; Supplementary Data 6). rs2654980 ranked first conditional on the shared-variant model, but the MR and colocalization analyses reuse the same underlying association data. Taken together, these results provide weaker genetic support for</w:t>
       </w:r>
       <w:r>
         <w:t xml:space="preserve"> </w:t>
@@ -1304,7 +1304,7 @@
         <w:t xml:space="preserve"> </w:t>
       </w:r>
       <w:r>
-        <w:t xml:space="preserve">itself failed the combined BBJ-plus-FinnGen colocalization criterion. In the two European outcomes, the MR association was largely supported by rs13030124: omitting it left imprecise estimates based on rs148849825 alone (UKB OR 1.02, 95% CI 0.37–2.82; FinnGen OR 1.72, 0.16–18.90). This agreed with the observed heterogeneity and limits interpretation of the two-SNP IVW estimates (Tables S1 and S5).</w:t>
+        <w:t xml:space="preserve">itself failed the combined BBJ-plus-FinnGen colocalization criterion. In the two European outcomes, the MR association was largely supported by rs13030124: omitting it left imprecise estimates based on rs148849825 alone (UKB OR 1.02, 95% CI 0.37–2.82; FinnGen OR 1.72, 0.16–18.90). This agreed with the observed heterogeneity and limits interpretation of the two-SNP IVW estimates (Table S1; Figure S2).</w:t>
       </w:r>
     </w:p>
     <w:p>
@@ -1452,7 +1452,7 @@
         <w:t xml:space="preserve"> </w:t>
       </w:r>
       <w:r>
-        <w:t xml:space="preserve">= 0.177; Table S3). Frequency substitution moved none of the 81 colocalization comparisons (nine genes × three outcomes × three priors) across the 0.80 threshold, so every classification was unchanged; the largest absolute change in shared-variant probability was 0.002142. However, the original prior sensitivity remained relevant: under the most conservative prior,</w:t>
+        <w:t xml:space="preserve">= 0.177; Table S2). Frequency substitution moved none of the 81 colocalization comparisons (nine genes × three outcomes × three priors) across the 0.80 threshold, so every classification was unchanged; the largest absolute change in shared-variant probability was 0.002142. However, the original prior sensitivity remained relevant: under the most conservative prior,</w:t>
       </w:r>
       <w:r>
         <w:t xml:space="preserve"> </w:t>
@@ -1468,7 +1468,7 @@
         <w:t xml:space="preserve"> </w:t>
       </w:r>
       <w:r>
-        <w:t xml:space="preserve">support in BBJ fell from 0.951 to 0.661, while FinnGen remained above threshold (Figure 3B; Table S2). This distinguished stability to the frequency substitution from sensitivity to the assumed prior: the former preserved classifications, while the latter changed the interpretation of the BBJ</w:t>
+        <w:t xml:space="preserve">support in BBJ fell from 0.951 to 0.661, while FinnGen remained above threshold (Figure 3B; Supplementary Data 3). This distinguished stability to the frequency substitution from sensitivity to the assumed prior: the former preserved classifications, while the latter changed the interpretation of the BBJ</w:t>
       </w:r>
       <w:r>
         <w:t xml:space="preserve"> </w:t>
@@ -1493,7 +1493,7 @@
         <w:widowControl/>
       </w:pPr>
       <w:r>
-        <w:t xml:space="preserve">The screen had limited ability to detect smaller associations. At 80% power, only 14.6% of estimable BBJ genes could detect an OR of 1.5 at the discovery threshold; this decreased to 12.5% with cohort frequencies. The corresponding proportions for an OR of 2.0 were 35.6% and 34.2% (Table S4). Gene-specific detection benchmarks are provided in Supplementary Methods. They describe precision and cannot distinguish an absent effect from limited power; the ORs, 95% CIs and</w:t>
+        <w:t xml:space="preserve">The screen had limited ability to detect smaller associations. At 80% power, only 14.6% of estimable BBJ genes could detect an OR of 1.5 at the discovery threshold; this decreased to 12.5% with cohort frequencies. The corresponding proportions for an OR of 2.0 were 35.6% and 34.2% (Table S3). Gene-specific detection benchmarks are provided in Supplementary Methods. They describe precision and cannot distinguish an absent effect from limited power; the ORs, 95% CIs and</w:t>
       </w:r>
       <w:r>
         <w:t xml:space="preserve"> </w:t>
@@ -2802,7 +2802,7 @@
         <w:t xml:space="preserve"> </w:t>
       </w:r>
       <w:r>
-        <w:t xml:space="preserve">were biologically selected, while the other six genes were additional discovery candidates. (B) Prior sensitivity for the three selected genes. D, I and C denote default, intermediate and conservative shared-association priors (p12 = 10⁻⁵, 5×10⁻⁶ and 10⁻⁶), with p1 = p2 = 10⁻⁴ throughout. The dashed line marks 0.80. Prior changes can alter classification even when frequency substitution does not; Tables S3–S4 report the separate cohort-frequency sensitivity. Full H0–H4 probabilities and all 81 gene–outcome–prior settings are in Supplementary Data 3.</w:t>
+        <w:t xml:space="preserve">were biologically selected, while the other six genes were additional discovery candidates. (B) Prior sensitivity for the three selected genes. D, I and C denote default, intermediate and conservative shared-association priors (p12 = 10⁻⁵, 5×10⁻⁶ and 10⁻⁶), with p1 = p2 = 10⁻⁴ throughout. The dashed line marks 0.80. Prior changes can alter classification even when frequency substitution does not; Tables S2–S3 report the separate cohort-frequency sensitivity. Full H0–H4 probabilities and all 81 gene–outcome–prior settings are in Supplementary Data 3.</w:t>
       </w:r>
     </w:p>
     <w:bookmarkEnd w:id="26"/>
@@ -5920,7 +5920,7 @@
         <w:rPr>
           <w:sz w:val="20"/>
         </w:rPr>
-        <w:t xml:space="preserve">MR support was concentrated in rs13030124; the other instrument alone gave imprecise estimates spanning OR = 1 (Table S5). Full probabilities are in Supplementary Data 3; sensitivity results are in Tables S1–S3 and S5.</w:t>
+        <w:t xml:space="preserve">MR support was concentrated in rs13030124; the other instrument alone gave imprecise estimates spanning OR = 1 (Figure S2; Supplementary Data 6). Full probabilities are in Supplementary Data 3; sensitivity results are in Tables S1–S3 and Figure S2.</w:t>
       </w:r>
     </w:p>
     <w:p>

</xml_diff>

<commit_message>
Clarify abstract background methods and disease susceptibility findings
</commit_message>
<xml_diff>
--- a/submission/candidate_20260911_review/MANUSCRIPT_Submission.docx
+++ b/submission/candidate_20260911_review/MANUSCRIPT_Submission.docx
@@ -132,7 +132,7 @@
         <w:t xml:space="preserve"> </w:t>
       </w:r>
       <w:r>
-        <w:t xml:space="preserve">To compare genetic evidence linking blood expression of</w:t>
+        <w:t xml:space="preserve">Graves disease (GD) is an autoimmune cause of hyperthyroidism; thyroid eye disease (TED) is an associated inflammatory orbital disorder. We compared genetic evidence linking blood</w:t>
       </w:r>
       <w:r>
         <w:t xml:space="preserve"> </w:t>
@@ -164,7 +164,7 @@
         <w:t xml:space="preserve"> </w:t>
       </w:r>
       <w:r>
-        <w:t xml:space="preserve">to Graves disease (GD) and thyroid eye disease (TED).</w:t>
+        <w:t xml:space="preserve">expression to disease susceptibility.</w:t>
       </w:r>
       <w:r>
         <w:t xml:space="preserve"> </w:t>
@@ -180,23 +180,7 @@
         <w:t xml:space="preserve"> </w:t>
       </w:r>
       <w:r>
-        <w:t xml:space="preserve">We used genetic variants associated with blood gene expression to study 2,544 druggable genes by Mendelian randomization. Biobank Japan (BBJ) GD was the discovery outcome; UK Biobank (UKB) hyperthyroidism and FinnGen Graves ophthalmopathy provided additional comparisons. We reported odds ratios (ORs), 95% confidence intervals (CIs) and</w:t>
-      </w:r>
-      <w:r>
-        <w:t xml:space="preserve"> </w:t>
-      </w:r>
-      <w:r>
-        <w:rPr>
-          <w:i/>
-          <w:iCs/>
-        </w:rPr>
-        <w:t xml:space="preserve">P</w:t>
-      </w:r>
-      <w:r>
-        <w:t xml:space="preserve"> </w:t>
-      </w:r>
-      <w:r>
-        <w:t xml:space="preserve">values, and tested whether expression and disease associations shared a genetic variant.</w:t>
+        <w:t xml:space="preserve">We screened 2,544 druggable genes using Wald-ratio or inverse-variance-weighted Mendelian randomization and colocalization, testing for shared expression–disease variants. Outcomes were Biobank Japan (BBJ) GD, UK Biobank (UKB) hyperthyroidism and FinnGen Graves ophthalmopathy. In-house orbital tissue RNA sequencing (four TED patients, one control) was summarized by transcript levels and fold changes without significance testing.</w:t>
       </w:r>
       <w:r>
         <w:t xml:space="preserve"> </w:t>
@@ -212,7 +196,7 @@
         <w:t xml:space="preserve"> </w:t>
       </w:r>
       <w:r>
-        <w:t xml:space="preserve">Thirteen genes met the multiple-testing threshold. Per approximately one standard deviation (SD) higher genetically proxied blood</w:t>
+        <w:t xml:space="preserve">Higher genetically proxied</w:t>
       </w:r>
       <w:r>
         <w:t xml:space="preserve"> </w:t>
@@ -228,7 +212,39 @@
         <w:t xml:space="preserve"> </w:t>
       </w:r>
       <w:r>
-        <w:t xml:space="preserve">expression, the OR for BBJ GD was 0.12 (95% CI 0.07–0.21;</w:t>
+        <w:t xml:space="preserve">expression was associated with lower GD odds;</w:t>
+      </w:r>
+      <w:r>
+        <w:t xml:space="preserve"> </w:t>
+      </w:r>
+      <w:r>
+        <w:rPr>
+          <w:i/>
+          <w:iCs/>
+        </w:rPr>
+        <w:t xml:space="preserve">IGF1R</w:t>
+      </w:r>
+      <w:r>
+        <w:t xml:space="preserve"> </w:t>
+      </w:r>
+      <w:r>
+        <w:t xml:space="preserve">findings were less conclusive. Thirteen genes met the multiple-testing threshold. Per approximately one standard deviation higher blood</w:t>
+      </w:r>
+      <w:r>
+        <w:t xml:space="preserve"> </w:t>
+      </w:r>
+      <w:r>
+        <w:rPr>
+          <w:i/>
+          <w:iCs/>
+        </w:rPr>
+        <w:t xml:space="preserve">TSHR</w:t>
+      </w:r>
+      <w:r>
+        <w:t xml:space="preserve"> </w:t>
+      </w:r>
+      <w:r>
+        <w:t xml:space="preserve">expression, the BBJ odds ratio (OR) was 0.12 (95% confidence interval [CI] 0.07–0.21;</w:t>
       </w:r>
       <w:r>
         <w:t xml:space="preserve"> </w:t>
@@ -244,7 +260,7 @@
         <w:t xml:space="preserve"> </w:t>
       </w:r>
       <w:r>
-        <w:t xml:space="preserve">= 1.09×10⁻¹⁴), with the same direction in UKB and FinnGen. Shared-variant support was strong in BBJ and FinnGen, but not UKB; the BBJ result was sensitive to a more conservative prior.</w:t>
+        <w:t xml:space="preserve">= 1.09×10⁻¹⁴), with matching directions in UKB and FinnGen. Shared-variant support was strong in BBJ and FinnGen, but not UKB; BBJ support fell below threshold when shared variants were assumed less likely.</w:t>
       </w:r>
       <w:r>
         <w:t xml:space="preserve"> </w:t>
@@ -260,7 +276,7 @@
         <w:t xml:space="preserve"> </w:t>
       </w:r>
       <w:r>
-        <w:t xml:space="preserve">associations were nominal in BBJ (OR 1.56, 95% CI 1.07–2.28;</w:t>
+        <w:t xml:space="preserve">did not meet the discovery threshold or show strong shared-variant support. Associations reached</w:t>
       </w:r>
       <w:r>
         <w:t xml:space="preserve"> </w:t>
@@ -276,6 +292,22 @@
         <w:t xml:space="preserve"> </w:t>
       </w:r>
       <w:r>
+        <w:t xml:space="preserve">&lt; 0.05 in BBJ (OR 1.56, 95% CI 1.07–2.28;</w:t>
+      </w:r>
+      <w:r>
+        <w:t xml:space="preserve"> </w:t>
+      </w:r>
+      <w:r>
+        <w:rPr>
+          <w:i/>
+          <w:iCs/>
+        </w:rPr>
+        <w:t xml:space="preserve">P</w:t>
+      </w:r>
+      <w:r>
+        <w:t xml:space="preserve"> </w:t>
+      </w:r>
+      <w:r>
         <w:t xml:space="preserve">= 0.0212) and UKB (</w:t>
       </w:r>
       <w:r>
@@ -289,7 +321,7 @@
         <w:t xml:space="preserve"> </w:t>
       </w:r>
       <w:r>
-        <w:t xml:space="preserve">= 0.0117), and inconclusive in FinnGen (</w:t>
+        <w:t xml:space="preserve">= 0.0117), but were inconclusive in FinnGen (</w:t>
       </w:r>
       <w:r>
         <w:rPr>
@@ -302,7 +334,7 @@
         <w:t xml:space="preserve"> </w:t>
       </w:r>
       <w:r>
-        <w:t xml:space="preserve">= 0.182); shared-variant support remained below threshold. No additional candidate met the combined BBJ and FinnGen shared-variant criterion. Cohort-frequency sensitivity analyses preserved these findings.</w:t>
+        <w:t xml:space="preserve">= 0.182). No additional gene had strong shared-variant support in BBJ and FinnGen. Using cohort allele frequencies preserved these findings.</w:t>
       </w:r>
       <w:r>
         <w:t xml:space="preserve"> </w:t>
@@ -318,7 +350,7 @@
         <w:t xml:space="preserve"> </w:t>
       </w:r>
       <w:r>
-        <w:t xml:space="preserve">Genetic evidence was stronger for</w:t>
+        <w:t xml:space="preserve">Evidence linking genetically proxied blood expression to GD susceptibility was stronger for</w:t>
       </w:r>
       <w:r>
         <w:t xml:space="preserve"> </w:t>
@@ -347,10 +379,7 @@
         <w:t xml:space="preserve">IGF1R</w:t>
       </w:r>
       <w:r>
-        <w:t xml:space="preserve"> </w:t>
-      </w:r>
-      <w:r>
-        <w:t xml:space="preserve">in this analysis. An effector role for IGF-1R remains compatible with these findings, alongside an unresolved inherited contribution. FinnGen comparisons with population controls cannot establish an effect specific to TED within GD.</w:t>
+        <w:t xml:space="preserve">. This neither establishes a TED-specific effect within GD nor predicts treatment response.</w:t>
       </w:r>
     </w:p>
     <w:p>

</xml_diff>

<commit_message>
Refine abstract statistical precision and clinical readability
</commit_message>
<xml_diff>
--- a/submission/candidate_20260911_review/MANUSCRIPT_Submission.docx
+++ b/submission/candidate_20260911_review/MANUSCRIPT_Submission.docx
@@ -180,7 +180,7 @@
         <w:t xml:space="preserve"> </w:t>
       </w:r>
       <w:r>
-        <w:t xml:space="preserve">We screened 2,544 druggable genes using Wald-ratio or inverse-variance-weighted Mendelian randomization and colocalization, testing for shared expression–disease variants. Outcomes were Biobank Japan (BBJ) GD, UK Biobank (UKB) hyperthyroidism and FinnGen Graves ophthalmopathy. In-house orbital tissue RNA sequencing (four TED patients, one control) was summarized by transcript levels and fold changes without significance testing.</w:t>
+        <w:t xml:space="preserve">We used Wald-ratio or inverse-variance-weighted Mendelian randomization and colocalization (testing for shared expression–disease variants). Outcomes were Biobank Japan (BBJ) GD, UK Biobank (UKB) hyperthyroidism and FinnGen Graves ophthalmopathy. In-house orbital RNA sequencing (four TED patients, one control) was analyzed descriptively using transcript levels and fold changes without significance testing.</w:t>
       </w:r>
       <w:r>
         <w:t xml:space="preserve"> </w:t>
@@ -196,7 +196,20 @@
         <w:t xml:space="preserve"> </w:t>
       </w:r>
       <w:r>
-        <w:t xml:space="preserve">Higher genetically proxied</w:t>
+        <w:t xml:space="preserve">Of 2,544 eligible genes, 13 met the BBJ Bonferroni threshold (</w:t>
+      </w:r>
+      <w:r>
+        <w:rPr>
+          <w:i/>
+          <w:iCs/>
+        </w:rPr>
+        <w:t xml:space="preserve">P</w:t>
+      </w:r>
+      <w:r>
+        <w:t xml:space="preserve"> </w:t>
+      </w:r>
+      <w:r>
+        <w:t xml:space="preserve">&lt; 0.05/2,544). Higher genetically predicted</w:t>
       </w:r>
       <w:r>
         <w:t xml:space="preserve"> </w:t>
@@ -212,7 +225,23 @@
         <w:t xml:space="preserve"> </w:t>
       </w:r>
       <w:r>
-        <w:t xml:space="preserve">expression was associated with lower GD odds;</w:t>
+        <w:t xml:space="preserve">expression was associated with lower GD odds in BBJ (odds ratio [OR] per approximately one standard deviation 0.12, 95% confidence interval [CI] 0.07–0.21;</w:t>
+      </w:r>
+      <w:r>
+        <w:t xml:space="preserve"> </w:t>
+      </w:r>
+      <w:r>
+        <w:rPr>
+          <w:i/>
+          <w:iCs/>
+        </w:rPr>
+        <w:t xml:space="preserve">P</w:t>
+      </w:r>
+      <w:r>
+        <w:t xml:space="preserve"> </w:t>
+      </w:r>
+      <w:r>
+        <w:t xml:space="preserve">= 1.09×10⁻¹⁴), with concordant directions in UKB and FinnGen. Colocalization support exceeded the 0.80 probability threshold in BBJ and FinnGen, but not UKB. BBJ support fell below threshold when the shared-variant prior probability decreased from 10⁻⁵ to 10⁻⁶. Higher</w:t>
       </w:r>
       <w:r>
         <w:t xml:space="preserve"> </w:t>
@@ -228,23 +257,7 @@
         <w:t xml:space="preserve"> </w:t>
       </w:r>
       <w:r>
-        <w:t xml:space="preserve">findings were less conclusive. Thirteen genes met the multiple-testing threshold. Per approximately one standard deviation higher blood</w:t>
-      </w:r>
-      <w:r>
-        <w:t xml:space="preserve"> </w:t>
-      </w:r>
-      <w:r>
-        <w:rPr>
-          <w:i/>
-          <w:iCs/>
-        </w:rPr>
-        <w:t xml:space="preserve">TSHR</w:t>
-      </w:r>
-      <w:r>
-        <w:t xml:space="preserve"> </w:t>
-      </w:r>
-      <w:r>
-        <w:t xml:space="preserve">expression, the BBJ odds ratio (OR) was 0.12 (95% confidence interval [CI] 0.07–0.21;</w:t>
+        <w:t xml:space="preserve">expression was associated with higher odds in BBJ (OR 1.56, 95% CI 1.07–2.28;</w:t>
       </w:r>
       <w:r>
         <w:t xml:space="preserve"> </w:t>
@@ -260,7 +273,33 @@
         <w:t xml:space="preserve"> </w:t>
       </w:r>
       <w:r>
-        <w:t xml:space="preserve">= 1.09×10⁻¹⁴), with matching directions in UKB and FinnGen. Shared-variant support was strong in BBJ and FinnGen, but not UKB; BBJ support fell below threshold when shared variants were assumed less likely.</w:t>
+        <w:t xml:space="preserve">= 0.0212) and UKB (</w:t>
+      </w:r>
+      <w:r>
+        <w:rPr>
+          <w:i/>
+          <w:iCs/>
+        </w:rPr>
+        <w:t xml:space="preserve">P</w:t>
+      </w:r>
+      <w:r>
+        <w:t xml:space="preserve"> </w:t>
+      </w:r>
+      <w:r>
+        <w:t xml:space="preserve">= 0.0117), but neither association met the discovery threshold. FinnGen findings were inconclusive (</w:t>
+      </w:r>
+      <w:r>
+        <w:rPr>
+          <w:i/>
+          <w:iCs/>
+        </w:rPr>
+        <w:t xml:space="preserve">P</w:t>
+      </w:r>
+      <w:r>
+        <w:t xml:space="preserve"> </w:t>
+      </w:r>
+      <w:r>
+        <w:t xml:space="preserve">= 0.182).</w:t>
       </w:r>
       <w:r>
         <w:t xml:space="preserve"> </w:t>
@@ -276,65 +315,7 @@
         <w:t xml:space="preserve"> </w:t>
       </w:r>
       <w:r>
-        <w:t xml:space="preserve">did not meet the discovery threshold or show strong shared-variant support. Associations reached</w:t>
-      </w:r>
-      <w:r>
-        <w:t xml:space="preserve"> </w:t>
-      </w:r>
-      <w:r>
-        <w:rPr>
-          <w:i/>
-          <w:iCs/>
-        </w:rPr>
-        <w:t xml:space="preserve">P</w:t>
-      </w:r>
-      <w:r>
-        <w:t xml:space="preserve"> </w:t>
-      </w:r>
-      <w:r>
-        <w:t xml:space="preserve">&lt; 0.05 in BBJ (OR 1.56, 95% CI 1.07–2.28;</w:t>
-      </w:r>
-      <w:r>
-        <w:t xml:space="preserve"> </w:t>
-      </w:r>
-      <w:r>
-        <w:rPr>
-          <w:i/>
-          <w:iCs/>
-        </w:rPr>
-        <w:t xml:space="preserve">P</w:t>
-      </w:r>
-      <w:r>
-        <w:t xml:space="preserve"> </w:t>
-      </w:r>
-      <w:r>
-        <w:t xml:space="preserve">= 0.0212) and UKB (</w:t>
-      </w:r>
-      <w:r>
-        <w:rPr>
-          <w:i/>
-          <w:iCs/>
-        </w:rPr>
-        <w:t xml:space="preserve">P</w:t>
-      </w:r>
-      <w:r>
-        <w:t xml:space="preserve"> </w:t>
-      </w:r>
-      <w:r>
-        <w:t xml:space="preserve">= 0.0117), but were inconclusive in FinnGen (</w:t>
-      </w:r>
-      <w:r>
-        <w:rPr>
-          <w:i/>
-          <w:iCs/>
-        </w:rPr>
-        <w:t xml:space="preserve">P</w:t>
-      </w:r>
-      <w:r>
-        <w:t xml:space="preserve"> </w:t>
-      </w:r>
-      <w:r>
-        <w:t xml:space="preserve">= 0.182). No additional gene had strong shared-variant support in BBJ and FinnGen. Using cohort allele frequencies preserved these findings.</w:t>
+        <w:t xml:space="preserve">lacked strong colocalization support. No additional candidate met the combined BBJ–FinnGen colocalization criterion. Cohort-specific allele frequencies preserved these findings.</w:t>
       </w:r>
       <w:r>
         <w:t xml:space="preserve"> </w:t>
@@ -350,7 +331,7 @@
         <w:t xml:space="preserve"> </w:t>
       </w:r>
       <w:r>
-        <w:t xml:space="preserve">Evidence linking genetically proxied blood expression to GD susceptibility was stronger for</w:t>
+        <w:t xml:space="preserve">Genetically predicted blood expression showed stronger evidence of association with GD susceptibility for</w:t>
       </w:r>
       <w:r>
         <w:t xml:space="preserve"> </w:t>
@@ -379,7 +360,7 @@
         <w:t xml:space="preserve">IGF1R</w:t>
       </w:r>
       <w:r>
-        <w:t xml:space="preserve">. This neither establishes a TED-specific effect within GD nor predicts treatment response.</w:t>
+        <w:t xml:space="preserve">. These findings neither establish a TED-specific effect within GD nor predict treatment response.</w:t>
       </w:r>
     </w:p>
     <w:p>

</xml_diff>

<commit_message>
Clarify abstract phenotypes and report descriptive orbital findings
</commit_message>
<xml_diff>
--- a/submission/candidate_20260911_review/MANUSCRIPT_Submission.docx
+++ b/submission/candidate_20260911_review/MANUSCRIPT_Submission.docx
@@ -132,7 +132,7 @@
         <w:t xml:space="preserve"> </w:t>
       </w:r>
       <w:r>
-        <w:t xml:space="preserve">Graves disease (GD) is an autoimmune cause of hyperthyroidism; thyroid eye disease (TED) is an associated inflammatory orbital disorder. We compared genetic evidence linking blood</w:t>
+        <w:t xml:space="preserve">Graves disease (GD) causes autoimmune hyperthyroidism; thyroid eye disease (TED) is an associated inflammatory orbital disorder. We compared genetic evidence linking blood</w:t>
       </w:r>
       <w:r>
         <w:t xml:space="preserve"> </w:t>
@@ -180,7 +180,7 @@
         <w:t xml:space="preserve"> </w:t>
       </w:r>
       <w:r>
-        <w:t xml:space="preserve">We used Wald-ratio or inverse-variance-weighted Mendelian randomization and colocalization (testing for shared expression–disease variants). Outcomes were Biobank Japan (BBJ) GD, UK Biobank (UKB) hyperthyroidism and FinnGen Graves ophthalmopathy. In-house orbital RNA sequencing (four TED patients, one control) was analyzed descriptively using transcript levels and fold changes without significance testing.</w:t>
+        <w:t xml:space="preserve">We used Wald-ratio or inverse-variance-weighted Mendelian randomization and colocalization (testing for shared expression–disease variants). Outcomes were Biobank Japan (BBJ) GD, UK Biobank (UKB) hyperthyroidism and FinnGen Graves ophthalmopathy. In-house orbital RNA sequencing (four TED patients, one control) was analyzed descriptively.</w:t>
       </w:r>
       <w:r>
         <w:t xml:space="preserve"> </w:t>
@@ -225,7 +225,7 @@
         <w:t xml:space="preserve"> </w:t>
       </w:r>
       <w:r>
-        <w:t xml:space="preserve">expression was associated with lower GD odds in BBJ (odds ratio [OR] per approximately one standard deviation 0.12, 95% confidence interval [CI] 0.07–0.21;</w:t>
+        <w:t xml:space="preserve">expression was associated with lower BBJ GD odds (odds ratio [OR] per approximately one standard deviation 0.12, 95% confidence interval [CI] 0.07–0.21;</w:t>
       </w:r>
       <w:r>
         <w:t xml:space="preserve"> </w:t>
@@ -241,7 +241,7 @@
         <w:t xml:space="preserve"> </w:t>
       </w:r>
       <w:r>
-        <w:t xml:space="preserve">= 1.09×10⁻¹⁴), with concordant directions in UKB and FinnGen. Colocalization support exceeded the 0.80 probability threshold in BBJ and FinnGen, but not UKB. BBJ support fell below threshold when the shared-variant prior probability decreased from 10⁻⁵ to 10⁻⁶. Higher</w:t>
+        <w:t xml:space="preserve">= 1.09×10⁻¹⁴), with concordant directions for the other outcomes. Colocalization probability exceeded 0.80 in BBJ and FinnGen, but not UKB. BBJ support fell below threshold when the shared-variant prior decreased from 10⁻⁵ to 10⁻⁶. Higher</w:t>
       </w:r>
       <w:r>
         <w:t xml:space="preserve"> </w:t>
@@ -257,7 +257,7 @@
         <w:t xml:space="preserve"> </w:t>
       </w:r>
       <w:r>
-        <w:t xml:space="preserve">expression was associated with higher odds in BBJ (OR 1.56, 95% CI 1.07–2.28;</w:t>
+        <w:t xml:space="preserve">expression was associated with higher odds of BBJ GD (OR 1.56, 95% CI 1.07–2.28;</w:t>
       </w:r>
       <w:r>
         <w:t xml:space="preserve"> </w:t>
@@ -273,7 +273,7 @@
         <w:t xml:space="preserve"> </w:t>
       </w:r>
       <w:r>
-        <w:t xml:space="preserve">= 0.0212) and UKB (</w:t>
+        <w:t xml:space="preserve">= 0.0212) and UKB hyperthyroidism (</w:t>
       </w:r>
       <w:r>
         <w:rPr>
@@ -286,7 +286,23 @@
         <w:t xml:space="preserve"> </w:t>
       </w:r>
       <w:r>
-        <w:t xml:space="preserve">= 0.0117), but neither association met the discovery threshold. FinnGen findings were inconclusive (</w:t>
+        <w:t xml:space="preserve">= 0.0117).</w:t>
+      </w:r>
+      <w:r>
+        <w:t xml:space="preserve"> </w:t>
+      </w:r>
+      <w:r>
+        <w:rPr>
+          <w:i/>
+          <w:iCs/>
+        </w:rPr>
+        <w:t xml:space="preserve">IGF1R</w:t>
+      </w:r>
+      <w:r>
+        <w:t xml:space="preserve"> </w:t>
+      </w:r>
+      <w:r>
+        <w:t xml:space="preserve">did not meet the BBJ discovery threshold. The FinnGen association was non-significant (</w:t>
       </w:r>
       <w:r>
         <w:rPr>
@@ -315,7 +331,39 @@
         <w:t xml:space="preserve"> </w:t>
       </w:r>
       <w:r>
-        <w:t xml:space="preserve">lacked strong colocalization support. No additional candidate met the combined BBJ–FinnGen colocalization criterion. Cohort-specific allele frequencies preserved these findings.</w:t>
+        <w:t xml:space="preserve">lacked strong colocalization support; no additional candidate met the combined BBJ–FinnGen criterion. Cohort-frequency sensitivity preserved these findings. Mean orbital</w:t>
+      </w:r>
+      <w:r>
+        <w:t xml:space="preserve"> </w:t>
+      </w:r>
+      <w:r>
+        <w:rPr>
+          <w:i/>
+          <w:iCs/>
+        </w:rPr>
+        <w:t xml:space="preserve">TSHR</w:t>
+      </w:r>
+      <w:r>
+        <w:t xml:space="preserve"> </w:t>
+      </w:r>
+      <w:r>
+        <w:t xml:space="preserve">and</w:t>
+      </w:r>
+      <w:r>
+        <w:t xml:space="preserve"> </w:t>
+      </w:r>
+      <w:r>
+        <w:rPr>
+          <w:i/>
+          <w:iCs/>
+        </w:rPr>
+        <w:t xml:space="preserve">IGF1R</w:t>
+      </w:r>
+      <w:r>
+        <w:t xml:space="preserve"> </w:t>
+      </w:r>
+      <w:r>
+        <w:t xml:space="preserve">transcript levels were higher in TED than in the control.</w:t>
       </w:r>
       <w:r>
         <w:t xml:space="preserve"> </w:t>
@@ -331,7 +379,7 @@
         <w:t xml:space="preserve"> </w:t>
       </w:r>
       <w:r>
-        <w:t xml:space="preserve">Genetically predicted blood expression showed stronger evidence of association with GD susceptibility for</w:t>
+        <w:t xml:space="preserve">Evidence linking genetically predicted blood</w:t>
       </w:r>
       <w:r>
         <w:t xml:space="preserve"> </w:t>
@@ -347,7 +395,7 @@
         <w:t xml:space="preserve"> </w:t>
       </w:r>
       <w:r>
-        <w:t xml:space="preserve">than</w:t>
+        <w:t xml:space="preserve">expression to GD susceptibility was stronger than for</w:t>
       </w:r>
       <w:r>
         <w:t xml:space="preserve"> </w:t>
@@ -360,7 +408,7 @@
         <w:t xml:space="preserve">IGF1R</w:t>
       </w:r>
       <w:r>
-        <w:t xml:space="preserve">. These findings neither establish a TED-specific effect within GD nor predict treatment response.</w:t>
+        <w:t xml:space="preserve">. FinnGen population controls prevent isolating TED susceptibility within GD; treatment response was not assessed.</w:t>
       </w:r>
     </w:p>
     <w:p>

</xml_diff>

<commit_message>
Scope the Conclusions to all three outcomes and guard the IGF1R reading
The standalone Conclusions named only BBJ and FinnGen, silently dropping the
UKB non-colocalization, and hedged IGF1R as "preserving the uncertainty",
which does not stop a reader from taking weaker genetic support as an
argument against the drug target. Both are now explicit.

Co-Authored-By: Claude Opus 5 <noreply@anthropic.com>
Claude-Session: https://claude.ai/code/session_01TiAKffYKtUstdRZFkwtJA9
</commit_message>
<xml_diff>
--- a/submission/candidate_20260911_review/MANUSCRIPT_Submission.docx
+++ b/submission/candidate_20260911_review/MANUSCRIPT_Submission.docx
@@ -2041,7 +2041,7 @@
         <w:t xml:space="preserve"> </w:t>
       </w:r>
       <w:r>
-        <w:t xml:space="preserve">in BBJ Graves disease and FinnGen Graves ophthalmopathy. The findings distinguish genetic susceptibility evidence from evidence of therapeutic efficacy, while preserving the uncertainty around</w:t>
+        <w:t xml:space="preserve">in BBJ Graves disease and FinnGen Graves ophthalmopathy; in UKB hyperthyroidism neither gene reached the shared-variant threshold. The findings distinguish genetic susceptibility evidence from evidence of therapeutic efficacy: weaker and unresolved genetic support for</w:t>
       </w:r>
       <w:r>
         <w:t xml:space="preserve"> </w:t>
@@ -2057,7 +2057,7 @@
         <w:t xml:space="preserve"> </w:t>
       </w:r>
       <w:r>
-        <w:t xml:space="preserve">and the prior dependence of the BBJ</w:t>
+        <w:t xml:space="preserve">does not argue against its therapeutic relevance, and the BBJ</w:t>
       </w:r>
       <w:r>
         <w:t xml:space="preserve"> </w:t>
@@ -2073,7 +2073,7 @@
         <w:t xml:space="preserve"> </w:t>
       </w:r>
       <w:r>
-        <w:t xml:space="preserve">result. They support further investigation in relevant tissues and a direct comparison of GD patients with and without TED; they do not establish treatment direction or expected clinical benefit.</w:t>
+        <w:t xml:space="preserve">result depends on the shared-association prior. They support further investigation in relevant tissues and a direct comparison of GD patients with and without TED; they do not establish treatment direction or expected clinical benefit.</w:t>
       </w:r>
     </w:p>
     <w:bookmarkEnd w:id="33"/>

</xml_diff>

<commit_message>
Give the Abstract its numeric thresholds and the orbital result
The Abstract announced the orbital RNA-seq in Methods and then never said
what it showed, and it described colocalization only as "strong" support
that fell "when shared variants were assumed less likely" -- neither
checkable. It now reports PP > 0.80, the 10^-5 to 10^-6 prior drop and the
tissue direction (verified against provenance/tissue_descriptive.csv),
paid for by cuts elsewhere. Still 250 words.

Co-Authored-By: Claude Opus 5 <noreply@anthropic.com>
Claude-Session: https://claude.ai/code/session_01TiAKffYKtUstdRZFkwtJA9
</commit_message>
<xml_diff>
--- a/submission/candidate_20260911_review/MANUSCRIPT_Submission.docx
+++ b/submission/candidate_20260911_review/MANUSCRIPT_Submission.docx
@@ -180,7 +180,7 @@
         <w:t xml:space="preserve"> </w:t>
       </w:r>
       <w:r>
-        <w:t xml:space="preserve">We screened 2,544 druggable genes using Wald-ratio or inverse-variance-weighted Mendelian randomization and colocalization, testing for shared expression–disease variants. Outcomes were Biobank Japan (BBJ) GD, UK Biobank (UKB) hyperthyroidism and FinnGen Graves ophthalmopathy. In-house orbital tissue RNA sequencing (four TED patients, one control) was summarized by transcript levels and fold changes without significance testing.</w:t>
+        <w:t xml:space="preserve">We screened 2,544 druggable genes using Wald-ratio or inverse-variance-weighted Mendelian randomization and colocalization for shared expression–disease variants. Outcomes were Biobank Japan (BBJ) GD, UK Biobank (UKB) hyperthyroidism and FinnGen Graves ophthalmopathy. In-house orbital RNA sequencing (four TED patients, one control) was described without significance testing.</w:t>
       </w:r>
       <w:r>
         <w:t xml:space="preserve"> </w:t>
@@ -196,7 +196,20 @@
         <w:t xml:space="preserve"> </w:t>
       </w:r>
       <w:r>
-        <w:t xml:space="preserve">Higher genetically proxied</w:t>
+        <w:t xml:space="preserve">Thirteen genes met the BBJ discovery threshold (</w:t>
+      </w:r>
+      <w:r>
+        <w:rPr>
+          <w:iCs/>
+          <w:i/>
+        </w:rPr>
+        <w:t xml:space="preserve">P</w:t>
+      </w:r>
+      <w:r>
+        <w:t xml:space="preserve"> </w:t>
+      </w:r>
+      <w:r>
+        <w:t xml:space="preserve">&lt; 0.05/2,544). Higher genetically proxied</w:t>
       </w:r>
       <w:r>
         <w:t xml:space="preserve"> </w:t>
@@ -212,7 +225,23 @@
         <w:t xml:space="preserve"> </w:t>
       </w:r>
       <w:r>
-        <w:t xml:space="preserve">expression was associated with lower GD odds;</w:t>
+        <w:t xml:space="preserve">expression was associated with lower BBJ GD odds (odds ratio [OR] per approximately one standard deviation 0.12, 95% confidence interval [CI] 0.07–0.21;</w:t>
+      </w:r>
+      <w:r>
+        <w:t xml:space="preserve"> </w:t>
+      </w:r>
+      <w:r>
+        <w:rPr>
+          <w:iCs/>
+          <w:i/>
+        </w:rPr>
+        <w:t xml:space="preserve">P</w:t>
+      </w:r>
+      <w:r>
+        <w:t xml:space="preserve"> </w:t>
+      </w:r>
+      <w:r>
+        <w:t xml:space="preserve">= 1.09×10⁻¹⁴), with matching directions in UKB and FinnGen. Shared-variant posterior probability exceeded 0.80 in BBJ and FinnGen but not UKB; BBJ support fell below 0.80 when the shared-variant prior was lowered from 10⁻⁵ to 10⁻⁶.</w:t>
       </w:r>
       <w:r>
         <w:t xml:space="preserve"> </w:t>
@@ -228,7 +257,65 @@
         <w:t xml:space="preserve"> </w:t>
       </w:r>
       <w:r>
-        <w:t xml:space="preserve">findings were less conclusive. Thirteen genes met the multiple-testing threshold. Per approximately one standard deviation higher blood</w:t>
+        <w:t xml:space="preserve">missed the discovery threshold, and its shared-variant probability stayed below 0.80 in every outcome; associations reached</w:t>
+      </w:r>
+      <w:r>
+        <w:t xml:space="preserve"> </w:t>
+      </w:r>
+      <w:r>
+        <w:rPr>
+          <w:iCs/>
+          <w:i/>
+        </w:rPr>
+        <w:t xml:space="preserve">P</w:t>
+      </w:r>
+      <w:r>
+        <w:t xml:space="preserve"> </w:t>
+      </w:r>
+      <w:r>
+        <w:t xml:space="preserve">&lt; 0.05 in BBJ (OR 1.56, 95% CI 1.07–2.28;</w:t>
+      </w:r>
+      <w:r>
+        <w:t xml:space="preserve"> </w:t>
+      </w:r>
+      <w:r>
+        <w:rPr>
+          <w:iCs/>
+          <w:i/>
+        </w:rPr>
+        <w:t xml:space="preserve">P</w:t>
+      </w:r>
+      <w:r>
+        <w:t xml:space="preserve"> </w:t>
+      </w:r>
+      <w:r>
+        <w:t xml:space="preserve">= 0.0212) and UKB (</w:t>
+      </w:r>
+      <w:r>
+        <w:rPr>
+          <w:iCs/>
+          <w:i/>
+        </w:rPr>
+        <w:t xml:space="preserve">P</w:t>
+      </w:r>
+      <w:r>
+        <w:t xml:space="preserve"> </w:t>
+      </w:r>
+      <w:r>
+        <w:t xml:space="preserve">= 0.0117) but were inconclusive in FinnGen (</w:t>
+      </w:r>
+      <w:r>
+        <w:rPr>
+          <w:iCs/>
+          <w:i/>
+        </w:rPr>
+        <w:t xml:space="preserve">P</w:t>
+      </w:r>
+      <w:r>
+        <w:t xml:space="preserve"> </w:t>
+      </w:r>
+      <w:r>
+        <w:t xml:space="preserve">= 0.182). No additional gene met the combined BBJ–FinnGen criterion. Cohort-frequency substitution preserved these findings. Mean orbital</w:t>
       </w:r>
       <w:r>
         <w:t xml:space="preserve"> </w:t>
@@ -244,23 +331,7 @@
         <w:t xml:space="preserve"> </w:t>
       </w:r>
       <w:r>
-        <w:t xml:space="preserve">expression, the BBJ odds ratio (OR) was 0.12 (95% confidence interval [CI] 0.07–0.21;</w:t>
-      </w:r>
-      <w:r>
-        <w:t xml:space="preserve"> </w:t>
-      </w:r>
-      <w:r>
-        <w:rPr>
-          <w:iCs/>
-          <w:i/>
-        </w:rPr>
-        <w:t xml:space="preserve">P</w:t>
-      </w:r>
-      <w:r>
-        <w:t xml:space="preserve"> </w:t>
-      </w:r>
-      <w:r>
-        <w:t xml:space="preserve">= 1.09×10⁻¹⁴), with matching directions in UKB and FinnGen. Shared-variant support was strong in BBJ and FinnGen, but not UKB; BBJ support fell below threshold when shared variants were assumed less likely.</w:t>
+        <w:t xml:space="preserve">and</w:t>
       </w:r>
       <w:r>
         <w:t xml:space="preserve"> </w:t>
@@ -276,65 +347,7 @@
         <w:t xml:space="preserve"> </w:t>
       </w:r>
       <w:r>
-        <w:t xml:space="preserve">did not meet the discovery threshold or show strong shared-variant support. Associations reached</w:t>
-      </w:r>
-      <w:r>
-        <w:t xml:space="preserve"> </w:t>
-      </w:r>
-      <w:r>
-        <w:rPr>
-          <w:iCs/>
-          <w:i/>
-        </w:rPr>
-        <w:t xml:space="preserve">P</w:t>
-      </w:r>
-      <w:r>
-        <w:t xml:space="preserve"> </w:t>
-      </w:r>
-      <w:r>
-        <w:t xml:space="preserve">&lt; 0.05 in BBJ (OR 1.56, 95% CI 1.07–2.28;</w:t>
-      </w:r>
-      <w:r>
-        <w:t xml:space="preserve"> </w:t>
-      </w:r>
-      <w:r>
-        <w:rPr>
-          <w:iCs/>
-          <w:i/>
-        </w:rPr>
-        <w:t xml:space="preserve">P</w:t>
-      </w:r>
-      <w:r>
-        <w:t xml:space="preserve"> </w:t>
-      </w:r>
-      <w:r>
-        <w:t xml:space="preserve">= 0.0212) and UKB (</w:t>
-      </w:r>
-      <w:r>
-        <w:rPr>
-          <w:iCs/>
-          <w:i/>
-        </w:rPr>
-        <w:t xml:space="preserve">P</w:t>
-      </w:r>
-      <w:r>
-        <w:t xml:space="preserve"> </w:t>
-      </w:r>
-      <w:r>
-        <w:t xml:space="preserve">= 0.0117), but were inconclusive in FinnGen (</w:t>
-      </w:r>
-      <w:r>
-        <w:rPr>
-          <w:iCs/>
-          <w:i/>
-        </w:rPr>
-        <w:t xml:space="preserve">P</w:t>
-      </w:r>
-      <w:r>
-        <w:t xml:space="preserve"> </w:t>
-      </w:r>
-      <w:r>
-        <w:t xml:space="preserve">= 0.182). No additional gene had strong shared-variant support in BBJ and FinnGen. Using cohort allele frequencies preserved these findings.</w:t>
+        <w:t xml:space="preserve">transcript levels exceeded the control.</w:t>
       </w:r>
       <w:r>
         <w:t xml:space="preserve"> </w:t>
@@ -379,7 +392,7 @@
         <w:t xml:space="preserve">IGF1R</w:t>
       </w:r>
       <w:r>
-        <w:t xml:space="preserve">. This neither establishes a TED-specific effect within GD nor predicts treatment response.</w:t>
+        <w:t xml:space="preserve">. FinnGen’s population controls mean this neither isolates TED susceptibility within GD nor predicts treatment response.</w:t>
       </w:r>
     </w:p>
     <w:p>

</xml_diff>

<commit_message>
Say "disease outcomes" in the Abstract, as the Methods already does
Bare "Outcomes were ..." reads to a clinician as treatment outcomes, not as
the dependent variable of the MR. The Methods says "Disease outcomes were";
the Abstract now matches. Paid for by dropping a redundant "shared-variant"
from the prior-sensitivity clause, so the Abstract stays at 250 words.

Co-Authored-By: Claude Opus 5 <noreply@anthropic.com>
Claude-Session: https://claude.ai/code/session_01TiAKffYKtUstdRZFkwtJA9
</commit_message>
<xml_diff>
--- a/submission/candidate_20260911_review/MANUSCRIPT_Submission.docx
+++ b/submission/candidate_20260911_review/MANUSCRIPT_Submission.docx
@@ -180,7 +180,7 @@
         <w:t xml:space="preserve"> </w:t>
       </w:r>
       <w:r>
-        <w:t xml:space="preserve">We screened 2,544 druggable genes using Wald-ratio or inverse-variance-weighted Mendelian randomization and colocalization for shared expression–disease variants. Outcomes were Biobank Japan (BBJ) GD, UK Biobank (UKB) hyperthyroidism and FinnGen Graves ophthalmopathy. In-house orbital RNA sequencing (four TED patients, one control) was described without significance testing.</w:t>
+        <w:t xml:space="preserve">We screened 2,544 druggable genes using Wald-ratio or inverse-variance-weighted Mendelian randomization and colocalization for shared expression–disease variants. Disease outcomes were Biobank Japan (BBJ) GD, UK Biobank (UKB) hyperthyroidism and FinnGen Graves ophthalmopathy. In-house orbital RNA sequencing (four TED patients, one control) was described without significance testing.</w:t>
       </w:r>
       <w:r>
         <w:t xml:space="preserve"> </w:t>
@@ -241,7 +241,7 @@
         <w:t xml:space="preserve"> </w:t>
       </w:r>
       <w:r>
-        <w:t xml:space="preserve">= 1.09×10⁻¹⁴), with matching directions in UKB and FinnGen. Shared-variant posterior probability exceeded 0.80 in BBJ and FinnGen but not UKB; BBJ support fell below 0.80 when the shared-variant prior was lowered from 10⁻⁵ to 10⁻⁶.</w:t>
+        <w:t xml:space="preserve">= 1.09×10⁻¹⁴), with matching directions in UKB and FinnGen. Shared-variant posterior probability exceeded 0.80 in BBJ and FinnGen but not UKB; BBJ support fell below 0.80 when the prior was lowered from 10⁻⁵ to 10⁻⁶.</w:t>
       </w:r>
       <w:r>
         <w:t xml:space="preserve"> </w:t>

</xml_diff>